<commit_message>
Added Andrea Ayala Dissertation and updated thesis proposal doc
</commit_message>
<xml_diff>
--- a/Documents /MS Thesis Proposal.docx
+++ b/Documents /MS Thesis Proposal.docx
@@ -1,6 +1,6 @@
 
 <file path=word/document.xml><?xml version="1.0" encoding="utf-8"?>
-<w:document xmlns:wpc="http://schemas.microsoft.com/office/word/2010/wordprocessingCanvas" xmlns:cx="http://schemas.microsoft.com/office/drawing/2014/chartex" xmlns:cx1="http://schemas.microsoft.com/office/drawing/2015/9/8/chartex" xmlns:cx2="http://schemas.microsoft.com/office/drawing/2015/10/21/chartex" xmlns:cx3="http://schemas.microsoft.com/office/drawing/2016/5/9/chartex" xmlns:cx4="http://schemas.microsoft.com/office/drawing/2016/5/10/chartex" xmlns:cx5="http://schemas.microsoft.com/office/drawing/2016/5/11/chartex" xmlns:cx6="http://schemas.microsoft.com/office/drawing/2016/5/12/chartex" xmlns:cx7="http://schemas.microsoft.com/office/drawing/2016/5/13/chartex" xmlns:cx8="http://schemas.microsoft.com/office/drawing/2016/5/14/chartex" xmlns:mc="http://schemas.openxmlformats.org/markup-compatibility/2006" xmlns:m="http://schemas.openxmlformats.org/officeDocument/2006/math" xmlns:aink="http://schemas.microsoft.com/office/drawing/2016/ink" xmlns:am3d="http://schemas.microsoft.com/office/drawing/2017/model3d" xmlns:oel="http://schemas.microsoft.com/office/2019/extlst" xmlns:r="http://schemas.openxmlformats.org/officeDocument/2006/relationships" xmlns:wp14="http://schemas.microsoft.com/office/word/2010/wordprocessingDrawing" xmlns:wp="http://schemas.openxmlformats.org/drawingml/2006/wordprocessingDrawing" xmlns:wpg="http://schemas.microsoft.com/office/word/2010/wordprocessingGroup" xmlns:wpi="http://schemas.microsoft.com/office/word/2010/wordprocessingInk" xmlns:wps="http://schemas.microsoft.com/office/word/2010/wordprocessingShape" xmlns:o="urn:schemas-microsoft-com:office:office" xmlns:v="urn:schemas-microsoft-com:vml" xmlns:w10="urn:schemas-microsoft-com:office:word" xmlns:w="http://schemas.openxmlformats.org/wordprocessingml/2006/main" xmlns:w14="http://schemas.microsoft.com/office/word/2010/wordml" xmlns:w15="http://schemas.microsoft.com/office/word/2012/wordml" xmlns:w16cei="http://schemas.microsoft.com/office/word/2026/wordml/cei" xmlns:w16cex="http://schemas.microsoft.com/office/word/2018/wordml/cex" xmlns:w16cid="http://schemas.microsoft.com/office/word/2016/wordml/cid" xmlns:w16="http://schemas.microsoft.com/office/word/2018/wordml" xmlns:w16sdtdh="http://schemas.microsoft.com/office/word/2020/wordml/sdtdatahash" xmlns:w16sdtfl="http://schemas.microsoft.com/office/word/2024/wordml/sdtformatlock" xmlns:w16se="http://schemas.microsoft.com/office/word/2015/wordml/symex" xmlns:w16du="http://schemas.microsoft.com/office/word/2023/wordml/word16du" xmlns:wne="http://schemas.microsoft.com/office/word/2006/wordml" mc:Ignorable="w14 w15 w16se w16cid w16 w16cex w16sdtdh w16sdtfl w16du wp14">
+<w:document xmlns:wpc="http://schemas.microsoft.com/office/word/2010/wordprocessingCanvas" xmlns:cx="http://schemas.microsoft.com/office/drawing/2014/chartex" xmlns:cx1="http://schemas.microsoft.com/office/drawing/2015/9/8/chartex" xmlns:cx2="http://schemas.microsoft.com/office/drawing/2015/10/21/chartex" xmlns:cx3="http://schemas.microsoft.com/office/drawing/2016/5/9/chartex" xmlns:cx4="http://schemas.microsoft.com/office/drawing/2016/5/10/chartex" xmlns:cx5="http://schemas.microsoft.com/office/drawing/2016/5/11/chartex" xmlns:cx6="http://schemas.microsoft.com/office/drawing/2016/5/12/chartex" xmlns:cx7="http://schemas.microsoft.com/office/drawing/2016/5/13/chartex" xmlns:cx8="http://schemas.microsoft.com/office/drawing/2016/5/14/chartex" xmlns:mc="http://schemas.openxmlformats.org/markup-compatibility/2006" xmlns:m="http://schemas.openxmlformats.org/officeDocument/2006/math" xmlns:aink="http://schemas.microsoft.com/office/drawing/2016/ink" xmlns:am3d="http://schemas.microsoft.com/office/drawing/2017/model3d" xmlns:oel="http://schemas.microsoft.com/office/2019/extlst" xmlns:r="http://schemas.openxmlformats.org/officeDocument/2006/relationships" xmlns:wp14="http://schemas.microsoft.com/office/word/2010/wordprocessingDrawing" xmlns:wp="http://schemas.openxmlformats.org/drawingml/2006/wordprocessingDrawing" xmlns:wpg="http://schemas.microsoft.com/office/word/2010/wordprocessingGroup" xmlns:wpi="http://schemas.microsoft.com/office/word/2010/wordprocessingInk" xmlns:wps="http://schemas.microsoft.com/office/word/2010/wordprocessingShape" xmlns:o="urn:schemas-microsoft-com:office:office" xmlns:v="urn:schemas-microsoft-com:vml" xmlns:w10="urn:schemas-microsoft-com:office:word" xmlns:w="http://schemas.openxmlformats.org/wordprocessingml/2006/main" xmlns:w14="http://schemas.microsoft.com/office/word/2010/wordml" xmlns:w15="http://schemas.microsoft.com/office/word/2012/wordml" xmlns:w16cex="http://schemas.microsoft.com/office/word/2018/wordml/cex" xmlns:w16cid="http://schemas.microsoft.com/office/word/2016/wordml/cid" xmlns:w16="http://schemas.microsoft.com/office/word/2018/wordml" xmlns:w16sdtdh="http://schemas.microsoft.com/office/word/2020/wordml/sdtdatahash" xmlns:w16sdtfl="http://schemas.microsoft.com/office/word/2024/wordml/sdtformatlock" xmlns:w16se="http://schemas.microsoft.com/office/word/2015/wordml/symex" xmlns:w16du="http://schemas.microsoft.com/office/word/2023/wordml/word16du" xmlns:wne="http://schemas.microsoft.com/office/word/2006/wordml" mc:Ignorable="w14 w15 w16se w16cid w16 w16cex w16sdtdh w16sdtfl w16du wp14">
   <w:body>
     <w:p>
       <w:pPr>
@@ -318,7 +318,13 @@
         <w:t>"Small-scale" or "backyard" poultry keeping refers to the practice of homeowners maintaining small flocks of chickens on or around their property for purposes such as egg and meat production, animal husbandry, or participation in sustainable food systems</w:t>
       </w:r>
       <w:r>
-        <w:t xml:space="preserve"> (CITE)</w:t>
+        <w:t xml:space="preserve"> (</w:t>
+      </w:r>
+      <w:r>
+        <w:rPr>
+          <w:highlight w:val="yellow"/>
+        </w:rPr>
+        <w:t>CITE)</w:t>
       </w:r>
       <w:r>
         <w:t>.</w:t>
@@ -331,6 +337,11 @@
       </w:r>
     </w:p>
     <w:p>
+      <w:pPr>
+        <w:rPr>
+          <w:u w:val="single"/>
+        </w:rPr>
+      </w:pPr>
       <w:r>
         <w:t>Th</w:t>
       </w:r>
@@ -444,12 +455,26 @@
         </w:rPr>
         <w:t xml:space="preserve"> so the mention of Salmonella and e coli below doesn’t come out of nowhere.</w:t>
       </w:r>
-    </w:p>
-    <w:p>
-      <w:r>
-        <w:t>Bird feeders aggregate wild birds at irregular densities, increasing both direct contact rates between individuals and fecal-oral transmission of bacterial pathogens among individuals and species (Becker and Hall 2014; Becker et al. 2015)</w:t>
-      </w:r>
-      <w:r>
+      <w:r>
+        <w:t xml:space="preserve"> </w:t>
+      </w:r>
+      <w:commentRangeStart w:id="12"/>
+      <w:r>
+        <w:rPr>
+          <w:u w:val="single"/>
+        </w:rPr>
+        <w:t xml:space="preserve">prior work at this interface in the Southeast has characterized viral spillover and species-level contact rates (Ayala et al. 2020), but bacterial enteric pathogens, individual-level visitation, and the isolated versus combined effects of feeders and poultry remain </w:t>
+      </w:r>
+      <w:r>
+        <w:rPr>
+          <w:u w:val="single"/>
+        </w:rPr>
+        <w:t>unquantified</w:t>
+      </w:r>
+      <w:r>
+        <w:rPr>
+          <w:u w:val="single"/>
+        </w:rPr>
         <w:t>.</w:t>
       </w:r>
       <w:r>
@@ -457,60 +482,9 @@
       </w:r>
       <w:r>
         <w:rPr>
-          <w:highlight w:val="yellow"/>
-        </w:rPr>
-        <w:t>Maybe an example here of a study that found higher bird densities at feeders and higher prevalence of disease?</w:t>
-      </w:r>
-      <w:r>
-        <w:rPr>
-          <w:highlight w:val="yellow"/>
-        </w:rPr>
-        <w:t xml:space="preserve"> And content about contact frequency that you have below in the last paragraph can go here as well.</w:t>
-      </w:r>
-    </w:p>
-    <w:p>
-      <w:commentRangeStart w:id="12"/>
-      <w:r>
-        <w:t xml:space="preserve">Backyard poultry can further compound this risk, as chickens </w:t>
-      </w:r>
-      <w:r>
-        <w:t>are known</w:t>
-      </w:r>
-      <w:r>
-        <w:t xml:space="preserve"> reservoirs for </w:t>
-      </w:r>
-      <w:r>
-        <w:rPr>
-          <w:i/>
-          <w:iCs/>
-        </w:rPr>
-        <w:t>S. enterica</w:t>
-      </w:r>
-      <w:r>
-        <w:t xml:space="preserve"> and </w:t>
-      </w:r>
-      <w:r>
-        <w:rPr>
-          <w:i/>
-          <w:iCs/>
-        </w:rPr>
-        <w:t xml:space="preserve">E. </w:t>
-      </w:r>
-      <w:r>
-        <w:rPr>
-          <w:i/>
-          <w:iCs/>
-        </w:rPr>
-        <w:t>coli</w:t>
-      </w:r>
-      <w:r>
-        <w:t xml:space="preserve"> and</w:t>
-      </w:r>
-      <w:r>
-        <w:t xml:space="preserve"> can</w:t>
-      </w:r>
-      <w:r>
-        <w:t xml:space="preserve"> amplify pathogen persistence in the environment </w:t>
+          <w:u w:val="single"/>
+        </w:rPr>
+        <w:t>Residential yards are increasingly recognized as a distinct human-wildlife interface where companion animals, backyard livestock, peri-domestic wildlife, and people share space and anthropogenic resources, creating pathways for zoonotic spillover that differ from those in either purely wild or agricultural settings (Gamble et al. 2023). This aligns with broader evidence that urbanization and the intensification of contact among humans, domestic animals, and wildlife are principal drivers of pathogen emergence at shared interfaces (Hassell et al. 2017).</w:t>
       </w:r>
       <w:commentRangeEnd w:id="12"/>
       <w:r>
@@ -518,9 +492,88 @@
           <w:rStyle w:val="CommentReference"/>
           <w:sz w:val="24"/>
           <w:szCs w:val="24"/>
+          <w:u w:val="single"/>
         </w:rPr>
         <w:commentReference w:id="12"/>
       </w:r>
+    </w:p>
+    <w:p>
+      <w:r>
+        <w:t>Bird feeders aggregate wild birds at irregular densities, increasing both direct contact rates between individuals and fecal-oral transmission of bacterial pathogens among individuals and species (Becker and Hall 2014; Becker et al. 2015)</w:t>
+      </w:r>
+      <w:r>
+        <w:t>.</w:t>
+      </w:r>
+      <w:r>
+        <w:t xml:space="preserve"> </w:t>
+      </w:r>
+      <w:r>
+        <w:rPr>
+          <w:highlight w:val="yellow"/>
+        </w:rPr>
+        <w:t>Maybe an example here of a study that found higher bird densities at feeders and higher prevalence of disease?</w:t>
+      </w:r>
+      <w:r>
+        <w:rPr>
+          <w:highlight w:val="yellow"/>
+        </w:rPr>
+        <w:t xml:space="preserve"> And content about contact frequency that you have below in the last paragraph can go here as well.</w:t>
+      </w:r>
+    </w:p>
+    <w:p>
+      <w:commentRangeStart w:id="13"/>
+      <w:r>
+        <w:lastRenderedPageBreak/>
+        <w:t xml:space="preserve">Backyard poultry can further compound this risk, as chickens </w:t>
+      </w:r>
+      <w:r>
+        <w:t>are known</w:t>
+      </w:r>
+      <w:r>
+        <w:t xml:space="preserve"> reservoirs for </w:t>
+      </w:r>
+      <w:r>
+        <w:rPr>
+          <w:i/>
+          <w:iCs/>
+        </w:rPr>
+        <w:t>S. enterica</w:t>
+      </w:r>
+      <w:r>
+        <w:t xml:space="preserve"> and </w:t>
+      </w:r>
+      <w:r>
+        <w:rPr>
+          <w:i/>
+          <w:iCs/>
+        </w:rPr>
+        <w:t xml:space="preserve">E. </w:t>
+      </w:r>
+      <w:r>
+        <w:rPr>
+          <w:i/>
+          <w:iCs/>
+        </w:rPr>
+        <w:t>coli</w:t>
+      </w:r>
+      <w:r>
+        <w:t xml:space="preserve"> and</w:t>
+      </w:r>
+      <w:r>
+        <w:t xml:space="preserve"> can</w:t>
+      </w:r>
+      <w:r>
+        <w:t xml:space="preserve"> amplify pathogen persistence in the environment </w:t>
+      </w:r>
+      <w:commentRangeEnd w:id="13"/>
+      <w:r>
+        <w:rPr>
+          <w:rStyle w:val="CommentReference"/>
+          <w:sz w:val="24"/>
+          <w:szCs w:val="24"/>
+        </w:rPr>
+        <w:commentReference w:id="13"/>
+      </w:r>
       <w:r>
         <w:t xml:space="preserve">and </w:t>
       </w:r>
@@ -540,11 +593,7 @@
         <w:t>, as well as backyard poultry (CDC, 2025)</w:t>
       </w:r>
       <w:r>
-        <w:t xml:space="preserve">. The combined proximity of human dwellings, bird feeders, and chicken housing may render these interacting </w:t>
-      </w:r>
-      <w:r>
-        <w:lastRenderedPageBreak/>
-        <w:t>factors a concern for public and wildlife health.</w:t>
+        <w:t>. The combined proximity of human dwellings, bird feeders, and chicken housing may render these interacting factors a concern for public and wildlife health.</w:t>
       </w:r>
       <w:r>
         <w:t xml:space="preserve"> </w:t>
@@ -926,12 +975,12 @@
       <w:r>
         <w:t xml:space="preserve"> outbreaks have increased in frequency over recent decades, with backyard poultry and wild birds among the most </w:t>
       </w:r>
-      <w:del w:id="13" w:author="Kelsey McCune" w:date="2026-07-09T08:48:00Z" w16du:dateUtc="2026-07-09T13:48:00Z">
+      <w:del w:id="14" w:author="Kelsey McCune" w:date="2026-07-09T08:48:00Z" w16du:dateUtc="2026-07-09T13:48:00Z">
         <w:r>
           <w:delText xml:space="preserve">affected </w:delText>
         </w:r>
       </w:del>
-      <w:ins w:id="14" w:author="Kelsey McCune" w:date="2026-07-09T08:48:00Z" w16du:dateUtc="2026-07-09T13:48:00Z">
+      <w:ins w:id="15" w:author="Kelsey McCune" w:date="2026-07-09T08:48:00Z" w16du:dateUtc="2026-07-09T13:48:00Z">
         <w:r>
           <w:t xml:space="preserve">frequent </w:t>
         </w:r>
@@ -990,7 +1039,7 @@
       <w:r>
         <w:t xml:space="preserve"> residential settings receive little outreach or oversight, </w:t>
       </w:r>
-      <w:del w:id="15" w:author="Kelsey McCune" w:date="2026-07-09T08:49:00Z" w16du:dateUtc="2026-07-09T13:49:00Z">
+      <w:del w:id="16" w:author="Kelsey McCune" w:date="2026-07-09T08:49:00Z" w16du:dateUtc="2026-07-09T13:49:00Z">
         <w:r>
           <w:delText xml:space="preserve">and </w:delText>
         </w:r>
@@ -1001,7 +1050,7 @@
           <w:delText xml:space="preserve"> suggest that</w:delText>
         </w:r>
       </w:del>
-      <w:ins w:id="16" w:author="Kelsey McCune" w:date="2026-07-09T08:50:00Z" w16du:dateUtc="2026-07-09T13:50:00Z">
+      <w:ins w:id="17" w:author="Kelsey McCune" w:date="2026-07-09T08:50:00Z" w16du:dateUtc="2026-07-09T13:50:00Z">
         <w:r>
           <w:t>even though</w:t>
         </w:r>
@@ -1010,6 +1059,7 @@
         <w:t xml:space="preserve"> targeted education and risk mitigation practices can </w:t>
       </w:r>
       <w:r>
+        <w:lastRenderedPageBreak/>
         <w:t>significantly</w:t>
       </w:r>
       <w:r>
@@ -1052,7 +1102,6 @@
           <w:sz w:val="13"/>
           <w:szCs w:val="13"/>
         </w:rPr>
-        <w:lastRenderedPageBreak/>
         <w:t>Sources:</w:t>
       </w:r>
     </w:p>
@@ -1456,7 +1505,11 @@
         <w:t>satisfaction</w:t>
       </w:r>
       <w:r>
-        <w:t xml:space="preserve"> to encourage broader conservation behaviors. Research has shown that people who feed and observe birds are more likely to engage in pro-conservation actions such as habitat stewardship, conservation donations, and advocacy for wildlife-friendly policies, suggesting that these activities may </w:t>
+        <w:t xml:space="preserve"> to encourage broader conservation behaviors. Research has shown that people who feed and observe birds are more likely to engage in pro-conservation actions such as habitat </w:t>
+      </w:r>
+      <w:r>
+        <w:lastRenderedPageBreak/>
+        <w:t xml:space="preserve">stewardship, conservation donations, and advocacy for wildlife-friendly policies, suggesting that these activities may </w:t>
       </w:r>
       <w:r>
         <w:t>provide a link</w:t>
@@ -1537,11 +1590,7 @@
         <w:t>activities</w:t>
       </w:r>
       <w:r>
-        <w:t xml:space="preserve"> such </w:t>
-      </w:r>
-      <w:r>
-        <w:lastRenderedPageBreak/>
-        <w:t xml:space="preserve">as bird feeding and </w:t>
+        <w:t xml:space="preserve"> such as bird feeding and </w:t>
       </w:r>
       <w:r>
         <w:t>small-scale</w:t>
@@ -1549,7 +1598,7 @@
       <w:r>
         <w:t xml:space="preserve"> poultry</w:t>
       </w:r>
-      <w:ins w:id="17" w:author="Kelsey McCune" w:date="2026-07-09T08:53:00Z" w16du:dateUtc="2026-07-09T13:53:00Z">
+      <w:ins w:id="18" w:author="Kelsey McCune" w:date="2026-07-09T08:53:00Z" w16du:dateUtc="2026-07-09T13:53:00Z">
         <w:r>
           <w:t xml:space="preserve"> keeping</w:t>
         </w:r>
@@ -1775,34 +1824,28 @@
       </w:r>
     </w:p>
     <w:p>
-      <w:pPr>
-        <w:rPr>
-          <w:sz w:val="13"/>
-          <w:szCs w:val="13"/>
-        </w:rPr>
-      </w:pPr>
-      <w:commentRangeStart w:id="18"/>
       <w:commentRangeStart w:id="19"/>
+      <w:commentRangeStart w:id="20"/>
       <w:r>
         <w:t xml:space="preserve">Most existing research </w:t>
       </w:r>
-      <w:commentRangeEnd w:id="18"/>
+      <w:commentRangeEnd w:id="19"/>
       <w:r>
         <w:rPr>
           <w:rStyle w:val="CommentReference"/>
           <w:sz w:val="24"/>
           <w:szCs w:val="24"/>
         </w:rPr>
-        <w:commentReference w:id="18"/>
-      </w:r>
-      <w:commentRangeEnd w:id="19"/>
+        <w:commentReference w:id="19"/>
+      </w:r>
+      <w:commentRangeEnd w:id="20"/>
       <w:r>
         <w:rPr>
           <w:rStyle w:val="CommentReference"/>
           <w:sz w:val="24"/>
           <w:szCs w:val="24"/>
         </w:rPr>
-        <w:commentReference w:id="19"/>
+        <w:commentReference w:id="20"/>
       </w:r>
       <w:r>
         <w:t>on backyard wildlife activities and disease risk</w:t>
@@ -1840,7 +1883,7 @@
       <w:r>
         <w:t xml:space="preserve"> that visit food sources more frequently may experience greater exposure to environmental pathogens. </w:t>
       </w:r>
-      <w:commentRangeStart w:id="20"/>
+      <w:commentRangeStart w:id="21"/>
       <w:r>
         <w:t xml:space="preserve">This gap </w:t>
       </w:r>
@@ -1850,7 +1893,7 @@
       <w:r>
         <w:t>relevant in the southeastern United States, where suburban sprawl continues to expand the human-wildlife interface, seasonal variation in temperature and humidity creates year-round conditions for environmental pathogen persistence</w:t>
       </w:r>
-      <w:ins w:id="21" w:author="Kelsey McCune" w:date="2026-07-09T08:56:00Z" w16du:dateUtc="2026-07-09T13:56:00Z">
+      <w:ins w:id="22" w:author="Kelsey McCune" w:date="2026-07-09T08:56:00Z" w16du:dateUtc="2026-07-09T13:56:00Z">
         <w:r>
           <w:t xml:space="preserve"> (CITE)</w:t>
         </w:r>
@@ -1876,12 +1919,12 @@
       <w:r>
         <w:t xml:space="preserve"> small-scale animal keeping</w:t>
       </w:r>
-      <w:ins w:id="22" w:author="Kelsey McCune" w:date="2026-07-09T08:57:00Z" w16du:dateUtc="2026-07-09T13:57:00Z">
+      <w:ins w:id="23" w:author="Kelsey McCune" w:date="2026-07-09T08:57:00Z" w16du:dateUtc="2026-07-09T13:57:00Z">
         <w:r>
           <w:t>.</w:t>
         </w:r>
       </w:ins>
-      <w:del w:id="23" w:author="Kelsey McCune" w:date="2026-07-09T08:57:00Z" w16du:dateUtc="2026-07-09T13:57:00Z">
+      <w:del w:id="24" w:author="Kelsey McCune" w:date="2026-07-09T08:57:00Z" w16du:dateUtc="2026-07-09T13:57:00Z">
         <w:r>
           <w:delText>,</w:delText>
         </w:r>
@@ -1889,12 +1932,12 @@
       <w:r>
         <w:t xml:space="preserve"> </w:t>
       </w:r>
-      <w:ins w:id="24" w:author="Kelsey McCune" w:date="2026-07-09T08:57:00Z" w16du:dateUtc="2026-07-09T13:57:00Z">
+      <w:ins w:id="25" w:author="Kelsey McCune" w:date="2026-07-09T08:57:00Z" w16du:dateUtc="2026-07-09T13:57:00Z">
         <w:r>
           <w:t>Moreover,</w:t>
         </w:r>
       </w:ins>
-      <w:del w:id="25" w:author="Kelsey McCune" w:date="2026-07-09T08:57:00Z" w16du:dateUtc="2026-07-09T13:57:00Z">
+      <w:del w:id="26" w:author="Kelsey McCune" w:date="2026-07-09T08:57:00Z" w16du:dateUtc="2026-07-09T13:57:00Z">
         <w:r>
           <w:delText>and</w:delText>
         </w:r>
@@ -1908,14 +1951,14 @@
       <w:r>
         <w:t xml:space="preserve"> including bird</w:t>
       </w:r>
-      <w:commentRangeEnd w:id="20"/>
+      <w:commentRangeEnd w:id="21"/>
       <w:r>
         <w:rPr>
           <w:rStyle w:val="CommentReference"/>
           <w:sz w:val="24"/>
           <w:szCs w:val="24"/>
         </w:rPr>
-        <w:commentReference w:id="20"/>
+        <w:commentReference w:id="21"/>
       </w:r>
       <w:r>
         <w:t xml:space="preserve"> feeding</w:t>
@@ -1926,12 +1969,12 @@
       <w:r>
         <w:t>is among the highest of any region in the country</w:t>
       </w:r>
-      <w:ins w:id="26" w:author="Kelsey McCune" w:date="2026-07-09T08:57:00Z" w16du:dateUtc="2026-07-09T13:57:00Z">
+      <w:ins w:id="27" w:author="Kelsey McCune" w:date="2026-07-09T08:57:00Z" w16du:dateUtc="2026-07-09T13:57:00Z">
         <w:r>
           <w:t>;</w:t>
         </w:r>
       </w:ins>
-      <w:del w:id="27" w:author="Kelsey McCune" w:date="2026-07-09T08:57:00Z" w16du:dateUtc="2026-07-09T13:57:00Z">
+      <w:del w:id="28" w:author="Kelsey McCune" w:date="2026-07-09T08:57:00Z" w16du:dateUtc="2026-07-09T13:57:00Z">
         <w:r>
           <w:delText>,</w:delText>
         </w:r>
@@ -1939,7 +1982,7 @@
       <w:r>
         <w:t xml:space="preserve"> </w:t>
       </w:r>
-      <w:del w:id="28" w:author="Kelsey McCune" w:date="2026-07-09T08:56:00Z" w16du:dateUtc="2026-07-09T13:56:00Z">
+      <w:del w:id="29" w:author="Kelsey McCune" w:date="2026-07-09T08:56:00Z" w16du:dateUtc="2026-07-09T13:56:00Z">
         <w:r>
           <w:delText xml:space="preserve">with </w:delText>
         </w:r>
@@ -1947,12 +1990,12 @@
       <w:r>
         <w:t xml:space="preserve">the East South Central states </w:t>
       </w:r>
-      <w:del w:id="29" w:author="Kelsey McCune" w:date="2026-07-09T08:57:00Z" w16du:dateUtc="2026-07-09T13:57:00Z">
+      <w:del w:id="30" w:author="Kelsey McCune" w:date="2026-07-09T08:57:00Z" w16du:dateUtc="2026-07-09T13:57:00Z">
         <w:r>
           <w:delText xml:space="preserve">reporting </w:delText>
         </w:r>
       </w:del>
-      <w:ins w:id="30" w:author="Kelsey McCune" w:date="2026-07-09T08:57:00Z" w16du:dateUtc="2026-07-09T13:57:00Z">
+      <w:ins w:id="31" w:author="Kelsey McCune" w:date="2026-07-09T08:57:00Z" w16du:dateUtc="2026-07-09T13:57:00Z">
         <w:r>
           <w:t>have</w:t>
         </w:r>
@@ -1976,7 +2019,11 @@
         <w:t xml:space="preserve"> </w:t>
       </w:r>
       <w:r>
-        <w:t>The degree to which participants in these activities perceive disease risks, engage in biosecurity practices such as feeder cleaning and personal hygiene, and are willing to modify their behaviors in response to evidence-based recommendations remains poorly characterized, particularly in the southeastern United States where both activities are prevalent.</w:t>
+        <w:t xml:space="preserve">The degree to which participants in these activities perceive disease risks, engage in biosecurity practices such as feeder cleaning and personal hygiene, and are willing to modify their behaviors in response to evidence-based recommendations remains poorly </w:t>
+      </w:r>
+      <w:r>
+        <w:lastRenderedPageBreak/>
+        <w:t>characterized, particularly in the southeastern United States where both activities are prevalent.</w:t>
       </w:r>
       <w:r>
         <w:t xml:space="preserve"> Closing these </w:t>
@@ -1993,63 +2040,118 @@
       <w:r>
         <w:t xml:space="preserve"> for developing evidence-based guidelines that allow people to enjoy the benefits of backyard activities while reducing risk to wild birds, domestic animals, and </w:t>
       </w:r>
-      <w:commentRangeStart w:id="31"/>
       <w:commentRangeStart w:id="32"/>
       <w:commentRangeStart w:id="33"/>
+      <w:commentRangeStart w:id="34"/>
       <w:r>
         <w:t>human health.</w:t>
       </w:r>
-      <w:commentRangeEnd w:id="31"/>
+      <w:commentRangeEnd w:id="32"/>
       <w:r>
         <w:rPr>
           <w:rStyle w:val="CommentReference"/>
           <w:sz w:val="24"/>
           <w:szCs w:val="24"/>
         </w:rPr>
-        <w:commentReference w:id="31"/>
-      </w:r>
-      <w:commentRangeEnd w:id="32"/>
+        <w:commentReference w:id="32"/>
+      </w:r>
+      <w:commentRangeEnd w:id="33"/>
       <w:r>
         <w:rPr>
           <w:rStyle w:val="CommentReference"/>
           <w:sz w:val="24"/>
           <w:szCs w:val="24"/>
         </w:rPr>
-        <w:commentReference w:id="32"/>
-      </w:r>
-      <w:commentRangeEnd w:id="33"/>
+        <w:commentReference w:id="33"/>
+      </w:r>
+      <w:commentRangeEnd w:id="34"/>
       <w:r>
         <w:rPr>
           <w:rStyle w:val="CommentReference"/>
           <w:sz w:val="24"/>
           <w:szCs w:val="24"/>
         </w:rPr>
-        <w:commentReference w:id="33"/>
-      </w:r>
-      <w:r>
-        <w:br/>
-      </w:r>
-      <w:r>
-        <w:br/>
-      </w:r>
-      <w:r>
-        <w:rPr>
-          <w:sz w:val="13"/>
-          <w:szCs w:val="13"/>
-        </w:rPr>
-        <w:t>Sources:</w:t>
-      </w:r>
-      <w:r>
-        <w:rPr>
-          <w:sz w:val="13"/>
-          <w:szCs w:val="13"/>
-        </w:rPr>
-        <w:br/>
+        <w:commentReference w:id="34"/>
+      </w:r>
+    </w:p>
+    <w:p>
+      <w:pPr>
+        <w:rPr>
+          <w:sz w:val="13"/>
+          <w:szCs w:val="13"/>
+        </w:rPr>
+      </w:pPr>
+      <w:commentRangeStart w:id="35"/>
+      <w:r>
+        <w:rPr>
+          <w:u w:val="single"/>
+        </w:rPr>
+        <w:t xml:space="preserve">Warming temperatures are of particular relevance to </w:t>
       </w:r>
       <w:r>
         <w:rPr>
           <w:i/>
           <w:iCs/>
+          <w:u w:val="single"/>
+        </w:rPr>
+        <w:t>Salmonella</w:t>
+      </w:r>
+      <w:r>
+        <w:rPr>
+          <w:u w:val="single"/>
+        </w:rPr>
+        <w:t xml:space="preserve">, which proliferates more readily in warmer ambient conditions; systematic review has linked rising air temperature to increased </w:t>
+      </w:r>
+      <w:r>
+        <w:rPr>
+          <w:i/>
+          <w:iCs/>
+          <w:u w:val="single"/>
+        </w:rPr>
+        <w:t>Salmonella</w:t>
+      </w:r>
+      <w:r>
+        <w:rPr>
+          <w:u w:val="single"/>
+        </w:rPr>
+        <w:t xml:space="preserve"> incidence, with infection risk rising measurably per degree Celsius of warming (Welch et al. 2019). The southeastern United States is projected to warm substantially over the coming decades, and continental risk assessments anticipate that these warmer, drier future conditions will expand the suitability of the region for climate-sensitive pathogens and vector-borne diseases such as West Nile virus (Harrigan et al. 2014). Together, these projections suggest that the environmental conditions favoring pathogen persistence and transmission at the backyard interface are likely to intensify in this region, heightening the long-term relevance of characterizing spillover risk now.</w:t>
+      </w:r>
+      <w:r>
+        <w:rPr>
+          <w:u w:val="single"/>
+        </w:rPr>
+        <w:br/>
+      </w:r>
+      <w:commentRangeEnd w:id="35"/>
+      <w:r>
+        <w:rPr>
+          <w:rStyle w:val="CommentReference"/>
+          <w:sz w:val="24"/>
+          <w:szCs w:val="24"/>
+        </w:rPr>
+        <w:commentReference w:id="35"/>
+      </w:r>
+      <w:r>
+        <w:br/>
+      </w:r>
+      <w:r>
+        <w:rPr>
+          <w:sz w:val="13"/>
+          <w:szCs w:val="13"/>
+        </w:rPr>
+        <w:t>Sources:</w:t>
+      </w:r>
+      <w:r>
+        <w:rPr>
+          <w:sz w:val="13"/>
+          <w:szCs w:val="13"/>
+        </w:rPr>
+        <w:br/>
+      </w:r>
+      <w:r>
+        <w:rPr>
+          <w:i/>
+          <w:iCs/>
           <w:sz w:val="13"/>
           <w:szCs w:val="13"/>
         </w:rPr>
@@ -2103,7 +2205,7 @@
           <w:bCs/>
         </w:rPr>
       </w:pPr>
-      <w:commentRangeStart w:id="34"/>
+      <w:commentRangeStart w:id="36"/>
       <w:r>
         <w:rPr>
           <w:b/>
@@ -2112,7 +2214,7 @@
         <w:lastRenderedPageBreak/>
         <w:t>Overarching Goals and Hypotheses</w:t>
       </w:r>
-      <w:commentRangeEnd w:id="34"/>
+      <w:commentRangeEnd w:id="36"/>
       <w:r>
         <w:rPr>
           <w:rStyle w:val="CommentReference"/>
@@ -2121,7 +2223,7 @@
           <w:sz w:val="24"/>
           <w:szCs w:val="24"/>
         </w:rPr>
-        <w:commentReference w:id="34"/>
+        <w:commentReference w:id="36"/>
       </w:r>
       <w:r>
         <w:rPr>
@@ -2135,12 +2237,12 @@
       <w:r>
         <w:t xml:space="preserve">The overarching goal of this </w:t>
       </w:r>
-      <w:del w:id="35" w:author="Kelsey McCune" w:date="2026-07-09T08:58:00Z" w16du:dateUtc="2026-07-09T13:58:00Z">
+      <w:del w:id="37" w:author="Kelsey McCune" w:date="2026-07-09T08:58:00Z" w16du:dateUtc="2026-07-09T13:58:00Z">
         <w:r>
           <w:delText xml:space="preserve">study </w:delText>
         </w:r>
       </w:del>
-      <w:ins w:id="36" w:author="Kelsey McCune" w:date="2026-07-09T08:58:00Z" w16du:dateUtc="2026-07-09T13:58:00Z">
+      <w:ins w:id="38" w:author="Kelsey McCune" w:date="2026-07-09T08:58:00Z" w16du:dateUtc="2026-07-09T13:58:00Z">
         <w:r>
           <w:t>research</w:t>
         </w:r>
@@ -2184,7 +2286,7 @@
       <w:r>
         <w:t xml:space="preserve"> participant behavior remain poorly understood. </w:t>
       </w:r>
-      <w:del w:id="37" w:author="Kelsey McCune" w:date="2026-07-09T09:00:00Z" w16du:dateUtc="2026-07-09T14:00:00Z">
+      <w:del w:id="39" w:author="Kelsey McCune" w:date="2026-07-09T09:00:00Z" w16du:dateUtc="2026-07-09T14:00:00Z">
         <w:r>
           <w:delText>T</w:delText>
         </w:r>
@@ -2195,7 +2297,7 @@
           <w:delText xml:space="preserve"> overarching goal of this study is to</w:delText>
         </w:r>
       </w:del>
-      <w:ins w:id="38" w:author="Kelsey McCune" w:date="2026-07-09T09:00:00Z" w16du:dateUtc="2026-07-09T14:00:00Z">
+      <w:ins w:id="40" w:author="Kelsey McCune" w:date="2026-07-09T09:00:00Z" w16du:dateUtc="2026-07-09T14:00:00Z">
         <w:r>
           <w:t>In my master’s research I will address this gap by</w:t>
         </w:r>
@@ -2203,7 +2305,7 @@
       <w:r>
         <w:t xml:space="preserve"> quantify</w:t>
       </w:r>
-      <w:ins w:id="39" w:author="Kelsey McCune" w:date="2026-07-09T09:00:00Z" w16du:dateUtc="2026-07-09T14:00:00Z">
+      <w:ins w:id="41" w:author="Kelsey McCune" w:date="2026-07-09T09:00:00Z" w16du:dateUtc="2026-07-09T14:00:00Z">
         <w:r>
           <w:t>ing</w:t>
         </w:r>
@@ -2211,7 +2313,7 @@
       <w:r>
         <w:t xml:space="preserve"> the conditions pertaining to </w:t>
       </w:r>
-      <w:ins w:id="40" w:author="Kelsey McCune" w:date="2026-07-09T09:00:00Z" w16du:dateUtc="2026-07-09T14:00:00Z">
+      <w:ins w:id="42" w:author="Kelsey McCune" w:date="2026-07-09T09:00:00Z" w16du:dateUtc="2026-07-09T14:00:00Z">
         <w:r>
           <w:t xml:space="preserve">these </w:t>
         </w:r>
@@ -2228,7 +2330,7 @@
       <w:r>
         <w:t>, to</w:t>
       </w:r>
-      <w:ins w:id="41" w:author="Kelsey McCune" w:date="2026-07-09T09:00:00Z" w16du:dateUtc="2026-07-09T14:00:00Z">
+      <w:ins w:id="43" w:author="Kelsey McCune" w:date="2026-07-09T09:00:00Z" w16du:dateUtc="2026-07-09T14:00:00Z">
         <w:r>
           <w:t xml:space="preserve"> ultimately</w:t>
         </w:r>
@@ -2241,27 +2343,27 @@
       <w:r>
         <w:t xml:space="preserve"> </w:t>
       </w:r>
-      <w:ins w:id="42" w:author="Kelsey McCune" w:date="2026-07-09T09:02:00Z" w16du:dateUtc="2026-07-09T14:02:00Z">
+      <w:ins w:id="44" w:author="Kelsey McCune" w:date="2026-07-09T09:02:00Z" w16du:dateUtc="2026-07-09T14:02:00Z">
         <w:r>
           <w:t xml:space="preserve">To accomplish this overarching goal, my master’s </w:t>
-        </w:r>
-      </w:ins>
-      <w:ins w:id="43" w:author="Kelsey McCune" w:date="2026-07-09T09:03:00Z" w16du:dateUtc="2026-07-09T14:03:00Z">
-        <w:r>
-          <w:t>thesis</w:t>
-        </w:r>
-      </w:ins>
-      <w:ins w:id="44" w:author="Kelsey McCune" w:date="2026-07-09T09:02:00Z" w16du:dateUtc="2026-07-09T14:02:00Z">
-        <w:r>
-          <w:t xml:space="preserve"> will consist of three </w:t>
         </w:r>
       </w:ins>
       <w:ins w:id="45" w:author="Kelsey McCune" w:date="2026-07-09T09:03:00Z" w16du:dateUtc="2026-07-09T14:03:00Z">
         <w:r>
+          <w:t>thesis</w:t>
+        </w:r>
+      </w:ins>
+      <w:ins w:id="46" w:author="Kelsey McCune" w:date="2026-07-09T09:02:00Z" w16du:dateUtc="2026-07-09T14:02:00Z">
+        <w:r>
+          <w:t xml:space="preserve"> will consist of three </w:t>
+        </w:r>
+      </w:ins>
+      <w:ins w:id="47" w:author="Kelsey McCune" w:date="2026-07-09T09:03:00Z" w16du:dateUtc="2026-07-09T14:03:00Z">
+        <w:r>
           <w:t xml:space="preserve">chapters testing the following specific aims and hypotheses: </w:t>
         </w:r>
       </w:ins>
-      <w:del w:id="46" w:author="Kelsey McCune" w:date="2026-07-09T09:03:00Z" w16du:dateUtc="2026-07-09T14:03:00Z">
+      <w:del w:id="48" w:author="Kelsey McCune" w:date="2026-07-09T09:03:00Z" w16du:dateUtc="2026-07-09T14:03:00Z">
         <w:r>
           <w:delText>This study addresses three specific aims:</w:delText>
         </w:r>
@@ -2274,7 +2376,7 @@
           <w:bCs/>
         </w:rPr>
       </w:pPr>
-      <w:ins w:id="47" w:author="Kelsey McCune" w:date="2026-07-09T09:03:00Z" w16du:dateUtc="2026-07-09T14:03:00Z">
+      <w:ins w:id="49" w:author="Kelsey McCune" w:date="2026-07-09T09:03:00Z" w16du:dateUtc="2026-07-09T14:03:00Z">
         <w:r>
           <w:rPr>
             <w:b/>
@@ -2283,7 +2385,7 @@
           <w:t>Chapter</w:t>
         </w:r>
       </w:ins>
-      <w:del w:id="48" w:author="Kelsey McCune" w:date="2026-07-09T09:03:00Z" w16du:dateUtc="2026-07-09T14:03:00Z">
+      <w:del w:id="50" w:author="Kelsey McCune" w:date="2026-07-09T09:03:00Z" w16du:dateUtc="2026-07-09T14:03:00Z">
         <w:r>
           <w:rPr>
             <w:b/>
@@ -2385,33 +2487,33 @@
       </w:r>
     </w:p>
     <w:p>
-      <w:ins w:id="49" w:author="Kelsey McCune" w:date="2026-07-09T09:03:00Z" w16du:dateUtc="2026-07-09T14:03:00Z">
+      <w:ins w:id="51" w:author="Kelsey McCune" w:date="2026-07-09T09:03:00Z" w16du:dateUtc="2026-07-09T14:03:00Z">
         <w:r>
           <w:t>I</w:t>
-        </w:r>
-      </w:ins>
-      <w:del w:id="50" w:author="Kelsey McCune" w:date="2026-07-09T09:03:00Z" w16du:dateUtc="2026-07-09T14:03:00Z">
-        <w:r>
-          <w:delText>We</w:delText>
-        </w:r>
-      </w:del>
-      <w:r>
-        <w:t xml:space="preserve"> </w:t>
-      </w:r>
-      <w:ins w:id="51" w:author="Kelsey McCune" w:date="2026-07-09T09:03:00Z" w16du:dateUtc="2026-07-09T14:03:00Z">
-        <w:r>
-          <w:t>aim</w:t>
         </w:r>
       </w:ins>
       <w:del w:id="52" w:author="Kelsey McCune" w:date="2026-07-09T09:03:00Z" w16du:dateUtc="2026-07-09T14:03:00Z">
         <w:r>
+          <w:delText>We</w:delText>
+        </w:r>
+      </w:del>
+      <w:r>
+        <w:t xml:space="preserve"> </w:t>
+      </w:r>
+      <w:ins w:id="53" w:author="Kelsey McCune" w:date="2026-07-09T09:03:00Z" w16du:dateUtc="2026-07-09T14:03:00Z">
+        <w:r>
+          <w:t>aim</w:t>
+        </w:r>
+      </w:ins>
+      <w:del w:id="54" w:author="Kelsey McCune" w:date="2026-07-09T09:03:00Z" w16du:dateUtc="2026-07-09T14:03:00Z">
+        <w:r>
           <w:delText>seek</w:delText>
         </w:r>
       </w:del>
       <w:r>
         <w:t xml:space="preserve"> to test the relationship between the frequency that birds visit food sources and the probability of infection.</w:t>
       </w:r>
-      <w:ins w:id="53" w:author="Kelsey McCune" w:date="2026-07-09T09:03:00Z" w16du:dateUtc="2026-07-09T14:03:00Z">
+      <w:ins w:id="55" w:author="Kelsey McCune" w:date="2026-07-09T09:03:00Z" w16du:dateUtc="2026-07-09T14:03:00Z">
         <w:r>
           <w:t xml:space="preserve"> </w:t>
         </w:r>
@@ -2426,12 +2528,12 @@
       <w:r>
         <w:t xml:space="preserve"> If bird feeders artificially aggregate individuals and increase direct contact rates, then birds that visit feeders more frequently will sustain greater exposure to environmental pathogens deposited by other individuals, resulting in higher infection prevalence relative to less frequent feeder visitors. </w:t>
       </w:r>
-      <w:ins w:id="54" w:author="Kelsey McCune" w:date="2026-07-09T09:04:00Z" w16du:dateUtc="2026-07-09T14:04:00Z">
+      <w:ins w:id="56" w:author="Kelsey McCune" w:date="2026-07-09T09:04:00Z" w16du:dateUtc="2026-07-09T14:04:00Z">
         <w:r>
           <w:t>I</w:t>
         </w:r>
       </w:ins>
-      <w:del w:id="55" w:author="Kelsey McCune" w:date="2026-07-09T09:04:00Z" w16du:dateUtc="2026-07-09T14:04:00Z">
+      <w:del w:id="57" w:author="Kelsey McCune" w:date="2026-07-09T09:04:00Z" w16du:dateUtc="2026-07-09T14:04:00Z">
         <w:r>
           <w:delText>We</w:delText>
         </w:r>
@@ -2447,7 +2549,7 @@
           <w:bCs/>
         </w:rPr>
       </w:pPr>
-      <w:ins w:id="56" w:author="Kelsey McCune" w:date="2026-07-09T09:04:00Z" w16du:dateUtc="2026-07-09T14:04:00Z">
+      <w:ins w:id="58" w:author="Kelsey McCune" w:date="2026-07-09T09:04:00Z" w16du:dateUtc="2026-07-09T14:04:00Z">
         <w:r>
           <w:rPr>
             <w:b/>
@@ -2456,7 +2558,7 @@
           <w:t>Chapter</w:t>
         </w:r>
       </w:ins>
-      <w:del w:id="57" w:author="Kelsey McCune" w:date="2026-07-09T09:04:00Z" w16du:dateUtc="2026-07-09T14:04:00Z">
+      <w:del w:id="59" w:author="Kelsey McCune" w:date="2026-07-09T09:04:00Z" w16du:dateUtc="2026-07-09T14:04:00Z">
         <w:r>
           <w:rPr>
             <w:b/>
@@ -2502,12 +2604,12 @@
       </w:r>
     </w:p>
     <w:p>
-      <w:del w:id="58" w:author="Kelsey McCune" w:date="2026-07-09T09:04:00Z" w16du:dateUtc="2026-07-09T14:04:00Z">
+      <w:del w:id="60" w:author="Kelsey McCune" w:date="2026-07-09T09:04:00Z" w16du:dateUtc="2026-07-09T14:04:00Z">
         <w:r>
           <w:delText>We seek</w:delText>
         </w:r>
       </w:del>
-      <w:ins w:id="59" w:author="Kelsey McCune" w:date="2026-07-09T09:04:00Z" w16du:dateUtc="2026-07-09T14:04:00Z">
+      <w:ins w:id="61" w:author="Kelsey McCune" w:date="2026-07-09T09:04:00Z" w16du:dateUtc="2026-07-09T14:04:00Z">
         <w:r>
           <w:t>I aim</w:t>
         </w:r>
@@ -2515,7 +2617,7 @@
       <w:r>
         <w:t xml:space="preserve"> to compare pathogen prevalence in wild songbirds among sites representing four treatment types: bird feeder only, backyard chickens only, both feeders and chickens, and control sites with neither. </w:t>
       </w:r>
-      <w:ins w:id="60" w:author="Kelsey McCune" w:date="2026-07-09T09:32:00Z" w16du:dateUtc="2026-07-09T14:32:00Z">
+      <w:ins w:id="62" w:author="Kelsey McCune" w:date="2026-07-09T09:32:00Z" w16du:dateUtc="2026-07-09T14:32:00Z">
         <w:r>
           <w:rPr>
             <w:i/>
@@ -2548,12 +2650,12 @@
       <w:r>
         <w:t xml:space="preserve"> </w:t>
       </w:r>
-      <w:ins w:id="61" w:author="Kelsey McCune" w:date="2026-07-09T09:32:00Z" w16du:dateUtc="2026-07-09T14:32:00Z">
+      <w:ins w:id="63" w:author="Kelsey McCune" w:date="2026-07-09T09:32:00Z" w16du:dateUtc="2026-07-09T14:32:00Z">
         <w:r>
           <w:t>I</w:t>
         </w:r>
       </w:ins>
-      <w:del w:id="62" w:author="Kelsey McCune" w:date="2026-07-09T09:32:00Z" w16du:dateUtc="2026-07-09T14:32:00Z">
+      <w:del w:id="64" w:author="Kelsey McCune" w:date="2026-07-09T09:32:00Z" w16du:dateUtc="2026-07-09T14:32:00Z">
         <w:r>
           <w:delText>We</w:delText>
         </w:r>
@@ -2569,7 +2671,7 @@
       </w:r>
     </w:p>
     <w:p>
-      <w:ins w:id="63" w:author="Kelsey McCune" w:date="2026-07-09T09:32:00Z" w16du:dateUtc="2026-07-09T14:32:00Z">
+      <w:ins w:id="65" w:author="Kelsey McCune" w:date="2026-07-09T09:32:00Z" w16du:dateUtc="2026-07-09T14:32:00Z">
         <w:r>
           <w:rPr>
             <w:b/>
@@ -2578,7 +2680,7 @@
           <w:t>Chapter</w:t>
         </w:r>
       </w:ins>
-      <w:del w:id="64" w:author="Kelsey McCune" w:date="2026-07-09T09:32:00Z" w16du:dateUtc="2026-07-09T14:32:00Z">
+      <w:del w:id="66" w:author="Kelsey McCune" w:date="2026-07-09T09:32:00Z" w16du:dateUtc="2026-07-09T14:32:00Z">
         <w:r>
           <w:rPr>
             <w:b/>
@@ -2608,7 +2710,7 @@
         </w:rPr>
         <w:br/>
       </w:r>
-      <w:del w:id="65" w:author="Kelsey McCune" w:date="2026-07-09T09:33:00Z" w16du:dateUtc="2026-07-09T14:33:00Z">
+      <w:del w:id="67" w:author="Kelsey McCune" w:date="2026-07-09T09:33:00Z" w16du:dateUtc="2026-07-09T14:33:00Z">
         <w:r>
           <w:delText>We</w:delText>
         </w:r>
@@ -2616,7 +2718,7 @@
           <w:delText xml:space="preserve"> will</w:delText>
         </w:r>
       </w:del>
-      <w:ins w:id="66" w:author="Kelsey McCune" w:date="2026-07-09T09:33:00Z" w16du:dateUtc="2026-07-09T14:33:00Z">
+      <w:ins w:id="68" w:author="Kelsey McCune" w:date="2026-07-09T09:33:00Z" w16du:dateUtc="2026-07-09T14:33:00Z">
         <w:r>
           <w:t>I aim to</w:t>
         </w:r>
@@ -2624,18 +2726,18 @@
       <w:r>
         <w:t xml:space="preserve"> characterize disease risk perception, biosecurity practice engagement, willingness to adjust backyard behaviors, and </w:t>
       </w:r>
-      <w:commentRangeStart w:id="67"/>
+      <w:commentRangeStart w:id="69"/>
       <w:r>
         <w:t>place attachment</w:t>
       </w:r>
-      <w:commentRangeEnd w:id="67"/>
+      <w:commentRangeEnd w:id="69"/>
       <w:r>
         <w:rPr>
           <w:rStyle w:val="CommentReference"/>
           <w:sz w:val="24"/>
           <w:szCs w:val="24"/>
         </w:rPr>
-        <w:commentReference w:id="67"/>
+        <w:commentReference w:id="69"/>
       </w:r>
       <w:r>
         <w:t xml:space="preserve"> among participants in bird feeding and </w:t>
@@ -2644,7 +2746,7 @@
         <w:lastRenderedPageBreak/>
         <w:t>backyard poultry keeping in central Alabama through participant surveys.</w:t>
       </w:r>
-      <w:ins w:id="68" w:author="Kelsey McCune" w:date="2026-07-09T09:35:00Z" w16du:dateUtc="2026-07-09T14:35:00Z">
+      <w:ins w:id="70" w:author="Kelsey McCune" w:date="2026-07-09T09:35:00Z" w16du:dateUtc="2026-07-09T14:35:00Z">
         <w:r>
           <w:t xml:space="preserve"> </w:t>
         </w:r>
@@ -2668,28 +2770,28 @@
       <w:r>
         <w:t xml:space="preserve">conservation outreach and </w:t>
       </w:r>
-      <w:commentRangeStart w:id="69"/>
+      <w:commentRangeStart w:id="71"/>
       <w:r>
         <w:t xml:space="preserve">evidence-based </w:t>
       </w:r>
-      <w:del w:id="70" w:author="Alex Fisher" w:date="2026-07-09T11:33:00Z" w16du:dateUtc="2026-07-09T16:33:00Z">
+      <w:del w:id="72" w:author="Alex Fisher" w:date="2026-07-09T11:33:00Z" w16du:dateUtc="2026-07-09T16:33:00Z">
         <w:r>
           <w:delText>promotion</w:delText>
         </w:r>
         <w:r>
           <w:delText>s</w:delText>
         </w:r>
-        <w:commentRangeEnd w:id="69"/>
+        <w:commentRangeEnd w:id="71"/>
         <w:r>
           <w:rPr>
             <w:rStyle w:val="CommentReference"/>
             <w:sz w:val="24"/>
             <w:szCs w:val="24"/>
           </w:rPr>
-          <w:commentReference w:id="69"/>
+          <w:commentReference w:id="71"/>
         </w:r>
       </w:del>
-      <w:ins w:id="71" w:author="Alex Fisher" w:date="2026-07-09T11:34:00Z" w16du:dateUtc="2026-07-09T16:34:00Z">
+      <w:ins w:id="73" w:author="Alex Fisher" w:date="2026-07-09T11:34:00Z" w16du:dateUtc="2026-07-09T16:34:00Z">
         <w:r>
           <w:t>recommendations</w:t>
         </w:r>
@@ -2758,12 +2860,12 @@
       </w:r>
     </w:p>
     <w:p>
-      <w:ins w:id="72" w:author="Kelsey McCune" w:date="2026-07-09T09:39:00Z" w16du:dateUtc="2026-07-09T14:39:00Z">
+      <w:ins w:id="74" w:author="Kelsey McCune" w:date="2026-07-09T09:39:00Z" w16du:dateUtc="2026-07-09T14:39:00Z">
         <w:r>
           <w:t>I</w:t>
         </w:r>
       </w:ins>
-      <w:del w:id="73" w:author="Kelsey McCune" w:date="2026-07-09T09:39:00Z" w16du:dateUtc="2026-07-09T14:39:00Z">
+      <w:del w:id="75" w:author="Kelsey McCune" w:date="2026-07-09T09:39:00Z" w16du:dateUtc="2026-07-09T14:39:00Z">
         <w:r>
           <w:delText>We</w:delText>
         </w:r>
@@ -2774,195 +2876,184 @@
       <w:r>
         <w:t xml:space="preserve"> along an urban-to-rural gradient in central Alabama across </w:t>
       </w:r>
-      <w:commentRangeStart w:id="74"/>
-      <w:r>
-        <w:t xml:space="preserve">twelve </w:t>
-      </w:r>
-      <w:commentRangeEnd w:id="74"/>
+      <w:r>
+        <w:t>fifteen</w:t>
+      </w:r>
+      <w:r>
+        <w:t xml:space="preserve"> sites categorized into four treatment types: control sites with no</w:t>
+      </w:r>
+      <w:r>
+        <w:t xml:space="preserve"> bird</w:t>
+      </w:r>
+      <w:r>
+        <w:t xml:space="preserve">feeders or poultry (n = 4), bird feeder-only sites (n = 4), backyard chicken-only sites (n = </w:t>
+      </w:r>
+      <w:r>
+        <w:t>3</w:t>
+      </w:r>
+      <w:r>
+        <w:t xml:space="preserve">), and sites with both feeders and chickens (n = </w:t>
+      </w:r>
+      <w:r>
+        <w:t>4</w:t>
+      </w:r>
+      <w:r>
+        <w:t xml:space="preserve">). Sites were selected to ensure a baseline level of vegetation </w:t>
+      </w:r>
+      <w:r>
+        <w:t xml:space="preserve">and habitat </w:t>
+      </w:r>
+      <w:r>
+        <w:t xml:space="preserve">suitable for </w:t>
+      </w:r>
+      <w:r>
+        <w:t>wild birds</w:t>
+      </w:r>
+      <w:r>
+        <w:t xml:space="preserve"> and </w:t>
+      </w:r>
+      <w:ins w:id="76" w:author="Kelsey McCune" w:date="2026-07-09T09:39:00Z" w16du:dateUtc="2026-07-09T14:39:00Z">
+        <w:r>
+          <w:t>have been</w:t>
+        </w:r>
+      </w:ins>
+      <w:del w:id="77" w:author="Kelsey McCune" w:date="2026-07-09T09:39:00Z" w16du:dateUtc="2026-07-09T14:39:00Z">
+        <w:r>
+          <w:delText>are</w:delText>
+        </w:r>
+      </w:del>
+      <w:r>
+        <w:t xml:space="preserve"> sampled monthly </w:t>
+      </w:r>
+      <w:r>
+        <w:t>since</w:t>
+      </w:r>
+      <w:r>
+        <w:t xml:space="preserve"> summer 202</w:t>
+      </w:r>
+      <w:r>
+        <w:t>4</w:t>
+      </w:r>
+      <w:r>
+        <w:t xml:space="preserve">. </w:t>
+      </w:r>
+      <w:r>
+        <w:t>Before adding a backyard site to my rotation</w:t>
+      </w:r>
+      <w:r>
+        <w:t xml:space="preserve">, I </w:t>
+      </w:r>
+      <w:r>
+        <w:t>provide</w:t>
+      </w:r>
+      <w:r>
+        <w:t xml:space="preserve"> a standardized entry questionnaire to homeowners to record site-level characteristics including feeder type and placement, poultry housing configuration, current cleaning practices, presence of pets, and vegetation characteristics.</w:t>
+      </w:r>
+    </w:p>
+    <w:p>
+      <w:r>
+        <w:t xml:space="preserve">I capture wild songbirds using mist nets deployed near feeders, chicken coops, or comparably active areas at control sites. Each captured bird is identified to species, sexed when possible, and measured for body mass, wing chord, tarsus length, and bill and skull dimensions to estimate body condition. </w:t>
+      </w:r>
+      <w:r>
+        <w:t xml:space="preserve">Time of capture and release is also recorded. </w:t>
+      </w:r>
+      <w:r>
+        <w:t>All individuals receive a sequentially numbered USGS aluminum leg band. A subset of common resident species</w:t>
+      </w:r>
+      <w:r>
+        <w:t xml:space="preserve"> </w:t>
+      </w:r>
+      <w:r>
+        <w:t xml:space="preserve">including Carolina Chickadee, Tufted Titmouse, Carolina Wren, Blue Jay, Downy Woodpecker, House Finch, and Northern Cardinal additionally </w:t>
+      </w:r>
+      <w:r>
+        <w:t>receive</w:t>
+      </w:r>
+      <w:r>
+        <w:t xml:space="preserve"> </w:t>
+      </w:r>
+      <w:r>
+        <w:t xml:space="preserve">passive integrated transponder (PIT) leg bands. Radio-frequency identification (RFID) antennas installed at feeders, inside coops, and on perches at control sites record date- and time-stamped detections of PIT-tagged individuals, allowing me to </w:t>
+      </w:r>
+      <w:r>
+        <w:t>characterize</w:t>
+      </w:r>
+      <w:r>
+        <w:t xml:space="preserve"> feeder visitation frequenc</w:t>
+      </w:r>
+      <w:r>
+        <w:t>ies</w:t>
+      </w:r>
+      <w:r>
+        <w:t xml:space="preserve"> </w:t>
+      </w:r>
+      <w:r>
+        <w:t>by individual</w:t>
+      </w:r>
+      <w:ins w:id="78" w:author="Kelsey McCune" w:date="2026-07-09T09:41:00Z" w16du:dateUtc="2026-07-09T14:41:00Z">
+        <w:r>
+          <w:t>s</w:t>
+        </w:r>
+      </w:ins>
+      <w:r>
+        <w:t xml:space="preserve"> </w:t>
+      </w:r>
+      <w:r>
+        <w:t>over time. Migratory and unlisted species do not receive PIT tags.</w:t>
+      </w:r>
+    </w:p>
+    <w:p>
+      <w:r>
+        <w:t>I collect fecal</w:t>
+      </w:r>
+      <w:r>
+        <w:t xml:space="preserve">, viral, and blood </w:t>
+      </w:r>
+      <w:r>
+        <w:t>samples from each captured bird via cloacal swa</w:t>
+      </w:r>
+      <w:r>
+        <w:t>bs, fecal</w:t>
+      </w:r>
+      <w:r>
+        <w:t xml:space="preserve"> droppings on clean surfaces</w:t>
+      </w:r>
+      <w:r>
+        <w:t>, tracheal swabs and Nobuto paper strips</w:t>
+      </w:r>
+      <w:r>
+        <w:t>. I also collect fecal samples from backyard chickens</w:t>
+      </w:r>
+      <w:r>
+        <w:t xml:space="preserve">. </w:t>
+      </w:r>
+      <w:commentRangeStart w:id="79"/>
+      <w:r>
+        <w:t>S</w:t>
+      </w:r>
+      <w:r>
+        <w:t>oil and surface swabs from feeder and coop areas</w:t>
+      </w:r>
+      <w:r>
+        <w:t xml:space="preserve"> were collected by Luke Watters</w:t>
+      </w:r>
+      <w:r>
+        <w:t xml:space="preserve"> to characterize environmental pathogen reservoirs. </w:t>
+      </w:r>
+      <w:commentRangeEnd w:id="79"/>
       <w:r>
         <w:rPr>
           <w:rStyle w:val="CommentReference"/>
           <w:sz w:val="24"/>
           <w:szCs w:val="24"/>
         </w:rPr>
-        <w:commentReference w:id="74"/>
-      </w:r>
-      <w:r>
-        <w:t>sites categorized into four treatment types: control sites with no</w:t>
-      </w:r>
-      <w:r>
-        <w:t xml:space="preserve"> bird</w:t>
-      </w:r>
-      <w:r>
-        <w:t xml:space="preserve">feeders or poultry (n = 4), bird feeder-only sites (n = 4), backyard chicken-only sites (n = 2), and sites with both feeders and chickens (n = 2). Sites were selected to ensure a baseline level of vegetation </w:t>
-      </w:r>
-      <w:r>
-        <w:t xml:space="preserve">and habitat </w:t>
-      </w:r>
-      <w:r>
-        <w:t xml:space="preserve">suitable for </w:t>
-      </w:r>
-      <w:r>
-        <w:t>wild birds</w:t>
-      </w:r>
-      <w:r>
-        <w:t xml:space="preserve"> and </w:t>
-      </w:r>
-      <w:ins w:id="75" w:author="Kelsey McCune" w:date="2026-07-09T09:39:00Z" w16du:dateUtc="2026-07-09T14:39:00Z">
-        <w:r>
-          <w:t>have been</w:t>
-        </w:r>
-      </w:ins>
-      <w:del w:id="76" w:author="Kelsey McCune" w:date="2026-07-09T09:39:00Z" w16du:dateUtc="2026-07-09T14:39:00Z">
-        <w:r>
-          <w:delText>are</w:delText>
-        </w:r>
-      </w:del>
-      <w:r>
-        <w:t xml:space="preserve"> sampled monthly </w:t>
-      </w:r>
-      <w:r>
-        <w:t>since</w:t>
-      </w:r>
-      <w:r>
-        <w:t xml:space="preserve"> summer 202</w:t>
-      </w:r>
-      <w:r>
-        <w:t>4</w:t>
-      </w:r>
-      <w:r>
-        <w:t xml:space="preserve">. </w:t>
-      </w:r>
-      <w:r>
-        <w:t>Before adding a backyard site to my rotation</w:t>
-      </w:r>
-      <w:r>
-        <w:t xml:space="preserve">, I </w:t>
-      </w:r>
-      <w:r>
-        <w:t>provide</w:t>
-      </w:r>
-      <w:r>
-        <w:t xml:space="preserve"> a standardized entry questionnaire to homeowners to record site-level characteristics including feeder type and placement, poultry housing configuration, current cleaning practices, presence of pets, and vegetation characteristics.</w:t>
-      </w:r>
-    </w:p>
-    <w:p>
-      <w:r>
-        <w:t xml:space="preserve">I capture wild songbirds using mist nets deployed near feeders, chicken coops, or comparably active areas at control sites. Each captured bird is identified to species, sexed when possible, and measured for body mass, wing chord, tarsus length, and bill and skull dimensions to estimate body condition. </w:t>
-      </w:r>
-      <w:r>
-        <w:t xml:space="preserve">Time of capture and release is also recorded. </w:t>
-      </w:r>
-      <w:r>
-        <w:t>All individuals receive a sequentially numbered USGS aluminum leg band. A subset of common resident species</w:t>
+        <w:commentReference w:id="79"/>
+      </w:r>
+      <w:r>
+        <w:t>All samples are transported on ice and stored at -80°C until processing.</w:t>
       </w:r>
       <w:r>
         <w:t xml:space="preserve"> </w:t>
-      </w:r>
-      <w:r>
-        <w:t xml:space="preserve">including Carolina Chickadee, Tufted Titmouse, Carolina Wren, Blue Jay, Downy Woodpecker, House Finch, and Northern Cardinal additionally </w:t>
-      </w:r>
-      <w:r>
-        <w:t>receive</w:t>
-      </w:r>
-      <w:r>
-        <w:t xml:space="preserve"> </w:t>
-      </w:r>
-      <w:r>
-        <w:t xml:space="preserve">passive integrated transponder (PIT) leg bands. Radio-frequency identification (RFID) antennas installed at feeders, inside coops, and on perches at control sites record date- and time-stamped detections of PIT-tagged individuals, allowing me to </w:t>
-      </w:r>
-      <w:r>
-        <w:t>characterize</w:t>
-      </w:r>
-      <w:r>
-        <w:t xml:space="preserve"> feeder visitation frequenc</w:t>
-      </w:r>
-      <w:r>
-        <w:t>ies</w:t>
-      </w:r>
-      <w:r>
-        <w:t xml:space="preserve"> </w:t>
-      </w:r>
-      <w:r>
-        <w:t>by individual</w:t>
-      </w:r>
-      <w:ins w:id="77" w:author="Kelsey McCune" w:date="2026-07-09T09:41:00Z" w16du:dateUtc="2026-07-09T14:41:00Z">
-        <w:r>
-          <w:t>s</w:t>
-        </w:r>
-      </w:ins>
-      <w:r>
-        <w:t xml:space="preserve"> </w:t>
-      </w:r>
-      <w:r>
-        <w:t>over time. Migratory and unlisted species do not receive PIT tags.</w:t>
-      </w:r>
-    </w:p>
-    <w:p>
-      <w:r>
-        <w:t>I collect fecal</w:t>
-      </w:r>
-      <w:r>
-        <w:t xml:space="preserve">, viral, and blood </w:t>
-      </w:r>
-      <w:r>
-        <w:t>samples from each captured bird via cloacal swa</w:t>
-      </w:r>
-      <w:r>
-        <w:t>bs, fecal</w:t>
-      </w:r>
-      <w:r>
-        <w:t xml:space="preserve"> droppings on clean surfaces</w:t>
-      </w:r>
-      <w:r>
-        <w:t>, tracheal swabs and Nobuto paper strips</w:t>
-      </w:r>
-      <w:r>
-        <w:t>. I also collect fecal samples from backyard chickens</w:t>
-      </w:r>
-      <w:r>
-        <w:t xml:space="preserve">. </w:t>
-      </w:r>
-      <w:commentRangeStart w:id="78"/>
-      <w:r>
-        <w:t>S</w:t>
-      </w:r>
-      <w:r>
-        <w:t>oil and surface swabs from feeder and coop areas</w:t>
-      </w:r>
-      <w:r>
-        <w:t xml:space="preserve"> were collected by Luke Watters</w:t>
-      </w:r>
-      <w:r>
-        <w:t xml:space="preserve"> to characterize environmental pathogen reservoirs. </w:t>
-      </w:r>
-      <w:commentRangeEnd w:id="78"/>
-      <w:r>
-        <w:rPr>
-          <w:rStyle w:val="CommentReference"/>
-          <w:sz w:val="24"/>
-          <w:szCs w:val="24"/>
-        </w:rPr>
-        <w:commentReference w:id="78"/>
-      </w:r>
-      <w:r>
-        <w:t>All samples are transported on ice and stored at -80°C until processing.</w:t>
-      </w:r>
-      <w:r>
-        <w:t xml:space="preserve"> </w:t>
-      </w:r>
-      <w:commentRangeStart w:id="79"/>
-      <w:r>
-        <w:t xml:space="preserve">Point-count surveys were performed at each site by Grace Southerland to determine biodiversity among wild birds. </w:t>
-      </w:r>
-      <w:commentRangeEnd w:id="79"/>
-      <w:r>
-        <w:rPr>
-          <w:rStyle w:val="CommentReference"/>
-          <w:sz w:val="24"/>
-          <w:szCs w:val="24"/>
-        </w:rPr>
-        <w:commentReference w:id="79"/>
       </w:r>
     </w:p>
     <w:p>
@@ -3032,11 +3123,7 @@
         <w:t>ed</w:t>
       </w:r>
       <w:r>
-        <w:t xml:space="preserve"> </w:t>
-      </w:r>
-      <w:r>
-        <w:lastRenderedPageBreak/>
-        <w:t>presumptive</w:t>
+        <w:t xml:space="preserve"> presumptive</w:t>
       </w:r>
       <w:r>
         <w:t xml:space="preserve"> and unk</w:t>
@@ -3066,6 +3153,7 @@
             <w:i/>
             <w:iCs/>
           </w:rPr>
+          <w:lastRenderedPageBreak/>
           <w:t xml:space="preserve">Salmonella typing </w:t>
         </w:r>
       </w:ins>
@@ -3159,14 +3247,11 @@
     <w:p>
       <w:pPr>
         <w:rPr>
-          <w:ins w:id="93" w:author="Kelsey McCune" w:date="2026-07-09T09:47:00Z" w16du:dateUtc="2026-07-09T14:47:00Z"/>
-          <w:b/>
-          <w:bCs/>
           <w:i/>
           <w:iCs/>
         </w:rPr>
       </w:pPr>
-      <w:ins w:id="94" w:author="Kelsey McCune" w:date="2026-07-09T09:47:00Z" w16du:dateUtc="2026-07-09T14:47:00Z">
+      <w:ins w:id="93" w:author="Kelsey McCune" w:date="2026-07-09T09:47:00Z" w16du:dateUtc="2026-07-09T14:47:00Z">
         <w:r>
           <w:rPr>
             <w:b/>
@@ -3177,6 +3262,132 @@
           <w:t>Chapter 1</w:t>
         </w:r>
       </w:ins>
+      <w:r>
+        <w:rPr>
+          <w:b/>
+          <w:bCs/>
+          <w:i/>
+          <w:iCs/>
+        </w:rPr>
+        <w:t xml:space="preserve">: </w:t>
+      </w:r>
+      <w:r>
+        <w:rPr>
+          <w:i/>
+          <w:iCs/>
+        </w:rPr>
+        <w:t>which statistical models are we using</w:t>
+      </w:r>
+      <w:r>
+        <w:rPr>
+          <w:i/>
+          <w:iCs/>
+        </w:rPr>
+        <w:t xml:space="preserve">. “I’m going to t test the relationship between food visitation frequency (discrete; Poisson and probability of infection (Binomial; Y/N) </w:t>
+      </w:r>
+    </w:p>
+    <w:p>
+      <w:pPr>
+        <w:pStyle w:val="ListParagraph"/>
+        <w:numPr>
+          <w:ilvl w:val="0"/>
+          <w:numId w:val="6"/>
+        </w:numPr>
+        <w:rPr>
+          <w:b/>
+          <w:bCs/>
+          <w:i/>
+          <w:iCs/>
+        </w:rPr>
+      </w:pPr>
+      <w:r>
+        <w:rPr>
+          <w:b/>
+          <w:bCs/>
+          <w:i/>
+          <w:iCs/>
+        </w:rPr>
+        <w:t xml:space="preserve">Infection ~ </w:t>
+      </w:r>
+      <w:r>
+        <w:rPr>
+          <w:b/>
+          <w:bCs/>
+          <w:i/>
+          <w:iCs/>
+        </w:rPr>
+        <w:t>RFID</w:t>
+      </w:r>
+      <w:r>
+        <w:rPr>
+          <w:b/>
+          <w:bCs/>
+          <w:i/>
+          <w:iCs/>
+        </w:rPr>
+        <w:t xml:space="preserve"> + </w:t>
+      </w:r>
+      <w:r>
+        <w:rPr>
+          <w:b/>
+          <w:bCs/>
+          <w:i/>
+          <w:iCs/>
+        </w:rPr>
+        <w:t xml:space="preserve">Treatment + </w:t>
+      </w:r>
+      <w:r>
+        <w:rPr>
+          <w:b/>
+          <w:bCs/>
+          <w:i/>
+          <w:iCs/>
+        </w:rPr>
+        <w:t>Species + Season</w:t>
+      </w:r>
+      <w:r>
+        <w:rPr>
+          <w:b/>
+          <w:bCs/>
+          <w:i/>
+          <w:iCs/>
+        </w:rPr>
+        <w:t>…</w:t>
+      </w:r>
+      <w:r>
+        <w:rPr>
+          <w:b/>
+          <w:bCs/>
+          <w:i/>
+          <w:iCs/>
+        </w:rPr>
+        <w:t xml:space="preserve"> but we hope through WGS that</w:t>
+      </w:r>
+    </w:p>
+    <w:p>
+      <w:pPr>
+        <w:pStyle w:val="ListParagraph"/>
+        <w:numPr>
+          <w:ilvl w:val="0"/>
+          <w:numId w:val="6"/>
+        </w:numPr>
+        <w:rPr>
+          <w:ins w:id="94" w:author="Kelsey McCune" w:date="2026-07-09T09:47:00Z" w16du:dateUtc="2026-07-09T14:47:00Z"/>
+          <w:b/>
+          <w:bCs/>
+          <w:i/>
+          <w:iCs/>
+        </w:rPr>
+      </w:pPr>
+      <w:r>
+        <w:rPr>
+          <w:b/>
+          <w:bCs/>
+          <w:i/>
+          <w:iCs/>
+        </w:rPr>
+        <w:t>Caveat: could turn into a disease contact network &amp; social contact network</w:t>
+      </w:r>
     </w:p>
     <w:p>
       <w:pPr>
@@ -3201,6 +3412,31 @@
           <w:t>Chapter 2</w:t>
         </w:r>
       </w:ins>
+      <w:r>
+        <w:rPr>
+          <w:b/>
+          <w:bCs/>
+          <w:i/>
+          <w:iCs/>
+        </w:rPr>
+        <w:t xml:space="preserve">: </w:t>
+      </w:r>
+      <w:r>
+        <w:rPr>
+          <w:i/>
+          <w:iCs/>
+        </w:rPr>
+        <w:t>Similar to poster presentation</w:t>
+      </w:r>
+      <w:r>
+        <w:rPr>
+          <w:b/>
+          <w:bCs/>
+          <w:i/>
+          <w:iCs/>
+        </w:rPr>
+        <w:t xml:space="preserve">; Infection ~ Treatment + Species + Season… </w:t>
+      </w:r>
     </w:p>
     <w:p>
       <w:r>
@@ -3332,6 +3568,15 @@
           <w:t>Chapter 3</w:t>
         </w:r>
       </w:ins>
+      <w:r>
+        <w:rPr>
+          <w:b/>
+          <w:bCs/>
+          <w:i/>
+          <w:iCs/>
+        </w:rPr>
+        <w:t xml:space="preserve">: </w:t>
+      </w:r>
     </w:p>
     <w:p>
       <w:pPr>
@@ -3358,31 +3603,22 @@
           <w:delText>Analysis/</w:delText>
         </w:r>
       </w:del>
-      <w:ins w:id="105" w:author="Kelsey McCune" w:date="2026-07-09T09:50:00Z" w16du:dateUtc="2026-07-09T14:50:00Z">
+      <w:r>
+        <w:rPr>
+          <w:b/>
+          <w:bCs/>
+        </w:rPr>
+        <w:t>Preliminary Data</w:t>
+      </w:r>
+      <w:ins w:id="105" w:author="Kelsey McCune" w:date="2026-07-09T09:51:00Z" w16du:dateUtc="2026-07-09T14:51:00Z">
         <w:r>
           <w:rPr>
             <w:b/>
             <w:bCs/>
           </w:rPr>
-          <w:t>Expecte</w:t>
+          <w:t xml:space="preserve"> </w:t>
         </w:r>
       </w:ins>
-      <w:ins w:id="106" w:author="Kelsey McCune" w:date="2026-07-09T09:51:00Z" w16du:dateUtc="2026-07-09T14:51:00Z">
-        <w:r>
-          <w:rPr>
-            <w:b/>
-            <w:bCs/>
-          </w:rPr>
-          <w:t xml:space="preserve">d </w:t>
-        </w:r>
-      </w:ins>
-      <w:r>
-        <w:rPr>
-          <w:b/>
-          <w:bCs/>
-        </w:rPr>
-        <w:t>Results</w:t>
-      </w:r>
     </w:p>
     <w:p>
       <w:r>
@@ -3392,7 +3628,7 @@
     <w:p>
       <w:pPr>
         <w:rPr>
-          <w:ins w:id="107" w:author="Alex Fisher" w:date="2026-07-09T14:33:00Z" w16du:dateUtc="2026-07-09T19:33:00Z"/>
+          <w:ins w:id="106" w:author="Alex Fisher" w:date="2026-07-09T14:33:00Z" w16du:dateUtc="2026-07-09T19:33:00Z"/>
         </w:rPr>
       </w:pPr>
       <w:r>
@@ -3406,16 +3642,17 @@
           <w:ilvl w:val="0"/>
           <w:numId w:val="4"/>
         </w:numPr>
-        <w:pPrChange w:id="108" w:author="Alex Fisher" w:date="2026-07-09T14:34:00Z" w16du:dateUtc="2026-07-09T19:34:00Z">
+        <w:pPrChange w:id="107" w:author="Alex Fisher" w:date="2026-07-09T14:34:00Z" w16du:dateUtc="2026-07-09T19:34:00Z">
           <w:pPr/>
         </w:pPrChange>
       </w:pPr>
-      <w:ins w:id="109" w:author="Alex Fisher" w:date="2026-07-09T14:33:00Z" w16du:dateUtc="2026-07-09T19:33:00Z">
-        <w:r>
+      <w:ins w:id="108" w:author="Alex Fisher" w:date="2026-07-09T14:33:00Z" w16du:dateUtc="2026-07-09T19:33:00Z">
+        <w:r>
+          <w:lastRenderedPageBreak/>
           <w:t>Prelim</w:t>
         </w:r>
       </w:ins>
-      <w:ins w:id="110" w:author="Alex Fisher" w:date="2026-07-09T14:34:00Z" w16du:dateUtc="2026-07-09T19:34:00Z">
+      <w:ins w:id="109" w:author="Alex Fisher" w:date="2026-07-09T14:34:00Z" w16du:dateUtc="2026-07-09T19:34:00Z">
         <w:r>
           <w:t xml:space="preserve">inary data shows </w:t>
         </w:r>
@@ -3424,11 +3661,10 @@
     <w:p>
       <w:pPr>
         <w:rPr>
-          <w:ins w:id="111" w:author="Alex Fisher" w:date="2026-07-09T14:32:00Z" w16du:dateUtc="2026-07-09T19:32:00Z"/>
-        </w:rPr>
-      </w:pPr>
-      <w:r>
-        <w:lastRenderedPageBreak/>
+          <w:ins w:id="110" w:author="Alex Fisher" w:date="2026-07-09T14:32:00Z" w16du:dateUtc="2026-07-09T19:32:00Z"/>
+        </w:rPr>
+      </w:pPr>
+      <w:r>
         <w:t xml:space="preserve">Lab Results </w:t>
       </w:r>
     </w:p>
@@ -3440,18 +3676,18 @@
           <w:numId w:val="3"/>
         </w:numPr>
         <w:rPr>
-          <w:ins w:id="112" w:author="Alex Fisher" w:date="2026-07-09T14:30:00Z" w16du:dateUtc="2026-07-09T19:30:00Z"/>
-        </w:rPr>
-        <w:pPrChange w:id="113" w:author="Alex Fisher" w:date="2026-07-09T14:32:00Z" w16du:dateUtc="2026-07-09T19:32:00Z">
+          <w:ins w:id="111" w:author="Alex Fisher" w:date="2026-07-09T14:30:00Z" w16du:dateUtc="2026-07-09T19:30:00Z"/>
+        </w:rPr>
+        <w:pPrChange w:id="112" w:author="Alex Fisher" w:date="2026-07-09T14:32:00Z" w16du:dateUtc="2026-07-09T19:32:00Z">
           <w:pPr/>
         </w:pPrChange>
       </w:pPr>
-      <w:ins w:id="114" w:author="Alex Fisher" w:date="2026-07-09T14:32:00Z" w16du:dateUtc="2026-07-09T19:32:00Z">
+      <w:ins w:id="113" w:author="Alex Fisher" w:date="2026-07-09T14:32:00Z" w16du:dateUtc="2026-07-09T19:32:00Z">
         <w:r>
           <w:t xml:space="preserve">Preliminary findings of samples have </w:t>
         </w:r>
       </w:ins>
-      <w:ins w:id="115" w:author="Alex Fisher" w:date="2026-07-09T14:33:00Z" w16du:dateUtc="2026-07-09T19:33:00Z">
+      <w:ins w:id="114" w:author="Alex Fisher" w:date="2026-07-09T14:33:00Z" w16du:dateUtc="2026-07-09T19:33:00Z">
         <w:r>
           <w:t xml:space="preserve">forced us to refine lab methods to better expect these results. </w:t>
         </w:r>
@@ -3464,11 +3700,11 @@
           <w:ilvl w:val="0"/>
           <w:numId w:val="3"/>
         </w:numPr>
-        <w:pPrChange w:id="116" w:author="Alex Fisher" w:date="2026-07-09T14:30:00Z" w16du:dateUtc="2026-07-09T19:30:00Z">
+        <w:pPrChange w:id="115" w:author="Alex Fisher" w:date="2026-07-09T14:30:00Z" w16du:dateUtc="2026-07-09T19:30:00Z">
           <w:pPr/>
         </w:pPrChange>
       </w:pPr>
-      <w:ins w:id="117" w:author="Alex Fisher" w:date="2026-07-09T14:30:00Z" w16du:dateUtc="2026-07-09T19:30:00Z">
+      <w:ins w:id="116" w:author="Alex Fisher" w:date="2026-07-09T14:30:00Z" w16du:dateUtc="2026-07-09T19:30:00Z">
         <w:r>
           <w:t xml:space="preserve">Currently doing gene extraction and PCR, which may allow us to perform WGS in the future to characterize the serotypes we are finding from wild birds/poultry. </w:t>
         </w:r>
@@ -3479,10 +3715,24 @@
         <w:t xml:space="preserve">Survey Results </w:t>
       </w:r>
     </w:p>
+    <w:p>
+      <w:pPr>
+        <w:rPr>
+          <w:b/>
+          <w:bCs/>
+        </w:rPr>
+      </w:pPr>
+      <w:r>
+        <w:rPr>
+          <w:b/>
+          <w:bCs/>
+        </w:rPr>
+        <w:t>Ongoing/Expected Results</w:t>
+      </w:r>
+    </w:p>
     <w:p/>
-    <w:p/>
-    <w:p>
-      <w:ins w:id="118" w:author="Kelsey McCune" w:date="2026-07-09T09:51:00Z" w16du:dateUtc="2026-07-09T14:51:00Z">
+    <w:p>
+      <w:ins w:id="117" w:author="Kelsey McCune" w:date="2026-07-09T09:51:00Z" w16du:dateUtc="2026-07-09T14:51:00Z">
         <w:r>
           <w:rPr>
             <w:b/>
@@ -3491,7 +3741,7 @@
           <w:t>Timeline</w:t>
         </w:r>
       </w:ins>
-      <w:del w:id="119" w:author="Kelsey McCune" w:date="2026-07-09T09:51:00Z" w16du:dateUtc="2026-07-09T14:51:00Z">
+      <w:del w:id="118" w:author="Kelsey McCune" w:date="2026-07-09T09:51:00Z" w16du:dateUtc="2026-07-09T14:51:00Z">
         <w:r>
           <w:br w:type="page"/>
         </w:r>
@@ -3512,1236 +3762,15 @@
           <w:numId w:val="3"/>
         </w:numPr>
         <w:rPr>
-          <w:ins w:id="120" w:author="Alex Fisher" w:date="2026-07-23T14:01:00Z" w16du:dateUtc="2026-07-23T19:01:00Z"/>
-        </w:rPr>
-      </w:pPr>
-      <w:ins w:id="121" w:author="Alex Fisher" w:date="2026-07-09T14:34:00Z" w16du:dateUtc="2026-07-09T19:34:00Z">
+          <w:ins w:id="119" w:author="Alex Fisher" w:date="2026-07-23T14:01:00Z" w16du:dateUtc="2026-07-23T19:01:00Z"/>
+        </w:rPr>
+      </w:pPr>
+      <w:ins w:id="120" w:author="Alex Fisher" w:date="2026-07-09T14:34:00Z" w16du:dateUtc="2026-07-09T19:34:00Z">
         <w:r>
           <w:t xml:space="preserve">AGRISEED grant has a Gant chart timeline, also include classes and expected defense date </w:t>
         </w:r>
       </w:ins>
     </w:p>
-    <w:tbl>
-      <w:tblPr>
-        <w:tblStyle w:val="TableGrid"/>
-        <w:tblW w:w="10745" w:type="dxa"/>
-        <w:tblInd w:w="-1440" w:type="dxa"/>
-        <w:tblBorders>
-          <w:left w:val="none" w:sz="0" w:space="0" w:color="auto"/>
-          <w:right w:val="none" w:sz="0" w:space="0" w:color="auto"/>
-          <w:insideH w:val="none" w:sz="0" w:space="0" w:color="auto"/>
-          <w:insideV w:val="none" w:sz="0" w:space="0" w:color="auto"/>
-        </w:tblBorders>
-        <w:tblLayout w:type="fixed"/>
-        <w:tblLook w:val="04A0" w:firstRow="1" w:lastRow="0" w:firstColumn="1" w:lastColumn="0" w:noHBand="0" w:noVBand="1"/>
-      </w:tblPr>
-      <w:tblGrid>
-        <w:gridCol w:w="1937"/>
-        <w:gridCol w:w="1225"/>
-        <w:gridCol w:w="1149"/>
-        <w:gridCol w:w="245"/>
-        <w:gridCol w:w="1440"/>
-        <w:gridCol w:w="1149"/>
-        <w:gridCol w:w="766"/>
-        <w:gridCol w:w="2834"/>
-        <w:tblGridChange w:id="122">
-          <w:tblGrid>
-            <w:gridCol w:w="1937"/>
-            <w:gridCol w:w="1225"/>
-            <w:gridCol w:w="1149"/>
-            <w:gridCol w:w="245"/>
-            <w:gridCol w:w="1440"/>
-            <w:gridCol w:w="1149"/>
-            <w:gridCol w:w="766"/>
-            <w:gridCol w:w="2834"/>
-          </w:tblGrid>
-        </w:tblGridChange>
-      </w:tblGrid>
-      <w:tr>
-        <w:trPr>
-          <w:trHeight w:val="289"/>
-          <w:ins w:id="123" w:author="Alex Fisher" w:date="2026-07-23T14:01:00Z"/>
-        </w:trPr>
-        <w:tc>
-          <w:tcPr>
-            <w:tcW w:w="1937" w:type="dxa"/>
-            <w:vMerge w:val="restart"/>
-            <w:tcBorders>
-              <w:top w:val="single" w:sz="4" w:space="0" w:color="auto"/>
-              <w:right w:val="single" w:sz="4" w:space="0" w:color="auto"/>
-            </w:tcBorders>
-            <w:vAlign w:val="center"/>
-          </w:tcPr>
-          <w:p>
-            <w:pPr>
-              <w:spacing w:after="160" w:line="278" w:lineRule="auto"/>
-              <w:rPr>
-                <w:ins w:id="124" w:author="Alex Fisher" w:date="2026-07-23T14:01:00Z"/>
-                <w:lang w:val="en"/>
-              </w:rPr>
-            </w:pPr>
-            <w:ins w:id="125" w:author="Alex Fisher" w:date="2026-07-23T14:01:00Z">
-              <w:r>
-                <w:rPr>
-                  <w:lang w:val="en"/>
-                </w:rPr>
-                <w:t>Task</w:t>
-              </w:r>
-            </w:ins>
-          </w:p>
-        </w:tc>
-        <w:tc>
-          <w:tcPr>
-            <w:tcW w:w="2619" w:type="dxa"/>
-            <w:gridSpan w:val="3"/>
-            <w:tcBorders>
-              <w:top w:val="single" w:sz="4" w:space="0" w:color="auto"/>
-              <w:left w:val="single" w:sz="4" w:space="0" w:color="auto"/>
-              <w:bottom w:val="nil"/>
-              <w:right w:val="single" w:sz="4" w:space="0" w:color="auto"/>
-            </w:tcBorders>
-            <w:vAlign w:val="center"/>
-          </w:tcPr>
-          <w:p>
-            <w:pPr>
-              <w:spacing w:after="160" w:line="278" w:lineRule="auto"/>
-              <w:rPr>
-                <w:ins w:id="126" w:author="Alex Fisher" w:date="2026-07-23T14:01:00Z"/>
-                <w:lang w:val="en"/>
-              </w:rPr>
-            </w:pPr>
-            <w:ins w:id="127" w:author="Alex Fisher" w:date="2026-07-23T14:01:00Z">
-              <w:r>
-                <w:rPr>
-                  <w:lang w:val="en"/>
-                </w:rPr>
-                <w:t>202</w:t>
-              </w:r>
-            </w:ins>
-            <w:r>
-              <w:rPr>
-                <w:lang w:val="en"/>
-              </w:rPr>
-              <w:t>5</w:t>
-            </w:r>
-          </w:p>
-        </w:tc>
-        <w:tc>
-          <w:tcPr>
-            <w:tcW w:w="3355" w:type="dxa"/>
-            <w:gridSpan w:val="3"/>
-            <w:tcBorders>
-              <w:top w:val="single" w:sz="4" w:space="0" w:color="auto"/>
-              <w:left w:val="single" w:sz="4" w:space="0" w:color="auto"/>
-              <w:bottom w:val="nil"/>
-            </w:tcBorders>
-          </w:tcPr>
-          <w:p>
-            <w:pPr>
-              <w:spacing w:after="160" w:line="278" w:lineRule="auto"/>
-              <w:rPr>
-                <w:ins w:id="128" w:author="Alex Fisher" w:date="2026-07-23T14:01:00Z"/>
-                <w:lang w:val="en"/>
-              </w:rPr>
-            </w:pPr>
-            <w:ins w:id="129" w:author="Alex Fisher" w:date="2026-07-23T14:01:00Z">
-              <w:r>
-                <w:rPr>
-                  <w:lang w:val="en"/>
-                </w:rPr>
-                <w:t>202</w:t>
-              </w:r>
-            </w:ins>
-            <w:r>
-              <w:rPr>
-                <w:lang w:val="en"/>
-              </w:rPr>
-              <w:t>6</w:t>
-            </w:r>
-          </w:p>
-        </w:tc>
-        <w:tc>
-          <w:tcPr>
-            <w:tcW w:w="2834" w:type="dxa"/>
-            <w:tcBorders>
-              <w:top w:val="single" w:sz="4" w:space="0" w:color="auto"/>
-              <w:left w:val="single" w:sz="4" w:space="0" w:color="auto"/>
-              <w:bottom w:val="nil"/>
-            </w:tcBorders>
-          </w:tcPr>
-          <w:p>
-            <w:pPr>
-              <w:rPr>
-                <w:lang w:val="en"/>
-              </w:rPr>
-            </w:pPr>
-            <w:r>
-              <w:rPr>
-                <w:lang w:val="en"/>
-              </w:rPr>
-              <w:t>2027</w:t>
-            </w:r>
-          </w:p>
-        </w:tc>
-      </w:tr>
-      <w:tr>
-        <w:trPr>
-          <w:trHeight w:val="289"/>
-          <w:ins w:id="130" w:author="Alex Fisher" w:date="2026-07-23T14:01:00Z"/>
-        </w:trPr>
-        <w:tc>
-          <w:tcPr>
-            <w:tcW w:w="1937" w:type="dxa"/>
-            <w:vMerge/>
-            <w:tcBorders>
-              <w:bottom w:val="single" w:sz="4" w:space="0" w:color="auto"/>
-              <w:right w:val="single" w:sz="4" w:space="0" w:color="auto"/>
-            </w:tcBorders>
-          </w:tcPr>
-          <w:p>
-            <w:pPr>
-              <w:spacing w:after="160" w:line="278" w:lineRule="auto"/>
-              <w:rPr>
-                <w:ins w:id="131" w:author="Alex Fisher" w:date="2026-07-23T14:01:00Z"/>
-                <w:lang w:val="en"/>
-              </w:rPr>
-            </w:pPr>
-          </w:p>
-        </w:tc>
-        <w:tc>
-          <w:tcPr>
-            <w:tcW w:w="1225" w:type="dxa"/>
-            <w:tcBorders>
-              <w:top w:val="nil"/>
-              <w:left w:val="single" w:sz="4" w:space="0" w:color="auto"/>
-              <w:bottom w:val="single" w:sz="4" w:space="0" w:color="auto"/>
-            </w:tcBorders>
-          </w:tcPr>
-          <w:p>
-            <w:pPr>
-              <w:spacing w:after="160" w:line="278" w:lineRule="auto"/>
-              <w:rPr>
-                <w:ins w:id="132" w:author="Alex Fisher" w:date="2026-07-23T14:01:00Z"/>
-                <w:lang w:val="en"/>
-              </w:rPr>
-            </w:pPr>
-            <w:r>
-              <w:rPr>
-                <w:lang w:val="en"/>
-              </w:rPr>
-              <w:t>Fall</w:t>
-            </w:r>
-          </w:p>
-        </w:tc>
-        <w:tc>
-          <w:tcPr>
-            <w:tcW w:w="1149" w:type="dxa"/>
-            <w:tcBorders>
-              <w:top w:val="nil"/>
-              <w:bottom w:val="single" w:sz="4" w:space="0" w:color="auto"/>
-            </w:tcBorders>
-            <w:vAlign w:val="center"/>
-          </w:tcPr>
-          <w:p>
-            <w:pPr>
-              <w:spacing w:after="160" w:line="278" w:lineRule="auto"/>
-              <w:rPr>
-                <w:ins w:id="133" w:author="Alex Fisher" w:date="2026-07-23T14:01:00Z"/>
-                <w:lang w:val="en"/>
-              </w:rPr>
-            </w:pPr>
-          </w:p>
-        </w:tc>
-        <w:tc>
-          <w:tcPr>
-            <w:tcW w:w="245" w:type="dxa"/>
-            <w:tcBorders>
-              <w:top w:val="nil"/>
-              <w:bottom w:val="single" w:sz="4" w:space="0" w:color="auto"/>
-              <w:right w:val="single" w:sz="4" w:space="0" w:color="auto"/>
-            </w:tcBorders>
-            <w:vAlign w:val="center"/>
-          </w:tcPr>
-          <w:p>
-            <w:pPr>
-              <w:spacing w:after="160" w:line="278" w:lineRule="auto"/>
-              <w:rPr>
-                <w:ins w:id="134" w:author="Alex Fisher" w:date="2026-07-23T14:01:00Z"/>
-                <w:lang w:val="en"/>
-              </w:rPr>
-            </w:pPr>
-          </w:p>
-        </w:tc>
-        <w:tc>
-          <w:tcPr>
-            <w:tcW w:w="1440" w:type="dxa"/>
-            <w:tcBorders>
-              <w:top w:val="nil"/>
-              <w:left w:val="single" w:sz="4" w:space="0" w:color="auto"/>
-              <w:bottom w:val="single" w:sz="4" w:space="0" w:color="auto"/>
-            </w:tcBorders>
-          </w:tcPr>
-          <w:p>
-            <w:pPr>
-              <w:spacing w:after="160" w:line="278" w:lineRule="auto"/>
-              <w:rPr>
-                <w:ins w:id="135" w:author="Alex Fisher" w:date="2026-07-23T14:01:00Z"/>
-                <w:lang w:val="en"/>
-              </w:rPr>
-            </w:pPr>
-            <w:ins w:id="136" w:author="Alex Fisher" w:date="2026-07-23T14:01:00Z">
-              <w:r>
-                <w:rPr>
-                  <w:lang w:val="en"/>
-                </w:rPr>
-                <w:t>Spring</w:t>
-              </w:r>
-            </w:ins>
-          </w:p>
-        </w:tc>
-        <w:tc>
-          <w:tcPr>
-            <w:tcW w:w="1149" w:type="dxa"/>
-            <w:tcBorders>
-              <w:top w:val="nil"/>
-              <w:bottom w:val="single" w:sz="4" w:space="0" w:color="auto"/>
-            </w:tcBorders>
-          </w:tcPr>
-          <w:p>
-            <w:pPr>
-              <w:spacing w:after="160" w:line="278" w:lineRule="auto"/>
-              <w:rPr>
-                <w:ins w:id="137" w:author="Alex Fisher" w:date="2026-07-23T14:01:00Z"/>
-                <w:lang w:val="en"/>
-              </w:rPr>
-            </w:pPr>
-            <w:ins w:id="138" w:author="Alex Fisher" w:date="2026-07-23T14:01:00Z">
-              <w:r>
-                <w:rPr>
-                  <w:lang w:val="en"/>
-                </w:rPr>
-                <w:t>Summer</w:t>
-              </w:r>
-            </w:ins>
-          </w:p>
-        </w:tc>
-        <w:tc>
-          <w:tcPr>
-            <w:tcW w:w="766" w:type="dxa"/>
-            <w:tcBorders>
-              <w:top w:val="nil"/>
-              <w:bottom w:val="single" w:sz="4" w:space="0" w:color="auto"/>
-            </w:tcBorders>
-          </w:tcPr>
-          <w:p>
-            <w:pPr>
-              <w:spacing w:after="160" w:line="278" w:lineRule="auto"/>
-              <w:rPr>
-                <w:ins w:id="139" w:author="Alex Fisher" w:date="2026-07-23T14:01:00Z"/>
-                <w:lang w:val="en"/>
-              </w:rPr>
-            </w:pPr>
-            <w:ins w:id="140" w:author="Alex Fisher" w:date="2026-07-23T14:01:00Z">
-              <w:r>
-                <w:rPr>
-                  <w:lang w:val="en"/>
-                </w:rPr>
-                <w:t>Fall</w:t>
-              </w:r>
-            </w:ins>
-          </w:p>
-        </w:tc>
-        <w:tc>
-          <w:tcPr>
-            <w:tcW w:w="2834" w:type="dxa"/>
-            <w:tcBorders>
-              <w:top w:val="nil"/>
-              <w:bottom w:val="single" w:sz="4" w:space="0" w:color="auto"/>
-            </w:tcBorders>
-          </w:tcPr>
-          <w:p>
-            <w:pPr>
-              <w:rPr>
-                <w:lang w:val="en"/>
-              </w:rPr>
-            </w:pPr>
-            <w:r>
-              <w:rPr>
-                <w:lang w:val="en"/>
-              </w:rPr>
-              <w:t>Spring</w:t>
-            </w:r>
-          </w:p>
-        </w:tc>
-      </w:tr>
-      <w:tr>
-        <w:trPr>
-          <w:trHeight w:val="496"/>
-          <w:ins w:id="141" w:author="Alex Fisher" w:date="2026-07-23T14:01:00Z"/>
-        </w:trPr>
-        <w:tc>
-          <w:tcPr>
-            <w:tcW w:w="1937" w:type="dxa"/>
-            <w:tcBorders>
-              <w:top w:val="single" w:sz="4" w:space="0" w:color="auto"/>
-              <w:right w:val="single" w:sz="4" w:space="0" w:color="auto"/>
-            </w:tcBorders>
-          </w:tcPr>
-          <w:p>
-            <w:pPr>
-              <w:spacing w:after="160" w:line="278" w:lineRule="auto"/>
-              <w:rPr>
-                <w:ins w:id="142" w:author="Alex Fisher" w:date="2026-07-23T14:01:00Z"/>
-                <w:lang w:val="en"/>
-              </w:rPr>
-            </w:pPr>
-            <w:ins w:id="143" w:author="Alex Fisher" w:date="2026-07-23T14:01:00Z">
-              <w:r>
-                <w:rPr>
-                  <w:lang w:val="en"/>
-                </w:rPr>
-                <w:t>RFID data collection</w:t>
-              </w:r>
-            </w:ins>
-          </w:p>
-        </w:tc>
-        <w:tc>
-          <w:tcPr>
-            <w:tcW w:w="1225" w:type="dxa"/>
-            <w:tcBorders>
-              <w:top w:val="single" w:sz="4" w:space="0" w:color="auto"/>
-              <w:left w:val="single" w:sz="4" w:space="0" w:color="auto"/>
-            </w:tcBorders>
-            <w:shd w:val="clear" w:color="auto" w:fill="AEAAAA" w:themeFill="background2" w:themeFillShade="BF"/>
-          </w:tcPr>
-          <w:p>
-            <w:pPr>
-              <w:spacing w:after="160" w:line="278" w:lineRule="auto"/>
-              <w:rPr>
-                <w:ins w:id="144" w:author="Alex Fisher" w:date="2026-07-23T14:01:00Z"/>
-                <w:u w:val="single"/>
-                <w:lang w:val="en"/>
-              </w:rPr>
-            </w:pPr>
-          </w:p>
-        </w:tc>
-        <w:tc>
-          <w:tcPr>
-            <w:tcW w:w="1149" w:type="dxa"/>
-            <w:tcBorders>
-              <w:top w:val="single" w:sz="4" w:space="0" w:color="auto"/>
-            </w:tcBorders>
-            <w:shd w:val="clear" w:color="auto" w:fill="AEAAAA" w:themeFill="background2" w:themeFillShade="BF"/>
-          </w:tcPr>
-          <w:p>
-            <w:pPr>
-              <w:spacing w:after="160" w:line="278" w:lineRule="auto"/>
-              <w:rPr>
-                <w:ins w:id="145" w:author="Alex Fisher" w:date="2026-07-23T14:01:00Z"/>
-                <w:u w:val="single"/>
-                <w:lang w:val="en"/>
-              </w:rPr>
-            </w:pPr>
-          </w:p>
-        </w:tc>
-        <w:tc>
-          <w:tcPr>
-            <w:tcW w:w="245" w:type="dxa"/>
-            <w:tcBorders>
-              <w:top w:val="single" w:sz="4" w:space="0" w:color="auto"/>
-            </w:tcBorders>
-            <w:shd w:val="clear" w:color="auto" w:fill="AEAAAA" w:themeFill="background2" w:themeFillShade="BF"/>
-          </w:tcPr>
-          <w:p>
-            <w:pPr>
-              <w:spacing w:after="160" w:line="278" w:lineRule="auto"/>
-              <w:rPr>
-                <w:ins w:id="146" w:author="Alex Fisher" w:date="2026-07-23T14:01:00Z"/>
-                <w:u w:val="single"/>
-                <w:lang w:val="en"/>
-              </w:rPr>
-            </w:pPr>
-          </w:p>
-        </w:tc>
-        <w:tc>
-          <w:tcPr>
-            <w:tcW w:w="1440" w:type="dxa"/>
-            <w:tcBorders>
-              <w:top w:val="single" w:sz="4" w:space="0" w:color="auto"/>
-            </w:tcBorders>
-            <w:shd w:val="clear" w:color="auto" w:fill="AEAAAA" w:themeFill="background2" w:themeFillShade="BF"/>
-          </w:tcPr>
-          <w:p>
-            <w:pPr>
-              <w:spacing w:after="160" w:line="278" w:lineRule="auto"/>
-              <w:rPr>
-                <w:ins w:id="147" w:author="Alex Fisher" w:date="2026-07-23T14:01:00Z"/>
-                <w:u w:val="single"/>
-                <w:lang w:val="en"/>
-              </w:rPr>
-            </w:pPr>
-          </w:p>
-        </w:tc>
-        <w:tc>
-          <w:tcPr>
-            <w:tcW w:w="1149" w:type="dxa"/>
-            <w:tcBorders>
-              <w:top w:val="single" w:sz="4" w:space="0" w:color="auto"/>
-            </w:tcBorders>
-            <w:shd w:val="clear" w:color="auto" w:fill="AEAAAA" w:themeFill="background2" w:themeFillShade="BF"/>
-          </w:tcPr>
-          <w:p>
-            <w:pPr>
-              <w:spacing w:after="160" w:line="278" w:lineRule="auto"/>
-              <w:rPr>
-                <w:ins w:id="148" w:author="Alex Fisher" w:date="2026-07-23T14:01:00Z"/>
-                <w:u w:val="single"/>
-                <w:lang w:val="en"/>
-              </w:rPr>
-            </w:pPr>
-          </w:p>
-        </w:tc>
-        <w:tc>
-          <w:tcPr>
-            <w:tcW w:w="766" w:type="dxa"/>
-            <w:tcBorders>
-              <w:top w:val="single" w:sz="4" w:space="0" w:color="auto"/>
-            </w:tcBorders>
-            <w:shd w:val="clear" w:color="auto" w:fill="AEAAAA" w:themeFill="background2" w:themeFillShade="BF"/>
-          </w:tcPr>
-          <w:p>
-            <w:pPr>
-              <w:spacing w:after="160" w:line="278" w:lineRule="auto"/>
-              <w:rPr>
-                <w:ins w:id="149" w:author="Alex Fisher" w:date="2026-07-23T14:01:00Z"/>
-                <w:u w:val="single"/>
-                <w:lang w:val="en"/>
-              </w:rPr>
-            </w:pPr>
-          </w:p>
-        </w:tc>
-        <w:tc>
-          <w:tcPr>
-            <w:tcW w:w="2834" w:type="dxa"/>
-            <w:tcBorders>
-              <w:top w:val="single" w:sz="4" w:space="0" w:color="auto"/>
-            </w:tcBorders>
-          </w:tcPr>
-          <w:p>
-            <w:pPr>
-              <w:rPr>
-                <w:u w:val="single"/>
-                <w:lang w:val="en"/>
-              </w:rPr>
-            </w:pPr>
-          </w:p>
-        </w:tc>
-      </w:tr>
-      <w:tr>
-        <w:trPr>
-          <w:trHeight w:val="834"/>
-          <w:ins w:id="150" w:author="Alex Fisher" w:date="2026-07-23T14:01:00Z"/>
-        </w:trPr>
-        <w:tc>
-          <w:tcPr>
-            <w:tcW w:w="1937" w:type="dxa"/>
-            <w:tcBorders>
-              <w:right w:val="single" w:sz="4" w:space="0" w:color="auto"/>
-            </w:tcBorders>
-          </w:tcPr>
-          <w:p>
-            <w:pPr>
-              <w:spacing w:after="160" w:line="278" w:lineRule="auto"/>
-              <w:rPr>
-                <w:ins w:id="151" w:author="Alex Fisher" w:date="2026-07-23T14:01:00Z"/>
-                <w:lang w:val="en"/>
-              </w:rPr>
-            </w:pPr>
-            <w:ins w:id="152" w:author="Alex Fisher" w:date="2026-07-23T14:01:00Z">
-              <w:r>
-                <w:rPr>
-                  <w:lang w:val="en"/>
-                </w:rPr>
-                <w:t>Fecal sample culturing</w:t>
-              </w:r>
-            </w:ins>
-          </w:p>
-        </w:tc>
-        <w:tc>
-          <w:tcPr>
-            <w:tcW w:w="1225" w:type="dxa"/>
-            <w:tcBorders>
-              <w:left w:val="single" w:sz="4" w:space="0" w:color="auto"/>
-            </w:tcBorders>
-            <w:shd w:val="clear" w:color="auto" w:fill="AEAAAA" w:themeFill="background2" w:themeFillShade="BF"/>
-          </w:tcPr>
-          <w:p>
-            <w:pPr>
-              <w:spacing w:after="160" w:line="278" w:lineRule="auto"/>
-              <w:rPr>
-                <w:ins w:id="153" w:author="Alex Fisher" w:date="2026-07-23T14:01:00Z"/>
-                <w:u w:val="single"/>
-                <w:lang w:val="en"/>
-              </w:rPr>
-            </w:pPr>
-          </w:p>
-        </w:tc>
-        <w:tc>
-          <w:tcPr>
-            <w:tcW w:w="1149" w:type="dxa"/>
-            <w:shd w:val="clear" w:color="auto" w:fill="AEAAAA" w:themeFill="background2" w:themeFillShade="BF"/>
-          </w:tcPr>
-          <w:p>
-            <w:pPr>
-              <w:spacing w:after="160" w:line="278" w:lineRule="auto"/>
-              <w:rPr>
-                <w:ins w:id="154" w:author="Alex Fisher" w:date="2026-07-23T14:01:00Z"/>
-                <w:u w:val="single"/>
-                <w:lang w:val="en"/>
-              </w:rPr>
-            </w:pPr>
-          </w:p>
-        </w:tc>
-        <w:tc>
-          <w:tcPr>
-            <w:tcW w:w="245" w:type="dxa"/>
-            <w:shd w:val="clear" w:color="auto" w:fill="AEAAAA" w:themeFill="background2" w:themeFillShade="BF"/>
-          </w:tcPr>
-          <w:p>
-            <w:pPr>
-              <w:spacing w:after="160" w:line="278" w:lineRule="auto"/>
-              <w:rPr>
-                <w:ins w:id="155" w:author="Alex Fisher" w:date="2026-07-23T14:01:00Z"/>
-                <w:u w:val="single"/>
-                <w:lang w:val="en"/>
-              </w:rPr>
-            </w:pPr>
-          </w:p>
-        </w:tc>
-        <w:tc>
-          <w:tcPr>
-            <w:tcW w:w="1440" w:type="dxa"/>
-            <w:shd w:val="clear" w:color="auto" w:fill="AEAAAA" w:themeFill="background2" w:themeFillShade="BF"/>
-          </w:tcPr>
-          <w:p>
-            <w:pPr>
-              <w:spacing w:after="160" w:line="278" w:lineRule="auto"/>
-              <w:rPr>
-                <w:ins w:id="156" w:author="Alex Fisher" w:date="2026-07-23T14:01:00Z"/>
-                <w:u w:val="single"/>
-                <w:lang w:val="en"/>
-              </w:rPr>
-            </w:pPr>
-          </w:p>
-        </w:tc>
-        <w:tc>
-          <w:tcPr>
-            <w:tcW w:w="1149" w:type="dxa"/>
-            <w:shd w:val="clear" w:color="auto" w:fill="AEAAAA" w:themeFill="background2" w:themeFillShade="BF"/>
-          </w:tcPr>
-          <w:p>
-            <w:pPr>
-              <w:spacing w:after="160" w:line="278" w:lineRule="auto"/>
-              <w:rPr>
-                <w:ins w:id="157" w:author="Alex Fisher" w:date="2026-07-23T14:01:00Z"/>
-                <w:u w:val="single"/>
-                <w:lang w:val="en"/>
-              </w:rPr>
-            </w:pPr>
-          </w:p>
-        </w:tc>
-        <w:tc>
-          <w:tcPr>
-            <w:tcW w:w="766" w:type="dxa"/>
-            <w:shd w:val="clear" w:color="auto" w:fill="AEAAAA" w:themeFill="background2" w:themeFillShade="BF"/>
-          </w:tcPr>
-          <w:p>
-            <w:pPr>
-              <w:spacing w:after="160" w:line="278" w:lineRule="auto"/>
-              <w:rPr>
-                <w:ins w:id="158" w:author="Alex Fisher" w:date="2026-07-23T14:01:00Z"/>
-                <w:u w:val="single"/>
-                <w:lang w:val="en"/>
-              </w:rPr>
-            </w:pPr>
-          </w:p>
-        </w:tc>
-        <w:tc>
-          <w:tcPr>
-            <w:tcW w:w="2834" w:type="dxa"/>
-          </w:tcPr>
-          <w:p>
-            <w:pPr>
-              <w:rPr>
-                <w:u w:val="single"/>
-                <w:lang w:val="en"/>
-              </w:rPr>
-            </w:pPr>
-          </w:p>
-        </w:tc>
-      </w:tr>
-      <w:tr>
-        <w:trPr>
-          <w:trHeight w:val="516"/>
-          <w:ins w:id="159" w:author="Alex Fisher" w:date="2026-07-23T14:01:00Z"/>
-        </w:trPr>
-        <w:tc>
-          <w:tcPr>
-            <w:tcW w:w="1937" w:type="dxa"/>
-            <w:tcBorders>
-              <w:right w:val="single" w:sz="4" w:space="0" w:color="auto"/>
-            </w:tcBorders>
-          </w:tcPr>
-          <w:p>
-            <w:pPr>
-              <w:spacing w:after="160" w:line="278" w:lineRule="auto"/>
-              <w:rPr>
-                <w:ins w:id="160" w:author="Alex Fisher" w:date="2026-07-23T14:01:00Z"/>
-                <w:lang w:val="en"/>
-              </w:rPr>
-            </w:pPr>
-            <w:ins w:id="161" w:author="Alex Fisher" w:date="2026-07-23T14:01:00Z">
-              <w:r>
-                <w:rPr>
-                  <w:lang w:val="en"/>
-                </w:rPr>
-                <w:t>DNA extraction</w:t>
-              </w:r>
-            </w:ins>
-          </w:p>
-        </w:tc>
-        <w:tc>
-          <w:tcPr>
-            <w:tcW w:w="1225" w:type="dxa"/>
-            <w:tcBorders>
-              <w:left w:val="single" w:sz="4" w:space="0" w:color="auto"/>
-            </w:tcBorders>
-          </w:tcPr>
-          <w:p>
-            <w:pPr>
-              <w:spacing w:after="160" w:line="278" w:lineRule="auto"/>
-              <w:rPr>
-                <w:ins w:id="162" w:author="Alex Fisher" w:date="2026-07-23T14:01:00Z"/>
-                <w:u w:val="single"/>
-                <w:lang w:val="en"/>
-              </w:rPr>
-            </w:pPr>
-          </w:p>
-        </w:tc>
-        <w:tc>
-          <w:tcPr>
-            <w:tcW w:w="1149" w:type="dxa"/>
-          </w:tcPr>
-          <w:p>
-            <w:pPr>
-              <w:spacing w:after="160" w:line="278" w:lineRule="auto"/>
-              <w:rPr>
-                <w:ins w:id="163" w:author="Alex Fisher" w:date="2026-07-23T14:01:00Z"/>
-                <w:u w:val="single"/>
-                <w:lang w:val="en"/>
-              </w:rPr>
-            </w:pPr>
-          </w:p>
-        </w:tc>
-        <w:tc>
-          <w:tcPr>
-            <w:tcW w:w="245" w:type="dxa"/>
-          </w:tcPr>
-          <w:p>
-            <w:pPr>
-              <w:spacing w:after="160" w:line="278" w:lineRule="auto"/>
-              <w:rPr>
-                <w:ins w:id="164" w:author="Alex Fisher" w:date="2026-07-23T14:01:00Z"/>
-                <w:u w:val="single"/>
-                <w:lang w:val="en"/>
-              </w:rPr>
-            </w:pPr>
-          </w:p>
-        </w:tc>
-        <w:tc>
-          <w:tcPr>
-            <w:tcW w:w="1440" w:type="dxa"/>
-          </w:tcPr>
-          <w:p>
-            <w:pPr>
-              <w:spacing w:after="160" w:line="278" w:lineRule="auto"/>
-              <w:rPr>
-                <w:ins w:id="165" w:author="Alex Fisher" w:date="2026-07-23T14:01:00Z"/>
-                <w:u w:val="single"/>
-                <w:lang w:val="en"/>
-              </w:rPr>
-            </w:pPr>
-          </w:p>
-        </w:tc>
-        <w:tc>
-          <w:tcPr>
-            <w:tcW w:w="1149" w:type="dxa"/>
-          </w:tcPr>
-          <w:p>
-            <w:pPr>
-              <w:spacing w:after="160" w:line="278" w:lineRule="auto"/>
-              <w:rPr>
-                <w:ins w:id="166" w:author="Alex Fisher" w:date="2026-07-23T14:01:00Z"/>
-                <w:u w:val="single"/>
-                <w:lang w:val="en"/>
-              </w:rPr>
-            </w:pPr>
-          </w:p>
-        </w:tc>
-        <w:tc>
-          <w:tcPr>
-            <w:tcW w:w="766" w:type="dxa"/>
-            <w:shd w:val="clear" w:color="auto" w:fill="AEAAAA" w:themeFill="background2" w:themeFillShade="BF"/>
-          </w:tcPr>
-          <w:p>
-            <w:pPr>
-              <w:spacing w:after="160" w:line="278" w:lineRule="auto"/>
-              <w:rPr>
-                <w:ins w:id="167" w:author="Alex Fisher" w:date="2026-07-23T14:01:00Z"/>
-                <w:u w:val="single"/>
-                <w:lang w:val="en"/>
-              </w:rPr>
-            </w:pPr>
-          </w:p>
-        </w:tc>
-        <w:tc>
-          <w:tcPr>
-            <w:tcW w:w="2834" w:type="dxa"/>
-            <w:shd w:val="clear" w:color="auto" w:fill="AEAAAA" w:themeFill="background2" w:themeFillShade="BF"/>
-          </w:tcPr>
-          <w:p>
-            <w:pPr>
-              <w:rPr>
-                <w:u w:val="single"/>
-                <w:lang w:val="en"/>
-              </w:rPr>
-            </w:pPr>
-          </w:p>
-        </w:tc>
-      </w:tr>
-      <w:tr>
-        <w:trPr>
-          <w:trHeight w:val="834"/>
-          <w:ins w:id="168" w:author="Alex Fisher" w:date="2026-07-23T14:01:00Z"/>
-        </w:trPr>
-        <w:tc>
-          <w:tcPr>
-            <w:tcW w:w="1937" w:type="dxa"/>
-            <w:tcBorders>
-              <w:right w:val="single" w:sz="4" w:space="0" w:color="auto"/>
-            </w:tcBorders>
-          </w:tcPr>
-          <w:p>
-            <w:pPr>
-              <w:spacing w:after="160" w:line="278" w:lineRule="auto"/>
-              <w:rPr>
-                <w:ins w:id="169" w:author="Alex Fisher" w:date="2026-07-23T14:01:00Z"/>
-                <w:lang w:val="en"/>
-              </w:rPr>
-            </w:pPr>
-            <w:ins w:id="170" w:author="Alex Fisher" w:date="2026-07-23T14:01:00Z">
-              <w:r>
-                <w:rPr>
-                  <w:lang w:val="en"/>
-                </w:rPr>
-                <w:t>Whole genome sequencing</w:t>
-              </w:r>
-            </w:ins>
-          </w:p>
-        </w:tc>
-        <w:tc>
-          <w:tcPr>
-            <w:tcW w:w="1225" w:type="dxa"/>
-            <w:tcBorders>
-              <w:left w:val="single" w:sz="4" w:space="0" w:color="auto"/>
-            </w:tcBorders>
-          </w:tcPr>
-          <w:p>
-            <w:pPr>
-              <w:spacing w:after="160" w:line="278" w:lineRule="auto"/>
-              <w:rPr>
-                <w:ins w:id="171" w:author="Alex Fisher" w:date="2026-07-23T14:01:00Z"/>
-                <w:u w:val="single"/>
-                <w:lang w:val="en"/>
-              </w:rPr>
-            </w:pPr>
-          </w:p>
-        </w:tc>
-        <w:tc>
-          <w:tcPr>
-            <w:tcW w:w="1149" w:type="dxa"/>
-          </w:tcPr>
-          <w:p>
-            <w:pPr>
-              <w:spacing w:after="160" w:line="278" w:lineRule="auto"/>
-              <w:rPr>
-                <w:ins w:id="172" w:author="Alex Fisher" w:date="2026-07-23T14:01:00Z"/>
-                <w:u w:val="single"/>
-                <w:lang w:val="en"/>
-              </w:rPr>
-            </w:pPr>
-          </w:p>
-        </w:tc>
-        <w:tc>
-          <w:tcPr>
-            <w:tcW w:w="245" w:type="dxa"/>
-          </w:tcPr>
-          <w:p>
-            <w:pPr>
-              <w:spacing w:after="160" w:line="278" w:lineRule="auto"/>
-              <w:rPr>
-                <w:ins w:id="173" w:author="Alex Fisher" w:date="2026-07-23T14:01:00Z"/>
-                <w:u w:val="single"/>
-                <w:lang w:val="en"/>
-              </w:rPr>
-            </w:pPr>
-          </w:p>
-        </w:tc>
-        <w:tc>
-          <w:tcPr>
-            <w:tcW w:w="1440" w:type="dxa"/>
-          </w:tcPr>
-          <w:p>
-            <w:pPr>
-              <w:spacing w:after="160" w:line="278" w:lineRule="auto"/>
-              <w:rPr>
-                <w:ins w:id="174" w:author="Alex Fisher" w:date="2026-07-23T14:01:00Z"/>
-                <w:u w:val="single"/>
-                <w:lang w:val="en"/>
-              </w:rPr>
-            </w:pPr>
-          </w:p>
-        </w:tc>
-        <w:tc>
-          <w:tcPr>
-            <w:tcW w:w="1149" w:type="dxa"/>
-          </w:tcPr>
-          <w:p>
-            <w:pPr>
-              <w:spacing w:after="160" w:line="278" w:lineRule="auto"/>
-              <w:rPr>
-                <w:ins w:id="175" w:author="Alex Fisher" w:date="2026-07-23T14:01:00Z"/>
-                <w:u w:val="single"/>
-                <w:lang w:val="en"/>
-              </w:rPr>
-            </w:pPr>
-          </w:p>
-        </w:tc>
-        <w:tc>
-          <w:tcPr>
-            <w:tcW w:w="766" w:type="dxa"/>
-            <w:shd w:val="clear" w:color="auto" w:fill="AEAAAA" w:themeFill="background2" w:themeFillShade="BF"/>
-          </w:tcPr>
-          <w:p>
-            <w:pPr>
-              <w:spacing w:after="160" w:line="278" w:lineRule="auto"/>
-              <w:rPr>
-                <w:ins w:id="176" w:author="Alex Fisher" w:date="2026-07-23T14:01:00Z"/>
-                <w:u w:val="single"/>
-                <w:lang w:val="en"/>
-              </w:rPr>
-            </w:pPr>
-          </w:p>
-        </w:tc>
-        <w:tc>
-          <w:tcPr>
-            <w:tcW w:w="2834" w:type="dxa"/>
-            <w:shd w:val="clear" w:color="auto" w:fill="AEAAAA" w:themeFill="background2" w:themeFillShade="BF"/>
-          </w:tcPr>
-          <w:p>
-            <w:pPr>
-              <w:rPr>
-                <w:u w:val="single"/>
-                <w:lang w:val="en"/>
-              </w:rPr>
-            </w:pPr>
-          </w:p>
-        </w:tc>
-      </w:tr>
-      <w:tr>
-        <w:trPr>
-          <w:trHeight w:val="516"/>
-          <w:ins w:id="177" w:author="Alex Fisher" w:date="2026-07-23T14:01:00Z"/>
-        </w:trPr>
-        <w:tc>
-          <w:tcPr>
-            <w:tcW w:w="1937" w:type="dxa"/>
-            <w:tcBorders>
-              <w:right w:val="single" w:sz="4" w:space="0" w:color="auto"/>
-            </w:tcBorders>
-          </w:tcPr>
-          <w:p>
-            <w:pPr>
-              <w:spacing w:after="160" w:line="278" w:lineRule="auto"/>
-              <w:rPr>
-                <w:ins w:id="178" w:author="Alex Fisher" w:date="2026-07-23T14:01:00Z"/>
-                <w:lang w:val="en"/>
-              </w:rPr>
-            </w:pPr>
-            <w:ins w:id="179" w:author="Alex Fisher" w:date="2026-07-23T14:01:00Z">
-              <w:r>
-                <w:rPr>
-                  <w:lang w:val="en"/>
-                </w:rPr>
-                <w:t>Analysis</w:t>
-              </w:r>
-            </w:ins>
-          </w:p>
-        </w:tc>
-        <w:tc>
-          <w:tcPr>
-            <w:tcW w:w="1225" w:type="dxa"/>
-            <w:tcBorders>
-              <w:left w:val="single" w:sz="4" w:space="0" w:color="auto"/>
-            </w:tcBorders>
-          </w:tcPr>
-          <w:p>
-            <w:pPr>
-              <w:spacing w:after="160" w:line="278" w:lineRule="auto"/>
-              <w:rPr>
-                <w:ins w:id="180" w:author="Alex Fisher" w:date="2026-07-23T14:01:00Z"/>
-                <w:u w:val="single"/>
-                <w:lang w:val="en"/>
-              </w:rPr>
-            </w:pPr>
-          </w:p>
-        </w:tc>
-        <w:tc>
-          <w:tcPr>
-            <w:tcW w:w="1149" w:type="dxa"/>
-          </w:tcPr>
-          <w:p>
-            <w:pPr>
-              <w:spacing w:after="160" w:line="278" w:lineRule="auto"/>
-              <w:rPr>
-                <w:ins w:id="181" w:author="Alex Fisher" w:date="2026-07-23T14:01:00Z"/>
-                <w:u w:val="single"/>
-                <w:lang w:val="en"/>
-              </w:rPr>
-            </w:pPr>
-          </w:p>
-        </w:tc>
-        <w:tc>
-          <w:tcPr>
-            <w:tcW w:w="245" w:type="dxa"/>
-          </w:tcPr>
-          <w:p>
-            <w:pPr>
-              <w:spacing w:after="160" w:line="278" w:lineRule="auto"/>
-              <w:rPr>
-                <w:ins w:id="182" w:author="Alex Fisher" w:date="2026-07-23T14:01:00Z"/>
-                <w:u w:val="single"/>
-                <w:lang w:val="en"/>
-              </w:rPr>
-            </w:pPr>
-          </w:p>
-        </w:tc>
-        <w:tc>
-          <w:tcPr>
-            <w:tcW w:w="1440" w:type="dxa"/>
-            <w:shd w:val="clear" w:color="auto" w:fill="AEAAAA" w:themeFill="background2" w:themeFillShade="BF"/>
-          </w:tcPr>
-          <w:p>
-            <w:pPr>
-              <w:spacing w:after="160" w:line="278" w:lineRule="auto"/>
-              <w:rPr>
-                <w:ins w:id="183" w:author="Alex Fisher" w:date="2026-07-23T14:01:00Z"/>
-                <w:u w:val="single"/>
-                <w:lang w:val="en"/>
-              </w:rPr>
-            </w:pPr>
-          </w:p>
-        </w:tc>
-        <w:tc>
-          <w:tcPr>
-            <w:tcW w:w="1149" w:type="dxa"/>
-            <w:shd w:val="clear" w:color="auto" w:fill="AEAAAA" w:themeFill="background2" w:themeFillShade="BF"/>
-          </w:tcPr>
-          <w:p>
-            <w:pPr>
-              <w:spacing w:after="160" w:line="278" w:lineRule="auto"/>
-              <w:rPr>
-                <w:ins w:id="184" w:author="Alex Fisher" w:date="2026-07-23T14:01:00Z"/>
-                <w:u w:val="single"/>
-                <w:lang w:val="en"/>
-              </w:rPr>
-            </w:pPr>
-          </w:p>
-        </w:tc>
-        <w:tc>
-          <w:tcPr>
-            <w:tcW w:w="766" w:type="dxa"/>
-            <w:shd w:val="clear" w:color="auto" w:fill="AEAAAA" w:themeFill="background2" w:themeFillShade="BF"/>
-          </w:tcPr>
-          <w:p>
-            <w:pPr>
-              <w:spacing w:after="160" w:line="278" w:lineRule="auto"/>
-              <w:rPr>
-                <w:ins w:id="185" w:author="Alex Fisher" w:date="2026-07-23T14:01:00Z"/>
-                <w:u w:val="single"/>
-                <w:lang w:val="en"/>
-              </w:rPr>
-            </w:pPr>
-          </w:p>
-        </w:tc>
-        <w:tc>
-          <w:tcPr>
-            <w:tcW w:w="2834" w:type="dxa"/>
-            <w:shd w:val="clear" w:color="auto" w:fill="AEAAAA" w:themeFill="background2" w:themeFillShade="BF"/>
-          </w:tcPr>
-          <w:p>
-            <w:pPr>
-              <w:rPr>
-                <w:u w:val="single"/>
-                <w:lang w:val="en"/>
-              </w:rPr>
-            </w:pPr>
-          </w:p>
-        </w:tc>
-      </w:tr>
-      <w:tr>
-        <w:trPr>
-          <w:trHeight w:val="475"/>
-          <w:ins w:id="186" w:author="Alex Fisher" w:date="2026-07-23T14:01:00Z"/>
-        </w:trPr>
-        <w:tc>
-          <w:tcPr>
-            <w:tcW w:w="1937" w:type="dxa"/>
-            <w:tcBorders>
-              <w:bottom w:val="single" w:sz="4" w:space="0" w:color="auto"/>
-              <w:right w:val="single" w:sz="4" w:space="0" w:color="auto"/>
-            </w:tcBorders>
-          </w:tcPr>
-          <w:p>
-            <w:pPr>
-              <w:spacing w:after="160" w:line="278" w:lineRule="auto"/>
-              <w:rPr>
-                <w:ins w:id="187" w:author="Alex Fisher" w:date="2026-07-23T14:01:00Z"/>
-                <w:lang w:val="en"/>
-              </w:rPr>
-            </w:pPr>
-            <w:ins w:id="188" w:author="Alex Fisher" w:date="2026-07-23T14:01:00Z">
-              <w:r>
-                <w:rPr>
-                  <w:lang w:val="en"/>
-                </w:rPr>
-                <w:t>Writing</w:t>
-              </w:r>
-            </w:ins>
-          </w:p>
-        </w:tc>
-        <w:tc>
-          <w:tcPr>
-            <w:tcW w:w="1225" w:type="dxa"/>
-            <w:tcBorders>
-              <w:left w:val="single" w:sz="4" w:space="0" w:color="auto"/>
-            </w:tcBorders>
-          </w:tcPr>
-          <w:p>
-            <w:pPr>
-              <w:spacing w:after="160" w:line="278" w:lineRule="auto"/>
-              <w:rPr>
-                <w:ins w:id="189" w:author="Alex Fisher" w:date="2026-07-23T14:01:00Z"/>
-                <w:u w:val="single"/>
-                <w:lang w:val="en"/>
-              </w:rPr>
-            </w:pPr>
-          </w:p>
-        </w:tc>
-        <w:tc>
-          <w:tcPr>
-            <w:tcW w:w="1149" w:type="dxa"/>
-          </w:tcPr>
-          <w:p>
-            <w:pPr>
-              <w:spacing w:after="160" w:line="278" w:lineRule="auto"/>
-              <w:rPr>
-                <w:ins w:id="190" w:author="Alex Fisher" w:date="2026-07-23T14:01:00Z"/>
-                <w:u w:val="single"/>
-                <w:lang w:val="en"/>
-              </w:rPr>
-            </w:pPr>
-          </w:p>
-        </w:tc>
-        <w:tc>
-          <w:tcPr>
-            <w:tcW w:w="245" w:type="dxa"/>
-          </w:tcPr>
-          <w:p>
-            <w:pPr>
-              <w:spacing w:after="160" w:line="278" w:lineRule="auto"/>
-              <w:rPr>
-                <w:ins w:id="191" w:author="Alex Fisher" w:date="2026-07-23T14:01:00Z"/>
-                <w:u w:val="single"/>
-                <w:lang w:val="en"/>
-              </w:rPr>
-            </w:pPr>
-          </w:p>
-        </w:tc>
-        <w:tc>
-          <w:tcPr>
-            <w:tcW w:w="1440" w:type="dxa"/>
-            <w:shd w:val="clear" w:color="auto" w:fill="AEAAAA" w:themeFill="background2" w:themeFillShade="BF"/>
-          </w:tcPr>
-          <w:p>
-            <w:pPr>
-              <w:spacing w:after="160" w:line="278" w:lineRule="auto"/>
-              <w:rPr>
-                <w:ins w:id="192" w:author="Alex Fisher" w:date="2026-07-23T14:01:00Z"/>
-                <w:u w:val="single"/>
-                <w:lang w:val="en"/>
-              </w:rPr>
-            </w:pPr>
-          </w:p>
-        </w:tc>
-        <w:tc>
-          <w:tcPr>
-            <w:tcW w:w="1149" w:type="dxa"/>
-            <w:shd w:val="clear" w:color="auto" w:fill="AEAAAA" w:themeFill="background2" w:themeFillShade="BF"/>
-          </w:tcPr>
-          <w:p>
-            <w:pPr>
-              <w:spacing w:after="160" w:line="278" w:lineRule="auto"/>
-              <w:rPr>
-                <w:ins w:id="193" w:author="Alex Fisher" w:date="2026-07-23T14:01:00Z"/>
-                <w:u w:val="single"/>
-                <w:lang w:val="en"/>
-              </w:rPr>
-            </w:pPr>
-          </w:p>
-        </w:tc>
-        <w:tc>
-          <w:tcPr>
-            <w:tcW w:w="766" w:type="dxa"/>
-            <w:shd w:val="clear" w:color="auto" w:fill="AEAAAA" w:themeFill="background2" w:themeFillShade="BF"/>
-          </w:tcPr>
-          <w:p>
-            <w:pPr>
-              <w:spacing w:after="160" w:line="278" w:lineRule="auto"/>
-              <w:rPr>
-                <w:ins w:id="194" w:author="Alex Fisher" w:date="2026-07-23T14:01:00Z"/>
-                <w:u w:val="single"/>
-                <w:lang w:val="en"/>
-              </w:rPr>
-            </w:pPr>
-          </w:p>
-        </w:tc>
-        <w:tc>
-          <w:tcPr>
-            <w:tcW w:w="2834" w:type="dxa"/>
-            <w:shd w:val="clear" w:color="auto" w:fill="AEAAAA" w:themeFill="background2" w:themeFillShade="BF"/>
-          </w:tcPr>
-          <w:p>
-            <w:pPr>
-              <w:rPr>
-                <w:u w:val="single"/>
-                <w:lang w:val="en"/>
-              </w:rPr>
-            </w:pPr>
-          </w:p>
-        </w:tc>
-      </w:tr>
-    </w:tbl>
     <w:p/>
     <w:sectPr>
       <w:pgSz w:w="12240" w:h="15840"/>
@@ -4754,8 +3783,8 @@
 </file>
 
 <file path=word/comments.xml><?xml version="1.0" encoding="utf-8"?>
-<w:comments xmlns:wpc="http://schemas.microsoft.com/office/word/2010/wordprocessingCanvas" xmlns:cx="http://schemas.microsoft.com/office/drawing/2014/chartex" xmlns:cx1="http://schemas.microsoft.com/office/drawing/2015/9/8/chartex" xmlns:cx2="http://schemas.microsoft.com/office/drawing/2015/10/21/chartex" xmlns:cx3="http://schemas.microsoft.com/office/drawing/2016/5/9/chartex" xmlns:cx4="http://schemas.microsoft.com/office/drawing/2016/5/10/chartex" xmlns:cx5="http://schemas.microsoft.com/office/drawing/2016/5/11/chartex" xmlns:cx6="http://schemas.microsoft.com/office/drawing/2016/5/12/chartex" xmlns:cx7="http://schemas.microsoft.com/office/drawing/2016/5/13/chartex" xmlns:cx8="http://schemas.microsoft.com/office/drawing/2016/5/14/chartex" xmlns:mc="http://schemas.openxmlformats.org/markup-compatibility/2006" xmlns:m="http://schemas.openxmlformats.org/officeDocument/2006/math" xmlns:aink="http://schemas.microsoft.com/office/drawing/2016/ink" xmlns:am3d="http://schemas.microsoft.com/office/drawing/2017/model3d" xmlns:oel="http://schemas.microsoft.com/office/2019/extlst" xmlns:r="http://schemas.openxmlformats.org/officeDocument/2006/relationships" xmlns:wp14="http://schemas.microsoft.com/office/word/2010/wordprocessingDrawing" xmlns:wp="http://schemas.openxmlformats.org/drawingml/2006/wordprocessingDrawing" xmlns:wpg="http://schemas.microsoft.com/office/word/2010/wordprocessingGroup" xmlns:wpi="http://schemas.microsoft.com/office/word/2010/wordprocessingInk" xmlns:wps="http://schemas.microsoft.com/office/word/2010/wordprocessingShape" xmlns:o="urn:schemas-microsoft-com:office:office" xmlns:v="urn:schemas-microsoft-com:vml" xmlns:w10="urn:schemas-microsoft-com:office:word" xmlns:w="http://schemas.openxmlformats.org/wordprocessingml/2006/main" xmlns:w14="http://schemas.microsoft.com/office/word/2010/wordml" xmlns:w15="http://schemas.microsoft.com/office/word/2012/wordml" xmlns:w16cei="http://schemas.microsoft.com/office/word/2026/wordml/cei" xmlns:w16cex="http://schemas.microsoft.com/office/word/2018/wordml/cex" xmlns:w16cid="http://schemas.microsoft.com/office/word/2016/wordml/cid" xmlns:w16="http://schemas.microsoft.com/office/word/2018/wordml" xmlns:w16sdtdh="http://schemas.microsoft.com/office/word/2020/wordml/sdtdatahash" xmlns:w16sdtfl="http://schemas.microsoft.com/office/word/2024/wordml/sdtformatlock" xmlns:w16se="http://schemas.microsoft.com/office/word/2015/wordml/symex" xmlns:w16du="http://schemas.microsoft.com/office/word/2023/wordml/word16du" xmlns:wne="http://schemas.microsoft.com/office/word/2006/wordml" mc:Ignorable="w14 w15 w16se w16cid w16 w16cex w16sdtdh w16sdtfl w16du wp14">
-  <w:comment w:id="12" w:author="Kelsey McCune" w:date="2026-04-01T09:59:00Z" w:initials="KBM">
+<w:comments xmlns:wpc="http://schemas.microsoft.com/office/word/2010/wordprocessingCanvas" xmlns:cx="http://schemas.microsoft.com/office/drawing/2014/chartex" xmlns:cx1="http://schemas.microsoft.com/office/drawing/2015/9/8/chartex" xmlns:cx2="http://schemas.microsoft.com/office/drawing/2015/10/21/chartex" xmlns:cx3="http://schemas.microsoft.com/office/drawing/2016/5/9/chartex" xmlns:cx4="http://schemas.microsoft.com/office/drawing/2016/5/10/chartex" xmlns:cx5="http://schemas.microsoft.com/office/drawing/2016/5/11/chartex" xmlns:cx6="http://schemas.microsoft.com/office/drawing/2016/5/12/chartex" xmlns:cx7="http://schemas.microsoft.com/office/drawing/2016/5/13/chartex" xmlns:cx8="http://schemas.microsoft.com/office/drawing/2016/5/14/chartex" xmlns:mc="http://schemas.openxmlformats.org/markup-compatibility/2006" xmlns:m="http://schemas.openxmlformats.org/officeDocument/2006/math" xmlns:aink="http://schemas.microsoft.com/office/drawing/2016/ink" xmlns:am3d="http://schemas.microsoft.com/office/drawing/2017/model3d" xmlns:oel="http://schemas.microsoft.com/office/2019/extlst" xmlns:r="http://schemas.openxmlformats.org/officeDocument/2006/relationships" xmlns:wp14="http://schemas.microsoft.com/office/word/2010/wordprocessingDrawing" xmlns:wp="http://schemas.openxmlformats.org/drawingml/2006/wordprocessingDrawing" xmlns:wpg="http://schemas.microsoft.com/office/word/2010/wordprocessingGroup" xmlns:wpi="http://schemas.microsoft.com/office/word/2010/wordprocessingInk" xmlns:wps="http://schemas.microsoft.com/office/word/2010/wordprocessingShape" xmlns:o="urn:schemas-microsoft-com:office:office" xmlns:v="urn:schemas-microsoft-com:vml" xmlns:w10="urn:schemas-microsoft-com:office:word" xmlns:w="http://schemas.openxmlformats.org/wordprocessingml/2006/main" xmlns:w14="http://schemas.microsoft.com/office/word/2010/wordml" xmlns:w15="http://schemas.microsoft.com/office/word/2012/wordml" xmlns:w16cex="http://schemas.microsoft.com/office/word/2018/wordml/cex" xmlns:w16cid="http://schemas.microsoft.com/office/word/2016/wordml/cid" xmlns:w16="http://schemas.microsoft.com/office/word/2018/wordml" xmlns:w16sdtdh="http://schemas.microsoft.com/office/word/2020/wordml/sdtdatahash" xmlns:w16sdtfl="http://schemas.microsoft.com/office/word/2024/wordml/sdtformatlock" xmlns:w16se="http://schemas.microsoft.com/office/word/2015/wordml/symex" xmlns:w16du="http://schemas.microsoft.com/office/word/2023/wordml/word16du" xmlns:wne="http://schemas.microsoft.com/office/word/2006/wordml" mc:Ignorable="w14 w15 w16se w16cid w16 w16cex w16sdtdh w16sdtfl w16du wp14">
+  <w:comment w:id="12" w:author="Alex Fisher" w:date="2026-08-13T14:20:00Z" w:initials="AF">
     <w:p>
       <w:r>
         <w:rPr>
@@ -4768,11 +3797,11 @@
           <w:sz w:val="20"/>
           <w:szCs w:val="20"/>
         </w:rPr>
-        <w:t>I think an important way to frame the risk of chickens (and other domestic animals) is that they are a bridge species for zoonotic disease between wildlife and humans. Check out the Gamble et al., 2023 &amp; Hassel et al., 2017 papers I added to your GitHub</w:t>
+        <w:t xml:space="preserve">Need to find appropriate places for these sentences </w:t>
       </w:r>
     </w:p>
   </w:comment>
-  <w:comment w:id="18" w:author="Kelsey McCune" w:date="2026-03-24T09:01:00Z" w:initials="KBM">
+  <w:comment w:id="13" w:author="Kelsey McCune" w:date="2026-04-01T09:59:00Z" w:initials="KBM">
     <w:p>
       <w:r>
         <w:rPr>
@@ -4785,11 +3814,11 @@
           <w:sz w:val="20"/>
           <w:szCs w:val="20"/>
         </w:rPr>
-        <w:t xml:space="preserve">Yes, this is the general content that is needed for the last paragraph. We will tweak this paragraph more as we refine the rest of the intro, but one thing to think about is why is the southeastern US the right place to fill this gap in knowledge? </w:t>
+        <w:t>I think an important way to frame the risk of chickens (and other domestic animals) is that they are a bridge species for zoonotic disease between wildlife and humans. Check out the Gamble et al., 2023 &amp; Hassel et al., 2017 papers I added to your GitHub</w:t>
       </w:r>
     </w:p>
   </w:comment>
-  <w:comment w:id="19" w:author="Alex Fisher" w:date="2026-03-24T11:25:00Z" w:initials="AF">
+  <w:comment w:id="19" w:author="Kelsey McCune" w:date="2026-03-24T09:01:00Z" w:initials="KBM">
     <w:p>
       <w:r>
         <w:rPr>
@@ -4802,11 +3831,11 @@
           <w:sz w:val="20"/>
           <w:szCs w:val="20"/>
         </w:rPr>
-        <w:t xml:space="preserve">high seasonal condition variation, lots of agriculture, wildlife interest groups and suburban sprawl. </w:t>
+        <w:t xml:space="preserve">Yes, this is the general content that is needed for the last paragraph. We will tweak this paragraph more as we refine the rest of the intro, but one thing to think about is why is the southeastern US the right place to fill this gap in knowledge? </w:t>
       </w:r>
     </w:p>
   </w:comment>
-  <w:comment w:id="20" w:author="Kelsey McCune" w:date="2026-04-01T11:08:00Z" w:initials="KBM">
+  <w:comment w:id="20" w:author="Alex Fisher" w:date="2026-03-24T11:25:00Z" w:initials="AF">
     <w:p>
       <w:r>
         <w:rPr>
@@ -4819,11 +3848,11 @@
           <w:sz w:val="20"/>
           <w:szCs w:val="20"/>
         </w:rPr>
-        <w:t>Awesome, this is all great support for why the southeast is an ideal focal region. I think you should break this up into multiple sentences though and provide citations for each.  You can use the Welch et al 2019 salmonella paper that I added to your GitHub. I also added one (Harrigan et al 2014) on WNV and predicted climate change because it shows AL getting warmer, which according to the Welch paper will also help salmonella persist.</w:t>
+        <w:t xml:space="preserve">high seasonal condition variation, lots of agriculture, wildlife interest groups and suburban sprawl. </w:t>
       </w:r>
     </w:p>
   </w:comment>
-  <w:comment w:id="31" w:author="Kelsey McCune" w:date="2026-03-24T09:02:00Z" w:initials="KBM">
+  <w:comment w:id="21" w:author="Kelsey McCune" w:date="2026-04-01T11:08:00Z" w:initials="KBM">
     <w:p>
       <w:r>
         <w:rPr>
@@ -4836,11 +3865,11 @@
           <w:sz w:val="20"/>
           <w:szCs w:val="20"/>
         </w:rPr>
-        <w:t xml:space="preserve">Now at the end of the intro consider whether you have given enough information to set up all aspects of your research? </w:t>
+        <w:t>Awesome, this is all great support for why the southeast is an ideal focal region. I think you should break this up into multiple sentences though and provide citations for each.  You can use the Welch et al 2019 salmonella paper that I added to your GitHub. I also added one (Harrigan et al 2014) on WNV and predicted climate change because it shows AL getting warmer, which according to the Welch paper will also help salmonella persist.</w:t>
       </w:r>
     </w:p>
   </w:comment>
-  <w:comment w:id="32" w:author="Alex Fisher" w:date="2026-07-09T11:44:00Z" w:initials="AF">
+  <w:comment w:id="32" w:author="Kelsey McCune" w:date="2026-03-24T09:02:00Z" w:initials="KBM">
     <w:p>
       <w:r>
         <w:rPr>
@@ -4853,11 +3882,11 @@
           <w:sz w:val="20"/>
           <w:szCs w:val="20"/>
         </w:rPr>
-        <w:t>Need human dimensions, salmonella serotype variation/infection, contact frequency and bird density vs infection rates at feeders.</w:t>
+        <w:t xml:space="preserve">Now at the end of the intro consider whether you have given enough information to set up all aspects of your research? </w:t>
       </w:r>
     </w:p>
   </w:comment>
-  <w:comment w:id="33" w:author="Alex Fisher" w:date="2026-07-09T11:49:00Z" w:initials="AF">
+  <w:comment w:id="33" w:author="Alex Fisher" w:date="2026-07-09T11:44:00Z" w:initials="AF">
     <w:p>
       <w:r>
         <w:rPr>
@@ -4870,11 +3899,11 @@
           <w:sz w:val="20"/>
           <w:szCs w:val="20"/>
         </w:rPr>
-        <w:t xml:space="preserve">collect sources and add citations </w:t>
+        <w:t>Need human dimensions, salmonella serotype variation/infection, contact frequency and bird density vs infection rates at feeders.</w:t>
       </w:r>
     </w:p>
   </w:comment>
-  <w:comment w:id="34" w:author="Alex Fisher" w:date="2026-07-02T12:21:00Z" w:initials="AF">
+  <w:comment w:id="34" w:author="Alex Fisher" w:date="2026-07-09T11:49:00Z" w:initials="AF">
     <w:p>
       <w:r>
         <w:rPr>
@@ -4887,11 +3916,11 @@
           <w:sz w:val="20"/>
           <w:szCs w:val="20"/>
         </w:rPr>
-        <w:t>Maybe a new title for this section?</w:t>
+        <w:t xml:space="preserve">collect sources and add citations </w:t>
       </w:r>
     </w:p>
   </w:comment>
-  <w:comment w:id="67" w:author="Kelsey McCune" w:date="2026-07-09T09:34:00Z" w:initials="KBM">
+  <w:comment w:id="35" w:author="Alex Fisher" w:date="2026-08-13T14:22:00Z" w:initials="AF">
     <w:p>
       <w:r>
         <w:rPr>
@@ -4904,11 +3933,11 @@
           <w:sz w:val="20"/>
           <w:szCs w:val="20"/>
         </w:rPr>
-        <w:t>It occurs to me here that we also need some details in the intro paragraph about these human dimensions concepts.</w:t>
+        <w:t xml:space="preserve">Need to find appropriate places for these sentences </w:t>
       </w:r>
     </w:p>
   </w:comment>
-  <w:comment w:id="69" w:author="Kelsey McCune" w:date="2026-07-09T09:37:00Z" w:initials="KBM">
+  <w:comment w:id="36" w:author="Alex Fisher" w:date="2026-07-02T12:21:00Z" w:initials="AF">
     <w:p>
       <w:r>
         <w:rPr>
@@ -4921,11 +3950,11 @@
           <w:sz w:val="20"/>
           <w:szCs w:val="20"/>
         </w:rPr>
-        <w:t>I'm not sure what you mean by evidence-based promotions.</w:t>
+        <w:t>Maybe a new title for this section?</w:t>
       </w:r>
     </w:p>
   </w:comment>
-  <w:comment w:id="74" w:author="Alex Fisher" w:date="2026-07-02T12:03:00Z" w:initials="AF">
+  <w:comment w:id="69" w:author="Kelsey McCune" w:date="2026-07-09T09:34:00Z" w:initials="KBM">
     <w:p>
       <w:r>
         <w:rPr>
@@ -4938,11 +3967,11 @@
           <w:sz w:val="20"/>
           <w:szCs w:val="20"/>
         </w:rPr>
-        <w:t xml:space="preserve">keeping this at 12 for now, can adjust after completing proposal </w:t>
+        <w:t>It occurs to me here that we also need some details in the intro paragraph about these human dimensions concepts.</w:t>
       </w:r>
     </w:p>
   </w:comment>
-  <w:comment w:id="78" w:author="Kelsey McCune" w:date="2026-07-09T09:43:00Z" w:initials="KBM">
+  <w:comment w:id="71" w:author="Kelsey McCune" w:date="2026-07-09T09:37:00Z" w:initials="KBM">
     <w:p>
       <w:r>
         <w:rPr>
@@ -4955,7 +3984,7 @@
           <w:sz w:val="20"/>
           <w:szCs w:val="20"/>
         </w:rPr>
-        <w:t>Let's talk about whether we need to collect more of these.</w:t>
+        <w:t>I'm not sure what you mean by evidence-based promotions.</w:t>
       </w:r>
     </w:p>
   </w:comment>
@@ -4972,7 +4001,7 @@
           <w:sz w:val="20"/>
           <w:szCs w:val="20"/>
         </w:rPr>
-        <w:t>Unless you have specific plans to incorporate these data into your hypotheses and analysis, then we don't need to mention this here.</w:t>
+        <w:t>Let's talk about whether we need to collect more of these.</w:t>
       </w:r>
     </w:p>
   </w:comment>
@@ -5031,7 +4060,8 @@
 </file>
 
 <file path=word/commentsExtended.xml><?xml version="1.0" encoding="utf-8"?>
-<w15:commentsEx xmlns:wpc="http://schemas.microsoft.com/office/word/2010/wordprocessingCanvas" xmlns:cx="http://schemas.microsoft.com/office/drawing/2014/chartex" xmlns:cx1="http://schemas.microsoft.com/office/drawing/2015/9/8/chartex" xmlns:cx2="http://schemas.microsoft.com/office/drawing/2015/10/21/chartex" xmlns:cx3="http://schemas.microsoft.com/office/drawing/2016/5/9/chartex" xmlns:cx4="http://schemas.microsoft.com/office/drawing/2016/5/10/chartex" xmlns:cx5="http://schemas.microsoft.com/office/drawing/2016/5/11/chartex" xmlns:cx6="http://schemas.microsoft.com/office/drawing/2016/5/12/chartex" xmlns:cx7="http://schemas.microsoft.com/office/drawing/2016/5/13/chartex" xmlns:cx8="http://schemas.microsoft.com/office/drawing/2016/5/14/chartex" xmlns:mc="http://schemas.openxmlformats.org/markup-compatibility/2006" xmlns:m="http://schemas.openxmlformats.org/officeDocument/2006/math" xmlns:aink="http://schemas.microsoft.com/office/drawing/2016/ink" xmlns:am3d="http://schemas.microsoft.com/office/drawing/2017/model3d" xmlns:oel="http://schemas.microsoft.com/office/2019/extlst" xmlns:r="http://schemas.openxmlformats.org/officeDocument/2006/relationships" xmlns:wp14="http://schemas.microsoft.com/office/word/2010/wordprocessingDrawing" xmlns:wp="http://schemas.openxmlformats.org/drawingml/2006/wordprocessingDrawing" xmlns:wpg="http://schemas.microsoft.com/office/word/2010/wordprocessingGroup" xmlns:wpi="http://schemas.microsoft.com/office/word/2010/wordprocessingInk" xmlns:wps="http://schemas.microsoft.com/office/word/2010/wordprocessingShape" xmlns:o="urn:schemas-microsoft-com:office:office" xmlns:v="urn:schemas-microsoft-com:vml" xmlns:w10="urn:schemas-microsoft-com:office:word" xmlns:w="http://schemas.openxmlformats.org/wordprocessingml/2006/main" xmlns:w14="http://schemas.microsoft.com/office/word/2010/wordml" xmlns:w15="http://schemas.microsoft.com/office/word/2012/wordml" xmlns:w16cei="http://schemas.microsoft.com/office/word/2026/wordml/cei" xmlns:w16cex="http://schemas.microsoft.com/office/word/2018/wordml/cex" xmlns:w16cid="http://schemas.microsoft.com/office/word/2016/wordml/cid" xmlns:w16="http://schemas.microsoft.com/office/word/2018/wordml" xmlns:w16sdtdh="http://schemas.microsoft.com/office/word/2020/wordml/sdtdatahash" xmlns:w16sdtfl="http://schemas.microsoft.com/office/word/2024/wordml/sdtformatlock" xmlns:w16se="http://schemas.microsoft.com/office/word/2015/wordml/symex" xmlns:w16du="http://schemas.microsoft.com/office/word/2023/wordml/word16du" xmlns:wne="http://schemas.microsoft.com/office/word/2006/wordml" mc:Ignorable="w14 w15 w16se w16cid w16 w16cex w16sdtdh w16sdtfl w16du wp14">
+<w15:commentsEx xmlns:wpc="http://schemas.microsoft.com/office/word/2010/wordprocessingCanvas" xmlns:cx="http://schemas.microsoft.com/office/drawing/2014/chartex" xmlns:cx1="http://schemas.microsoft.com/office/drawing/2015/9/8/chartex" xmlns:cx2="http://schemas.microsoft.com/office/drawing/2015/10/21/chartex" xmlns:cx3="http://schemas.microsoft.com/office/drawing/2016/5/9/chartex" xmlns:cx4="http://schemas.microsoft.com/office/drawing/2016/5/10/chartex" xmlns:cx5="http://schemas.microsoft.com/office/drawing/2016/5/11/chartex" xmlns:cx6="http://schemas.microsoft.com/office/drawing/2016/5/12/chartex" xmlns:cx7="http://schemas.microsoft.com/office/drawing/2016/5/13/chartex" xmlns:cx8="http://schemas.microsoft.com/office/drawing/2016/5/14/chartex" xmlns:mc="http://schemas.openxmlformats.org/markup-compatibility/2006" xmlns:m="http://schemas.openxmlformats.org/officeDocument/2006/math" xmlns:aink="http://schemas.microsoft.com/office/drawing/2016/ink" xmlns:am3d="http://schemas.microsoft.com/office/drawing/2017/model3d" xmlns:oel="http://schemas.microsoft.com/office/2019/extlst" xmlns:r="http://schemas.openxmlformats.org/officeDocument/2006/relationships" xmlns:wp14="http://schemas.microsoft.com/office/word/2010/wordprocessingDrawing" xmlns:wp="http://schemas.openxmlformats.org/drawingml/2006/wordprocessingDrawing" xmlns:wpg="http://schemas.microsoft.com/office/word/2010/wordprocessingGroup" xmlns:wpi="http://schemas.microsoft.com/office/word/2010/wordprocessingInk" xmlns:wps="http://schemas.microsoft.com/office/word/2010/wordprocessingShape" xmlns:o="urn:schemas-microsoft-com:office:office" xmlns:v="urn:schemas-microsoft-com:vml" xmlns:w10="urn:schemas-microsoft-com:office:word" xmlns:w="http://schemas.openxmlformats.org/wordprocessingml/2006/main" xmlns:w14="http://schemas.microsoft.com/office/word/2010/wordml" xmlns:w15="http://schemas.microsoft.com/office/word/2012/wordml" xmlns:w16cex="http://schemas.microsoft.com/office/word/2018/wordml/cex" xmlns:w16cid="http://schemas.microsoft.com/office/word/2016/wordml/cid" xmlns:w16="http://schemas.microsoft.com/office/word/2018/wordml" xmlns:w16sdtdh="http://schemas.microsoft.com/office/word/2020/wordml/sdtdatahash" xmlns:w16sdtfl="http://schemas.microsoft.com/office/word/2024/wordml/sdtformatlock" xmlns:w16se="http://schemas.microsoft.com/office/word/2015/wordml/symex" xmlns:w16du="http://schemas.microsoft.com/office/word/2023/wordml/word16du" xmlns:wne="http://schemas.microsoft.com/office/word/2006/wordml" mc:Ignorable="w14 w15 w16se w16cid w16 w16cex w16sdtdh w16sdtfl w16du wp14">
+  <w15:commentEx w15:paraId="182F7229" w15:done="0"/>
   <w15:commentEx w15:paraId="75D20AD1" w15:done="0"/>
   <w15:commentEx w15:paraId="77C467A3" w15:done="0"/>
   <w15:commentEx w15:paraId="7915B3F3" w15:paraIdParent="77C467A3" w15:done="0"/>
@@ -5039,12 +4069,11 @@
   <w15:commentEx w15:paraId="585E9004" w15:done="0"/>
   <w15:commentEx w15:paraId="219F2C61" w15:paraIdParent="585E9004" w15:done="0"/>
   <w15:commentEx w15:paraId="720F4239" w15:paraIdParent="585E9004" w15:done="0"/>
+  <w15:commentEx w15:paraId="322BB5BC" w15:done="0"/>
   <w15:commentEx w15:paraId="48BC502D" w15:done="0"/>
   <w15:commentEx w15:paraId="1C69D0F5" w15:done="0"/>
   <w15:commentEx w15:paraId="6FAF4037" w15:done="1"/>
-  <w15:commentEx w15:paraId="28E976BC" w15:done="0"/>
   <w15:commentEx w15:paraId="15A9B723" w15:done="0"/>
-  <w15:commentEx w15:paraId="28C71C49" w15:done="0"/>
   <w15:commentEx w15:paraId="2ACDB0C0" w15:done="0"/>
   <w15:commentEx w15:paraId="34CFDA37" w15:done="0"/>
   <w15:commentEx w15:paraId="5B4FD32A" w15:done="0"/>
@@ -5052,7 +4081,8 @@
 </file>
 
 <file path=word/commentsExtensible.xml><?xml version="1.0" encoding="utf-8"?>
-<w16cex:commentsExtensible xmlns:wpc="http://schemas.microsoft.com/office/word/2010/wordprocessingCanvas" xmlns:cx="http://schemas.microsoft.com/office/drawing/2014/chartex" xmlns:cx1="http://schemas.microsoft.com/office/drawing/2015/9/8/chartex" xmlns:cx2="http://schemas.microsoft.com/office/drawing/2015/10/21/chartex" xmlns:cx3="http://schemas.microsoft.com/office/drawing/2016/5/9/chartex" xmlns:cx4="http://schemas.microsoft.com/office/drawing/2016/5/10/chartex" xmlns:cx5="http://schemas.microsoft.com/office/drawing/2016/5/11/chartex" xmlns:cx6="http://schemas.microsoft.com/office/drawing/2016/5/12/chartex" xmlns:cx7="http://schemas.microsoft.com/office/drawing/2016/5/13/chartex" xmlns:cx8="http://schemas.microsoft.com/office/drawing/2016/5/14/chartex" xmlns:cr="http://schemas.microsoft.com/office/comments/2020/reactions" xmlns:mc="http://schemas.openxmlformats.org/markup-compatibility/2006" xmlns:m="http://schemas.openxmlformats.org/officeDocument/2006/math" xmlns:aink="http://schemas.microsoft.com/office/drawing/2016/ink" xmlns:am3d="http://schemas.microsoft.com/office/drawing/2017/model3d" xmlns:oel="http://schemas.microsoft.com/office/2019/extlst" xmlns:r="http://schemas.openxmlformats.org/officeDocument/2006/relationships" xmlns:wp14="http://schemas.microsoft.com/office/word/2010/wordprocessingDrawing" xmlns:wp="http://schemas.openxmlformats.org/drawingml/2006/wordprocessingDrawing" xmlns:wpg="http://schemas.microsoft.com/office/word/2010/wordprocessingGroup" xmlns:wpi="http://schemas.microsoft.com/office/word/2010/wordprocessingInk" xmlns:wps="http://schemas.microsoft.com/office/word/2010/wordprocessingShape" xmlns:o="urn:schemas-microsoft-com:office:office" xmlns:v="urn:schemas-microsoft-com:vml" xmlns:w10="urn:schemas-microsoft-com:office:word" xmlns:w="http://schemas.openxmlformats.org/wordprocessingml/2006/main" xmlns:w14="http://schemas.microsoft.com/office/word/2010/wordml" xmlns:w15="http://schemas.microsoft.com/office/word/2012/wordml" xmlns:w16cei="http://schemas.microsoft.com/office/word/2026/wordml/cei" xmlns:w16cex="http://schemas.microsoft.com/office/word/2018/wordml/cex" xmlns:w16cid="http://schemas.microsoft.com/office/word/2016/wordml/cid" xmlns:w16="http://schemas.microsoft.com/office/word/2018/wordml" xmlns:w16sdtdh="http://schemas.microsoft.com/office/word/2020/wordml/sdtdatahash" xmlns:w16sdtfl="http://schemas.microsoft.com/office/word/2024/wordml/sdtformatlock" xmlns:w16se="http://schemas.microsoft.com/office/word/2015/wordml/symex" xmlns:w16du="http://schemas.microsoft.com/office/word/2023/wordml/word16du" xmlns:wne="http://schemas.microsoft.com/office/word/2006/wordml" mc:Ignorable="w14 w15 w16se w16cid w16 w16cex w16sdtdh w16sdtfl cr w16du wp14">
+<w16cex:commentsExtensible xmlns:wpc="http://schemas.microsoft.com/office/word/2010/wordprocessingCanvas" xmlns:cx="http://schemas.microsoft.com/office/drawing/2014/chartex" xmlns:cx1="http://schemas.microsoft.com/office/drawing/2015/9/8/chartex" xmlns:cx2="http://schemas.microsoft.com/office/drawing/2015/10/21/chartex" xmlns:cx3="http://schemas.microsoft.com/office/drawing/2016/5/9/chartex" xmlns:cx4="http://schemas.microsoft.com/office/drawing/2016/5/10/chartex" xmlns:cx5="http://schemas.microsoft.com/office/drawing/2016/5/11/chartex" xmlns:cx6="http://schemas.microsoft.com/office/drawing/2016/5/12/chartex" xmlns:cx7="http://schemas.microsoft.com/office/drawing/2016/5/13/chartex" xmlns:cx8="http://schemas.microsoft.com/office/drawing/2016/5/14/chartex" xmlns:cr="http://schemas.microsoft.com/office/comments/2020/reactions" xmlns:mc="http://schemas.openxmlformats.org/markup-compatibility/2006" xmlns:m="http://schemas.openxmlformats.org/officeDocument/2006/math" xmlns:aink="http://schemas.microsoft.com/office/drawing/2016/ink" xmlns:am3d="http://schemas.microsoft.com/office/drawing/2017/model3d" xmlns:oel="http://schemas.microsoft.com/office/2019/extlst" xmlns:r="http://schemas.openxmlformats.org/officeDocument/2006/relationships" xmlns:wp14="http://schemas.microsoft.com/office/word/2010/wordprocessingDrawing" xmlns:wp="http://schemas.openxmlformats.org/drawingml/2006/wordprocessingDrawing" xmlns:wpg="http://schemas.microsoft.com/office/word/2010/wordprocessingGroup" xmlns:wpi="http://schemas.microsoft.com/office/word/2010/wordprocessingInk" xmlns:wps="http://schemas.microsoft.com/office/word/2010/wordprocessingShape" xmlns:o="urn:schemas-microsoft-com:office:office" xmlns:v="urn:schemas-microsoft-com:vml" xmlns:w10="urn:schemas-microsoft-com:office:word" xmlns:w="http://schemas.openxmlformats.org/wordprocessingml/2006/main" xmlns:w14="http://schemas.microsoft.com/office/word/2010/wordml" xmlns:w15="http://schemas.microsoft.com/office/word/2012/wordml" xmlns:w16cex="http://schemas.microsoft.com/office/word/2018/wordml/cex" xmlns:w16cid="http://schemas.microsoft.com/office/word/2016/wordml/cid" xmlns:w16="http://schemas.microsoft.com/office/word/2018/wordml" xmlns:w16sdtdh="http://schemas.microsoft.com/office/word/2020/wordml/sdtdatahash" xmlns:w16sdtfl="http://schemas.microsoft.com/office/word/2024/wordml/sdtformatlock" xmlns:w16se="http://schemas.microsoft.com/office/word/2015/wordml/symex" xmlns:w16du="http://schemas.microsoft.com/office/word/2023/wordml/word16du" xmlns:wne="http://schemas.microsoft.com/office/word/2006/wordml" mc:Ignorable="w14 w15 w16se w16cid w16 w16cex w16sdtdh w16sdtfl cr w16du wp14">
+  <w16cex:commentExtensible w16cex:durableId="005CFC67" w16cex:dateUtc="2026-08-13T19:20:00Z"/>
   <w16cex:commentExtensible w16cex:durableId="181327B7" w16cex:dateUtc="2026-04-01T14:59:00Z"/>
   <w16cex:commentExtensible w16cex:durableId="5441F447" w16cex:dateUtc="2026-03-24T14:01:00Z"/>
   <w16cex:commentExtensible w16cex:durableId="2129AE12" w16cex:dateUtc="2026-03-24T16:25:00Z"/>
@@ -5060,12 +4090,11 @@
   <w16cex:commentExtensible w16cex:durableId="6D1D4A8C" w16cex:dateUtc="2026-03-24T14:02:00Z"/>
   <w16cex:commentExtensible w16cex:durableId="77665092" w16cex:dateUtc="2026-07-09T16:44:00Z"/>
   <w16cex:commentExtensible w16cex:durableId="05F032B6" w16cex:dateUtc="2026-07-09T16:49:00Z"/>
+  <w16cex:commentExtensible w16cex:durableId="35776AC6" w16cex:dateUtc="2026-08-13T19:22:00Z"/>
   <w16cex:commentExtensible w16cex:durableId="3854D19D" w16cex:dateUtc="2026-07-02T17:21:00Z"/>
   <w16cex:commentExtensible w16cex:durableId="3F01E26B" w16cex:dateUtc="2026-07-09T14:34:00Z"/>
   <w16cex:commentExtensible w16cex:durableId="2329566B" w16cex:dateUtc="2026-07-09T14:37:00Z"/>
-  <w16cex:commentExtensible w16cex:durableId="7058214B" w16cex:dateUtc="2026-07-02T17:03:00Z"/>
   <w16cex:commentExtensible w16cex:durableId="33F6B902" w16cex:dateUtc="2026-07-09T14:43:00Z"/>
-  <w16cex:commentExtensible w16cex:durableId="75FFF756" w16cex:dateUtc="2026-07-09T14:43:00Z"/>
   <w16cex:commentExtensible w16cex:durableId="2639753B" w16cex:dateUtc="2026-07-09T14:46:00Z"/>
   <w16cex:commentExtensible w16cex:durableId="3119063E" w16cex:dateUtc="2026-07-02T17:15:00Z"/>
   <w16cex:commentExtensible w16cex:durableId="44FD9805" w16cex:dateUtc="2026-07-09T19:23:00Z"/>
@@ -5073,7 +4102,8 @@
 </file>
 
 <file path=word/commentsIds.xml><?xml version="1.0" encoding="utf-8"?>
-<w16cid:commentsIds xmlns:wpc="http://schemas.microsoft.com/office/word/2010/wordprocessingCanvas" xmlns:cx="http://schemas.microsoft.com/office/drawing/2014/chartex" xmlns:cx1="http://schemas.microsoft.com/office/drawing/2015/9/8/chartex" xmlns:cx2="http://schemas.microsoft.com/office/drawing/2015/10/21/chartex" xmlns:cx3="http://schemas.microsoft.com/office/drawing/2016/5/9/chartex" xmlns:cx4="http://schemas.microsoft.com/office/drawing/2016/5/10/chartex" xmlns:cx5="http://schemas.microsoft.com/office/drawing/2016/5/11/chartex" xmlns:cx6="http://schemas.microsoft.com/office/drawing/2016/5/12/chartex" xmlns:cx7="http://schemas.microsoft.com/office/drawing/2016/5/13/chartex" xmlns:cx8="http://schemas.microsoft.com/office/drawing/2016/5/14/chartex" xmlns:mc="http://schemas.openxmlformats.org/markup-compatibility/2006" xmlns:m="http://schemas.openxmlformats.org/officeDocument/2006/math" xmlns:aink="http://schemas.microsoft.com/office/drawing/2016/ink" xmlns:am3d="http://schemas.microsoft.com/office/drawing/2017/model3d" xmlns:oel="http://schemas.microsoft.com/office/2019/extlst" xmlns:r="http://schemas.openxmlformats.org/officeDocument/2006/relationships" xmlns:wp14="http://schemas.microsoft.com/office/word/2010/wordprocessingDrawing" xmlns:wp="http://schemas.openxmlformats.org/drawingml/2006/wordprocessingDrawing" xmlns:wpg="http://schemas.microsoft.com/office/word/2010/wordprocessingGroup" xmlns:wpi="http://schemas.microsoft.com/office/word/2010/wordprocessingInk" xmlns:wps="http://schemas.microsoft.com/office/word/2010/wordprocessingShape" xmlns:o="urn:schemas-microsoft-com:office:office" xmlns:v="urn:schemas-microsoft-com:vml" xmlns:w10="urn:schemas-microsoft-com:office:word" xmlns:w="http://schemas.openxmlformats.org/wordprocessingml/2006/main" xmlns:w14="http://schemas.microsoft.com/office/word/2010/wordml" xmlns:w15="http://schemas.microsoft.com/office/word/2012/wordml" xmlns:w16cei="http://schemas.microsoft.com/office/word/2026/wordml/cei" xmlns:w16cex="http://schemas.microsoft.com/office/word/2018/wordml/cex" xmlns:w16cid="http://schemas.microsoft.com/office/word/2016/wordml/cid" xmlns:w16="http://schemas.microsoft.com/office/word/2018/wordml" xmlns:w16sdtdh="http://schemas.microsoft.com/office/word/2020/wordml/sdtdatahash" xmlns:w16sdtfl="http://schemas.microsoft.com/office/word/2024/wordml/sdtformatlock" xmlns:w16se="http://schemas.microsoft.com/office/word/2015/wordml/symex" xmlns:w16du="http://schemas.microsoft.com/office/word/2023/wordml/word16du" xmlns:wne="http://schemas.microsoft.com/office/word/2006/wordml" mc:Ignorable="w14 w15 w16se w16cid w16 w16cex w16sdtdh w16sdtfl w16du wp14">
+<w16cid:commentsIds xmlns:wpc="http://schemas.microsoft.com/office/word/2010/wordprocessingCanvas" xmlns:cx="http://schemas.microsoft.com/office/drawing/2014/chartex" xmlns:cx1="http://schemas.microsoft.com/office/drawing/2015/9/8/chartex" xmlns:cx2="http://schemas.microsoft.com/office/drawing/2015/10/21/chartex" xmlns:cx3="http://schemas.microsoft.com/office/drawing/2016/5/9/chartex" xmlns:cx4="http://schemas.microsoft.com/office/drawing/2016/5/10/chartex" xmlns:cx5="http://schemas.microsoft.com/office/drawing/2016/5/11/chartex" xmlns:cx6="http://schemas.microsoft.com/office/drawing/2016/5/12/chartex" xmlns:cx7="http://schemas.microsoft.com/office/drawing/2016/5/13/chartex" xmlns:cx8="http://schemas.microsoft.com/office/drawing/2016/5/14/chartex" xmlns:mc="http://schemas.openxmlformats.org/markup-compatibility/2006" xmlns:m="http://schemas.openxmlformats.org/officeDocument/2006/math" xmlns:aink="http://schemas.microsoft.com/office/drawing/2016/ink" xmlns:am3d="http://schemas.microsoft.com/office/drawing/2017/model3d" xmlns:oel="http://schemas.microsoft.com/office/2019/extlst" xmlns:r="http://schemas.openxmlformats.org/officeDocument/2006/relationships" xmlns:wp14="http://schemas.microsoft.com/office/word/2010/wordprocessingDrawing" xmlns:wp="http://schemas.openxmlformats.org/drawingml/2006/wordprocessingDrawing" xmlns:wpg="http://schemas.microsoft.com/office/word/2010/wordprocessingGroup" xmlns:wpi="http://schemas.microsoft.com/office/word/2010/wordprocessingInk" xmlns:wps="http://schemas.microsoft.com/office/word/2010/wordprocessingShape" xmlns:o="urn:schemas-microsoft-com:office:office" xmlns:v="urn:schemas-microsoft-com:vml" xmlns:w10="urn:schemas-microsoft-com:office:word" xmlns:w="http://schemas.openxmlformats.org/wordprocessingml/2006/main" xmlns:w14="http://schemas.microsoft.com/office/word/2010/wordml" xmlns:w15="http://schemas.microsoft.com/office/word/2012/wordml" xmlns:w16cex="http://schemas.microsoft.com/office/word/2018/wordml/cex" xmlns:w16cid="http://schemas.microsoft.com/office/word/2016/wordml/cid" xmlns:w16="http://schemas.microsoft.com/office/word/2018/wordml" xmlns:w16sdtdh="http://schemas.microsoft.com/office/word/2020/wordml/sdtdatahash" xmlns:w16sdtfl="http://schemas.microsoft.com/office/word/2024/wordml/sdtformatlock" xmlns:w16se="http://schemas.microsoft.com/office/word/2015/wordml/symex" xmlns:w16du="http://schemas.microsoft.com/office/word/2023/wordml/word16du" xmlns:wne="http://schemas.microsoft.com/office/word/2006/wordml" mc:Ignorable="w14 w15 w16se w16cid w16 w16cex w16sdtdh w16sdtfl w16du wp14">
+  <w16cid:commentId w16cid:paraId="182F7229" w16cid:durableId="005CFC67"/>
   <w16cid:commentId w16cid:paraId="75D20AD1" w16cid:durableId="181327B7"/>
   <w16cid:commentId w16cid:paraId="77C467A3" w16cid:durableId="5441F447"/>
   <w16cid:commentId w16cid:paraId="7915B3F3" w16cid:durableId="2129AE12"/>
@@ -5081,12 +4111,11 @@
   <w16cid:commentId w16cid:paraId="585E9004" w16cid:durableId="6D1D4A8C"/>
   <w16cid:commentId w16cid:paraId="219F2C61" w16cid:durableId="77665092"/>
   <w16cid:commentId w16cid:paraId="720F4239" w16cid:durableId="05F032B6"/>
+  <w16cid:commentId w16cid:paraId="322BB5BC" w16cid:durableId="35776AC6"/>
   <w16cid:commentId w16cid:paraId="48BC502D" w16cid:durableId="3854D19D"/>
   <w16cid:commentId w16cid:paraId="1C69D0F5" w16cid:durableId="3F01E26B"/>
   <w16cid:commentId w16cid:paraId="6FAF4037" w16cid:durableId="2329566B"/>
-  <w16cid:commentId w16cid:paraId="28E976BC" w16cid:durableId="7058214B"/>
   <w16cid:commentId w16cid:paraId="15A9B723" w16cid:durableId="33F6B902"/>
-  <w16cid:commentId w16cid:paraId="28C71C49" w16cid:durableId="75FFF756"/>
   <w16cid:commentId w16cid:paraId="2ACDB0C0" w16cid:durableId="2639753B"/>
   <w16cid:commentId w16cid:paraId="34CFDA37" w16cid:durableId="3119063E"/>
   <w16cid:commentId w16cid:paraId="5B4FD32A" w16cid:durableId="44FD9805"/>
@@ -5094,7 +4123,7 @@
 </file>
 
 <file path=word/endnotes.xml><?xml version="1.0" encoding="utf-8"?>
-<w:endnotes xmlns:wpc="http://schemas.microsoft.com/office/word/2010/wordprocessingCanvas" xmlns:cx="http://schemas.microsoft.com/office/drawing/2014/chartex" xmlns:cx1="http://schemas.microsoft.com/office/drawing/2015/9/8/chartex" xmlns:cx2="http://schemas.microsoft.com/office/drawing/2015/10/21/chartex" xmlns:cx3="http://schemas.microsoft.com/office/drawing/2016/5/9/chartex" xmlns:cx4="http://schemas.microsoft.com/office/drawing/2016/5/10/chartex" xmlns:cx5="http://schemas.microsoft.com/office/drawing/2016/5/11/chartex" xmlns:cx6="http://schemas.microsoft.com/office/drawing/2016/5/12/chartex" xmlns:cx7="http://schemas.microsoft.com/office/drawing/2016/5/13/chartex" xmlns:cx8="http://schemas.microsoft.com/office/drawing/2016/5/14/chartex" xmlns:mc="http://schemas.openxmlformats.org/markup-compatibility/2006" xmlns:m="http://schemas.openxmlformats.org/officeDocument/2006/math" xmlns:aink="http://schemas.microsoft.com/office/drawing/2016/ink" xmlns:am3d="http://schemas.microsoft.com/office/drawing/2017/model3d" xmlns:oel="http://schemas.microsoft.com/office/2019/extlst" xmlns:r="http://schemas.openxmlformats.org/officeDocument/2006/relationships" xmlns:wp14="http://schemas.microsoft.com/office/word/2010/wordprocessingDrawing" xmlns:wp="http://schemas.openxmlformats.org/drawingml/2006/wordprocessingDrawing" xmlns:wpg="http://schemas.microsoft.com/office/word/2010/wordprocessingGroup" xmlns:wpi="http://schemas.microsoft.com/office/word/2010/wordprocessingInk" xmlns:wps="http://schemas.microsoft.com/office/word/2010/wordprocessingShape" xmlns:o="urn:schemas-microsoft-com:office:office" xmlns:v="urn:schemas-microsoft-com:vml" xmlns:w10="urn:schemas-microsoft-com:office:word" xmlns:w="http://schemas.openxmlformats.org/wordprocessingml/2006/main" xmlns:w14="http://schemas.microsoft.com/office/word/2010/wordml" xmlns:w15="http://schemas.microsoft.com/office/word/2012/wordml" xmlns:w16cei="http://schemas.microsoft.com/office/word/2026/wordml/cei" xmlns:w16cex="http://schemas.microsoft.com/office/word/2018/wordml/cex" xmlns:w16cid="http://schemas.microsoft.com/office/word/2016/wordml/cid" xmlns:w16="http://schemas.microsoft.com/office/word/2018/wordml" xmlns:w16sdtdh="http://schemas.microsoft.com/office/word/2020/wordml/sdtdatahash" xmlns:w16sdtfl="http://schemas.microsoft.com/office/word/2024/wordml/sdtformatlock" xmlns:w16se="http://schemas.microsoft.com/office/word/2015/wordml/symex" xmlns:w16du="http://schemas.microsoft.com/office/word/2023/wordml/word16du" xmlns:wne="http://schemas.microsoft.com/office/word/2006/wordml" mc:Ignorable="w14 w15 w16se w16cid w16 w16cex w16sdtdh w16sdtfl w16du wp14">
+<w:endnotes xmlns:wpc="http://schemas.microsoft.com/office/word/2010/wordprocessingCanvas" xmlns:cx="http://schemas.microsoft.com/office/drawing/2014/chartex" xmlns:cx1="http://schemas.microsoft.com/office/drawing/2015/9/8/chartex" xmlns:cx2="http://schemas.microsoft.com/office/drawing/2015/10/21/chartex" xmlns:cx3="http://schemas.microsoft.com/office/drawing/2016/5/9/chartex" xmlns:cx4="http://schemas.microsoft.com/office/drawing/2016/5/10/chartex" xmlns:cx5="http://schemas.microsoft.com/office/drawing/2016/5/11/chartex" xmlns:cx6="http://schemas.microsoft.com/office/drawing/2016/5/12/chartex" xmlns:cx7="http://schemas.microsoft.com/office/drawing/2016/5/13/chartex" xmlns:cx8="http://schemas.microsoft.com/office/drawing/2016/5/14/chartex" xmlns:mc="http://schemas.openxmlformats.org/markup-compatibility/2006" xmlns:m="http://schemas.openxmlformats.org/officeDocument/2006/math" xmlns:aink="http://schemas.microsoft.com/office/drawing/2016/ink" xmlns:am3d="http://schemas.microsoft.com/office/drawing/2017/model3d" xmlns:oel="http://schemas.microsoft.com/office/2019/extlst" xmlns:r="http://schemas.openxmlformats.org/officeDocument/2006/relationships" xmlns:wp14="http://schemas.microsoft.com/office/word/2010/wordprocessingDrawing" xmlns:wp="http://schemas.openxmlformats.org/drawingml/2006/wordprocessingDrawing" xmlns:wpg="http://schemas.microsoft.com/office/word/2010/wordprocessingGroup" xmlns:wpi="http://schemas.microsoft.com/office/word/2010/wordprocessingInk" xmlns:wps="http://schemas.microsoft.com/office/word/2010/wordprocessingShape" xmlns:o="urn:schemas-microsoft-com:office:office" xmlns:v="urn:schemas-microsoft-com:vml" xmlns:w10="urn:schemas-microsoft-com:office:word" xmlns:w="http://schemas.openxmlformats.org/wordprocessingml/2006/main" xmlns:w14="http://schemas.microsoft.com/office/word/2010/wordml" xmlns:w15="http://schemas.microsoft.com/office/word/2012/wordml" xmlns:w16cex="http://schemas.microsoft.com/office/word/2018/wordml/cex" xmlns:w16cid="http://schemas.microsoft.com/office/word/2016/wordml/cid" xmlns:w16="http://schemas.microsoft.com/office/word/2018/wordml" xmlns:w16sdtdh="http://schemas.microsoft.com/office/word/2020/wordml/sdtdatahash" xmlns:w16sdtfl="http://schemas.microsoft.com/office/word/2024/wordml/sdtformatlock" xmlns:w16se="http://schemas.microsoft.com/office/word/2015/wordml/symex" xmlns:w16du="http://schemas.microsoft.com/office/word/2023/wordml/word16du" xmlns:wne="http://schemas.microsoft.com/office/word/2006/wordml" mc:Ignorable="w14 w15 w16se w16cid w16 w16cex w16sdtdh w16sdtfl w16du wp14">
   <w:endnote w:type="separator" w:id="-1">
     <w:p>
       <w:pPr>
@@ -5119,7 +4148,7 @@
 </file>
 
 <file path=word/footnotes.xml><?xml version="1.0" encoding="utf-8"?>
-<w:footnotes xmlns:wpc="http://schemas.microsoft.com/office/word/2010/wordprocessingCanvas" xmlns:cx="http://schemas.microsoft.com/office/drawing/2014/chartex" xmlns:cx1="http://schemas.microsoft.com/office/drawing/2015/9/8/chartex" xmlns:cx2="http://schemas.microsoft.com/office/drawing/2015/10/21/chartex" xmlns:cx3="http://schemas.microsoft.com/office/drawing/2016/5/9/chartex" xmlns:cx4="http://schemas.microsoft.com/office/drawing/2016/5/10/chartex" xmlns:cx5="http://schemas.microsoft.com/office/drawing/2016/5/11/chartex" xmlns:cx6="http://schemas.microsoft.com/office/drawing/2016/5/12/chartex" xmlns:cx7="http://schemas.microsoft.com/office/drawing/2016/5/13/chartex" xmlns:cx8="http://schemas.microsoft.com/office/drawing/2016/5/14/chartex" xmlns:mc="http://schemas.openxmlformats.org/markup-compatibility/2006" xmlns:m="http://schemas.openxmlformats.org/officeDocument/2006/math" xmlns:aink="http://schemas.microsoft.com/office/drawing/2016/ink" xmlns:am3d="http://schemas.microsoft.com/office/drawing/2017/model3d" xmlns:oel="http://schemas.microsoft.com/office/2019/extlst" xmlns:r="http://schemas.openxmlformats.org/officeDocument/2006/relationships" xmlns:wp14="http://schemas.microsoft.com/office/word/2010/wordprocessingDrawing" xmlns:wp="http://schemas.openxmlformats.org/drawingml/2006/wordprocessingDrawing" xmlns:wpg="http://schemas.microsoft.com/office/word/2010/wordprocessingGroup" xmlns:wpi="http://schemas.microsoft.com/office/word/2010/wordprocessingInk" xmlns:wps="http://schemas.microsoft.com/office/word/2010/wordprocessingShape" xmlns:o="urn:schemas-microsoft-com:office:office" xmlns:v="urn:schemas-microsoft-com:vml" xmlns:w10="urn:schemas-microsoft-com:office:word" xmlns:w="http://schemas.openxmlformats.org/wordprocessingml/2006/main" xmlns:w14="http://schemas.microsoft.com/office/word/2010/wordml" xmlns:w15="http://schemas.microsoft.com/office/word/2012/wordml" xmlns:w16cei="http://schemas.microsoft.com/office/word/2026/wordml/cei" xmlns:w16cex="http://schemas.microsoft.com/office/word/2018/wordml/cex" xmlns:w16cid="http://schemas.microsoft.com/office/word/2016/wordml/cid" xmlns:w16="http://schemas.microsoft.com/office/word/2018/wordml" xmlns:w16sdtdh="http://schemas.microsoft.com/office/word/2020/wordml/sdtdatahash" xmlns:w16sdtfl="http://schemas.microsoft.com/office/word/2024/wordml/sdtformatlock" xmlns:w16se="http://schemas.microsoft.com/office/word/2015/wordml/symex" xmlns:w16du="http://schemas.microsoft.com/office/word/2023/wordml/word16du" xmlns:wne="http://schemas.microsoft.com/office/word/2006/wordml" mc:Ignorable="w14 w15 w16se w16cid w16 w16cex w16sdtdh w16sdtfl w16du wp14">
+<w:footnotes xmlns:wpc="http://schemas.microsoft.com/office/word/2010/wordprocessingCanvas" xmlns:cx="http://schemas.microsoft.com/office/drawing/2014/chartex" xmlns:cx1="http://schemas.microsoft.com/office/drawing/2015/9/8/chartex" xmlns:cx2="http://schemas.microsoft.com/office/drawing/2015/10/21/chartex" xmlns:cx3="http://schemas.microsoft.com/office/drawing/2016/5/9/chartex" xmlns:cx4="http://schemas.microsoft.com/office/drawing/2016/5/10/chartex" xmlns:cx5="http://schemas.microsoft.com/office/drawing/2016/5/11/chartex" xmlns:cx6="http://schemas.microsoft.com/office/drawing/2016/5/12/chartex" xmlns:cx7="http://schemas.microsoft.com/office/drawing/2016/5/13/chartex" xmlns:cx8="http://schemas.microsoft.com/office/drawing/2016/5/14/chartex" xmlns:mc="http://schemas.openxmlformats.org/markup-compatibility/2006" xmlns:m="http://schemas.openxmlformats.org/officeDocument/2006/math" xmlns:aink="http://schemas.microsoft.com/office/drawing/2016/ink" xmlns:am3d="http://schemas.microsoft.com/office/drawing/2017/model3d" xmlns:oel="http://schemas.microsoft.com/office/2019/extlst" xmlns:r="http://schemas.openxmlformats.org/officeDocument/2006/relationships" xmlns:wp14="http://schemas.microsoft.com/office/word/2010/wordprocessingDrawing" xmlns:wp="http://schemas.openxmlformats.org/drawingml/2006/wordprocessingDrawing" xmlns:wpg="http://schemas.microsoft.com/office/word/2010/wordprocessingGroup" xmlns:wpi="http://schemas.microsoft.com/office/word/2010/wordprocessingInk" xmlns:wps="http://schemas.microsoft.com/office/word/2010/wordprocessingShape" xmlns:o="urn:schemas-microsoft-com:office:office" xmlns:v="urn:schemas-microsoft-com:vml" xmlns:w10="urn:schemas-microsoft-com:office:word" xmlns:w="http://schemas.openxmlformats.org/wordprocessingml/2006/main" xmlns:w14="http://schemas.microsoft.com/office/word/2010/wordml" xmlns:w15="http://schemas.microsoft.com/office/word/2012/wordml" xmlns:w16cex="http://schemas.microsoft.com/office/word/2018/wordml/cex" xmlns:w16cid="http://schemas.microsoft.com/office/word/2016/wordml/cid" xmlns:w16="http://schemas.microsoft.com/office/word/2018/wordml" xmlns:w16sdtdh="http://schemas.microsoft.com/office/word/2020/wordml/sdtdatahash" xmlns:w16sdtfl="http://schemas.microsoft.com/office/word/2024/wordml/sdtformatlock" xmlns:w16se="http://schemas.microsoft.com/office/word/2015/wordml/symex" xmlns:w16du="http://schemas.microsoft.com/office/word/2023/wordml/word16du" xmlns:wne="http://schemas.microsoft.com/office/word/2006/wordml" mc:Ignorable="w14 w15 w16se w16cid w16 w16cex w16sdtdh w16sdtfl w16du wp14">
   <w:footnote w:type="separator" w:id="-1">
     <w:p>
       <w:pPr>
@@ -5144,7 +4173,7 @@
 </file>
 
 <file path=word/numbering.xml><?xml version="1.0" encoding="utf-8"?>
-<w:numbering xmlns:wpc="http://schemas.microsoft.com/office/word/2010/wordprocessingCanvas" xmlns:cx="http://schemas.microsoft.com/office/drawing/2014/chartex" xmlns:cx1="http://schemas.microsoft.com/office/drawing/2015/9/8/chartex" xmlns:cx2="http://schemas.microsoft.com/office/drawing/2015/10/21/chartex" xmlns:cx3="http://schemas.microsoft.com/office/drawing/2016/5/9/chartex" xmlns:cx4="http://schemas.microsoft.com/office/drawing/2016/5/10/chartex" xmlns:cx5="http://schemas.microsoft.com/office/drawing/2016/5/11/chartex" xmlns:cx6="http://schemas.microsoft.com/office/drawing/2016/5/12/chartex" xmlns:cx7="http://schemas.microsoft.com/office/drawing/2016/5/13/chartex" xmlns:cx8="http://schemas.microsoft.com/office/drawing/2016/5/14/chartex" xmlns:mc="http://schemas.openxmlformats.org/markup-compatibility/2006" xmlns:m="http://schemas.openxmlformats.org/officeDocument/2006/math" xmlns:aink="http://schemas.microsoft.com/office/drawing/2016/ink" xmlns:am3d="http://schemas.microsoft.com/office/drawing/2017/model3d" xmlns:oel="http://schemas.microsoft.com/office/2019/extlst" xmlns:r="http://schemas.openxmlformats.org/officeDocument/2006/relationships" xmlns:wp14="http://schemas.microsoft.com/office/word/2010/wordprocessingDrawing" xmlns:wp="http://schemas.openxmlformats.org/drawingml/2006/wordprocessingDrawing" xmlns:wpg="http://schemas.microsoft.com/office/word/2010/wordprocessingGroup" xmlns:wpi="http://schemas.microsoft.com/office/word/2010/wordprocessingInk" xmlns:wps="http://schemas.microsoft.com/office/word/2010/wordprocessingShape" xmlns:o="urn:schemas-microsoft-com:office:office" xmlns:v="urn:schemas-microsoft-com:vml" xmlns:w10="urn:schemas-microsoft-com:office:word" xmlns:w="http://schemas.openxmlformats.org/wordprocessingml/2006/main" xmlns:w14="http://schemas.microsoft.com/office/word/2010/wordml" xmlns:w15="http://schemas.microsoft.com/office/word/2012/wordml" xmlns:w16cei="http://schemas.microsoft.com/office/word/2026/wordml/cei" xmlns:w16cex="http://schemas.microsoft.com/office/word/2018/wordml/cex" xmlns:w16cid="http://schemas.microsoft.com/office/word/2016/wordml/cid" xmlns:w16="http://schemas.microsoft.com/office/word/2018/wordml" xmlns:w16sdtdh="http://schemas.microsoft.com/office/word/2020/wordml/sdtdatahash" xmlns:w16sdtfl="http://schemas.microsoft.com/office/word/2024/wordml/sdtformatlock" xmlns:w16se="http://schemas.microsoft.com/office/word/2015/wordml/symex" xmlns:w16du="http://schemas.microsoft.com/office/word/2023/wordml/word16du" xmlns:wne="http://schemas.microsoft.com/office/word/2006/wordml" mc:Ignorable="w14 w15 w16se w16cid w16 w16cex w16sdtdh w16sdtfl w16du wp14">
+<w:numbering xmlns:wpc="http://schemas.microsoft.com/office/word/2010/wordprocessingCanvas" xmlns:cx="http://schemas.microsoft.com/office/drawing/2014/chartex" xmlns:cx1="http://schemas.microsoft.com/office/drawing/2015/9/8/chartex" xmlns:cx2="http://schemas.microsoft.com/office/drawing/2015/10/21/chartex" xmlns:cx3="http://schemas.microsoft.com/office/drawing/2016/5/9/chartex" xmlns:cx4="http://schemas.microsoft.com/office/drawing/2016/5/10/chartex" xmlns:cx5="http://schemas.microsoft.com/office/drawing/2016/5/11/chartex" xmlns:cx6="http://schemas.microsoft.com/office/drawing/2016/5/12/chartex" xmlns:cx7="http://schemas.microsoft.com/office/drawing/2016/5/13/chartex" xmlns:cx8="http://schemas.microsoft.com/office/drawing/2016/5/14/chartex" xmlns:mc="http://schemas.openxmlformats.org/markup-compatibility/2006" xmlns:m="http://schemas.openxmlformats.org/officeDocument/2006/math" xmlns:aink="http://schemas.microsoft.com/office/drawing/2016/ink" xmlns:am3d="http://schemas.microsoft.com/office/drawing/2017/model3d" xmlns:oel="http://schemas.microsoft.com/office/2019/extlst" xmlns:r="http://schemas.openxmlformats.org/officeDocument/2006/relationships" xmlns:wp14="http://schemas.microsoft.com/office/word/2010/wordprocessingDrawing" xmlns:wp="http://schemas.openxmlformats.org/drawingml/2006/wordprocessingDrawing" xmlns:wpg="http://schemas.microsoft.com/office/word/2010/wordprocessingGroup" xmlns:wpi="http://schemas.microsoft.com/office/word/2010/wordprocessingInk" xmlns:wps="http://schemas.microsoft.com/office/word/2010/wordprocessingShape" xmlns:o="urn:schemas-microsoft-com:office:office" xmlns:v="urn:schemas-microsoft-com:vml" xmlns:w10="urn:schemas-microsoft-com:office:word" xmlns:w="http://schemas.openxmlformats.org/wordprocessingml/2006/main" xmlns:w14="http://schemas.microsoft.com/office/word/2010/wordml" xmlns:w15="http://schemas.microsoft.com/office/word/2012/wordml" xmlns:w16cex="http://schemas.microsoft.com/office/word/2018/wordml/cex" xmlns:w16cid="http://schemas.microsoft.com/office/word/2016/wordml/cid" xmlns:w16="http://schemas.microsoft.com/office/word/2018/wordml" xmlns:w16sdtdh="http://schemas.microsoft.com/office/word/2020/wordml/sdtdatahash" xmlns:w16sdtfl="http://schemas.microsoft.com/office/word/2024/wordml/sdtformatlock" xmlns:w16se="http://schemas.microsoft.com/office/word/2015/wordml/symex" xmlns:w16du="http://schemas.microsoft.com/office/word/2023/wordml/word16du" xmlns:wne="http://schemas.microsoft.com/office/word/2006/wordml" mc:Ignorable="w14 w15 w16se w16cid w16 w16cex w16sdtdh w16sdtfl w16du wp14">
   <w:abstractNum w:abstractNumId="0" w15:restartNumberingAfterBreak="0">
     <w:nsid w:val="0FE621CC"/>
     <w:multiLevelType w:val="hybridMultilevel"/>
@@ -5235,10 +4264,11 @@
     </w:lvl>
   </w:abstractNum>
   <w:abstractNum w:abstractNumId="1" w15:restartNumberingAfterBreak="0">
-    <w:nsid w:val="65192E1F"/>
+    <w:nsid w:val="516135D2"/>
     <w:multiLevelType w:val="hybridMultilevel"/>
-    <w:tmpl w:val="570865AE"/>
-    <w:lvl w:ilvl="0" w:tplc="294A4108">
+    <w:tmpl w:val="4BDA7EC6"/>
+    <w:lvl w:ilvl="0" w:tplc="30E63734">
+      <w:start w:val="3"/>
       <w:numFmt w:val="bullet"/>
       <w:lvlText w:val="-"/>
       <w:lvlJc w:val="left"/>
@@ -5347,10 +4377,10 @@
     </w:lvl>
   </w:abstractNum>
   <w:abstractNum w:abstractNumId="2" w15:restartNumberingAfterBreak="0">
-    <w:nsid w:val="705B28B7"/>
+    <w:nsid w:val="65192E1F"/>
     <w:multiLevelType w:val="hybridMultilevel"/>
-    <w:tmpl w:val="A9BAAEC2"/>
-    <w:lvl w:ilvl="0" w:tplc="4E1AB468">
+    <w:tmpl w:val="570865AE"/>
+    <w:lvl w:ilvl="0" w:tplc="294A4108">
       <w:numFmt w:val="bullet"/>
       <w:lvlText w:val="-"/>
       <w:lvlJc w:val="left"/>
@@ -5459,10 +4489,10 @@
     </w:lvl>
   </w:abstractNum>
   <w:abstractNum w:abstractNumId="3" w15:restartNumberingAfterBreak="0">
-    <w:nsid w:val="742F1095"/>
+    <w:nsid w:val="705B28B7"/>
     <w:multiLevelType w:val="hybridMultilevel"/>
-    <w:tmpl w:val="EE3646E2"/>
-    <w:lvl w:ilvl="0" w:tplc="0DCEF412">
+    <w:tmpl w:val="A9BAAEC2"/>
+    <w:lvl w:ilvl="0" w:tplc="4E1AB468">
       <w:numFmt w:val="bullet"/>
       <w:lvlText w:val="-"/>
       <w:lvlJc w:val="left"/>
@@ -5570,23 +4600,254 @@
       </w:rPr>
     </w:lvl>
   </w:abstractNum>
+  <w:abstractNum w:abstractNumId="4" w15:restartNumberingAfterBreak="0">
+    <w:nsid w:val="72F14B69"/>
+    <w:multiLevelType w:val="hybridMultilevel"/>
+    <w:tmpl w:val="9D10DF64"/>
+    <w:lvl w:ilvl="0" w:tplc="A98E2A06">
+      <w:start w:val="3"/>
+      <w:numFmt w:val="bullet"/>
+      <w:lvlText w:val="-"/>
+      <w:lvlJc w:val="left"/>
+      <w:pPr>
+        <w:ind w:left="720" w:hanging="360"/>
+      </w:pPr>
+      <w:rPr>
+        <w:rFonts w:ascii="Calibri" w:eastAsiaTheme="minorHAnsi" w:hAnsi="Calibri" w:cs="Calibri" w:hint="default"/>
+      </w:rPr>
+    </w:lvl>
+    <w:lvl w:ilvl="1" w:tplc="04090003" w:tentative="1">
+      <w:start w:val="1"/>
+      <w:numFmt w:val="bullet"/>
+      <w:lvlText w:val="o"/>
+      <w:lvlJc w:val="left"/>
+      <w:pPr>
+        <w:ind w:left="1440" w:hanging="360"/>
+      </w:pPr>
+      <w:rPr>
+        <w:rFonts w:ascii="Courier New" w:hAnsi="Courier New" w:cs="Courier New" w:hint="default"/>
+      </w:rPr>
+    </w:lvl>
+    <w:lvl w:ilvl="2" w:tplc="04090005" w:tentative="1">
+      <w:start w:val="1"/>
+      <w:numFmt w:val="bullet"/>
+      <w:lvlText w:val=""/>
+      <w:lvlJc w:val="left"/>
+      <w:pPr>
+        <w:ind w:left="2160" w:hanging="360"/>
+      </w:pPr>
+      <w:rPr>
+        <w:rFonts w:ascii="Wingdings" w:hAnsi="Wingdings" w:hint="default"/>
+      </w:rPr>
+    </w:lvl>
+    <w:lvl w:ilvl="3" w:tplc="04090001" w:tentative="1">
+      <w:start w:val="1"/>
+      <w:numFmt w:val="bullet"/>
+      <w:lvlText w:val=""/>
+      <w:lvlJc w:val="left"/>
+      <w:pPr>
+        <w:ind w:left="2880" w:hanging="360"/>
+      </w:pPr>
+      <w:rPr>
+        <w:rFonts w:ascii="Symbol" w:hAnsi="Symbol" w:hint="default"/>
+      </w:rPr>
+    </w:lvl>
+    <w:lvl w:ilvl="4" w:tplc="04090003" w:tentative="1">
+      <w:start w:val="1"/>
+      <w:numFmt w:val="bullet"/>
+      <w:lvlText w:val="o"/>
+      <w:lvlJc w:val="left"/>
+      <w:pPr>
+        <w:ind w:left="3600" w:hanging="360"/>
+      </w:pPr>
+      <w:rPr>
+        <w:rFonts w:ascii="Courier New" w:hAnsi="Courier New" w:cs="Courier New" w:hint="default"/>
+      </w:rPr>
+    </w:lvl>
+    <w:lvl w:ilvl="5" w:tplc="04090005" w:tentative="1">
+      <w:start w:val="1"/>
+      <w:numFmt w:val="bullet"/>
+      <w:lvlText w:val=""/>
+      <w:lvlJc w:val="left"/>
+      <w:pPr>
+        <w:ind w:left="4320" w:hanging="360"/>
+      </w:pPr>
+      <w:rPr>
+        <w:rFonts w:ascii="Wingdings" w:hAnsi="Wingdings" w:hint="default"/>
+      </w:rPr>
+    </w:lvl>
+    <w:lvl w:ilvl="6" w:tplc="04090001" w:tentative="1">
+      <w:start w:val="1"/>
+      <w:numFmt w:val="bullet"/>
+      <w:lvlText w:val=""/>
+      <w:lvlJc w:val="left"/>
+      <w:pPr>
+        <w:ind w:left="5040" w:hanging="360"/>
+      </w:pPr>
+      <w:rPr>
+        <w:rFonts w:ascii="Symbol" w:hAnsi="Symbol" w:hint="default"/>
+      </w:rPr>
+    </w:lvl>
+    <w:lvl w:ilvl="7" w:tplc="04090003" w:tentative="1">
+      <w:start w:val="1"/>
+      <w:numFmt w:val="bullet"/>
+      <w:lvlText w:val="o"/>
+      <w:lvlJc w:val="left"/>
+      <w:pPr>
+        <w:ind w:left="5760" w:hanging="360"/>
+      </w:pPr>
+      <w:rPr>
+        <w:rFonts w:ascii="Courier New" w:hAnsi="Courier New" w:cs="Courier New" w:hint="default"/>
+      </w:rPr>
+    </w:lvl>
+    <w:lvl w:ilvl="8" w:tplc="04090005" w:tentative="1">
+      <w:start w:val="1"/>
+      <w:numFmt w:val="bullet"/>
+      <w:lvlText w:val=""/>
+      <w:lvlJc w:val="left"/>
+      <w:pPr>
+        <w:ind w:left="6480" w:hanging="360"/>
+      </w:pPr>
+      <w:rPr>
+        <w:rFonts w:ascii="Wingdings" w:hAnsi="Wingdings" w:hint="default"/>
+      </w:rPr>
+    </w:lvl>
+  </w:abstractNum>
+  <w:abstractNum w:abstractNumId="5" w15:restartNumberingAfterBreak="0">
+    <w:nsid w:val="742F1095"/>
+    <w:multiLevelType w:val="hybridMultilevel"/>
+    <w:tmpl w:val="EE3646E2"/>
+    <w:lvl w:ilvl="0" w:tplc="0DCEF412">
+      <w:numFmt w:val="bullet"/>
+      <w:lvlText w:val="-"/>
+      <w:lvlJc w:val="left"/>
+      <w:pPr>
+        <w:ind w:left="720" w:hanging="360"/>
+      </w:pPr>
+      <w:rPr>
+        <w:rFonts w:ascii="Calibri" w:eastAsiaTheme="minorHAnsi" w:hAnsi="Calibri" w:cs="Calibri" w:hint="default"/>
+      </w:rPr>
+    </w:lvl>
+    <w:lvl w:ilvl="1" w:tplc="04090003" w:tentative="1">
+      <w:start w:val="1"/>
+      <w:numFmt w:val="bullet"/>
+      <w:lvlText w:val="o"/>
+      <w:lvlJc w:val="left"/>
+      <w:pPr>
+        <w:ind w:left="1440" w:hanging="360"/>
+      </w:pPr>
+      <w:rPr>
+        <w:rFonts w:ascii="Courier New" w:hAnsi="Courier New" w:cs="Courier New" w:hint="default"/>
+      </w:rPr>
+    </w:lvl>
+    <w:lvl w:ilvl="2" w:tplc="04090005" w:tentative="1">
+      <w:start w:val="1"/>
+      <w:numFmt w:val="bullet"/>
+      <w:lvlText w:val=""/>
+      <w:lvlJc w:val="left"/>
+      <w:pPr>
+        <w:ind w:left="2160" w:hanging="360"/>
+      </w:pPr>
+      <w:rPr>
+        <w:rFonts w:ascii="Wingdings" w:hAnsi="Wingdings" w:hint="default"/>
+      </w:rPr>
+    </w:lvl>
+    <w:lvl w:ilvl="3" w:tplc="04090001" w:tentative="1">
+      <w:start w:val="1"/>
+      <w:numFmt w:val="bullet"/>
+      <w:lvlText w:val=""/>
+      <w:lvlJc w:val="left"/>
+      <w:pPr>
+        <w:ind w:left="2880" w:hanging="360"/>
+      </w:pPr>
+      <w:rPr>
+        <w:rFonts w:ascii="Symbol" w:hAnsi="Symbol" w:hint="default"/>
+      </w:rPr>
+    </w:lvl>
+    <w:lvl w:ilvl="4" w:tplc="04090003" w:tentative="1">
+      <w:start w:val="1"/>
+      <w:numFmt w:val="bullet"/>
+      <w:lvlText w:val="o"/>
+      <w:lvlJc w:val="left"/>
+      <w:pPr>
+        <w:ind w:left="3600" w:hanging="360"/>
+      </w:pPr>
+      <w:rPr>
+        <w:rFonts w:ascii="Courier New" w:hAnsi="Courier New" w:cs="Courier New" w:hint="default"/>
+      </w:rPr>
+    </w:lvl>
+    <w:lvl w:ilvl="5" w:tplc="04090005" w:tentative="1">
+      <w:start w:val="1"/>
+      <w:numFmt w:val="bullet"/>
+      <w:lvlText w:val=""/>
+      <w:lvlJc w:val="left"/>
+      <w:pPr>
+        <w:ind w:left="4320" w:hanging="360"/>
+      </w:pPr>
+      <w:rPr>
+        <w:rFonts w:ascii="Wingdings" w:hAnsi="Wingdings" w:hint="default"/>
+      </w:rPr>
+    </w:lvl>
+    <w:lvl w:ilvl="6" w:tplc="04090001" w:tentative="1">
+      <w:start w:val="1"/>
+      <w:numFmt w:val="bullet"/>
+      <w:lvlText w:val=""/>
+      <w:lvlJc w:val="left"/>
+      <w:pPr>
+        <w:ind w:left="5040" w:hanging="360"/>
+      </w:pPr>
+      <w:rPr>
+        <w:rFonts w:ascii="Symbol" w:hAnsi="Symbol" w:hint="default"/>
+      </w:rPr>
+    </w:lvl>
+    <w:lvl w:ilvl="7" w:tplc="04090003" w:tentative="1">
+      <w:start w:val="1"/>
+      <w:numFmt w:val="bullet"/>
+      <w:lvlText w:val="o"/>
+      <w:lvlJc w:val="left"/>
+      <w:pPr>
+        <w:ind w:left="5760" w:hanging="360"/>
+      </w:pPr>
+      <w:rPr>
+        <w:rFonts w:ascii="Courier New" w:hAnsi="Courier New" w:cs="Courier New" w:hint="default"/>
+      </w:rPr>
+    </w:lvl>
+    <w:lvl w:ilvl="8" w:tplc="04090005" w:tentative="1">
+      <w:start w:val="1"/>
+      <w:numFmt w:val="bullet"/>
+      <w:lvlText w:val=""/>
+      <w:lvlJc w:val="left"/>
+      <w:pPr>
+        <w:ind w:left="6480" w:hanging="360"/>
+      </w:pPr>
+      <w:rPr>
+        <w:rFonts w:ascii="Wingdings" w:hAnsi="Wingdings" w:hint="default"/>
+      </w:rPr>
+    </w:lvl>
+  </w:abstractNum>
   <w:num w:numId="1" w16cid:durableId="499468754">
     <w:abstractNumId w:val="0"/>
   </w:num>
   <w:num w:numId="2" w16cid:durableId="1438602086">
+    <w:abstractNumId w:val="3"/>
+  </w:num>
+  <w:num w:numId="3" w16cid:durableId="1554728270">
+    <w:abstractNumId w:val="5"/>
+  </w:num>
+  <w:num w:numId="4" w16cid:durableId="1321739670">
     <w:abstractNumId w:val="2"/>
   </w:num>
-  <w:num w:numId="3" w16cid:durableId="1554728270">
-    <w:abstractNumId w:val="3"/>
+  <w:num w:numId="5" w16cid:durableId="967129236">
+    <w:abstractNumId w:val="4"/>
   </w:num>
-  <w:num w:numId="4" w16cid:durableId="1321739670">
+  <w:num w:numId="6" w16cid:durableId="1839661299">
     <w:abstractNumId w:val="1"/>
   </w:num>
 </w:numbering>
 </file>
 
 <file path=word/people.xml><?xml version="1.0" encoding="utf-8"?>
-<w15:people xmlns:wpc="http://schemas.microsoft.com/office/word/2010/wordprocessingCanvas" xmlns:cx="http://schemas.microsoft.com/office/drawing/2014/chartex" xmlns:cx1="http://schemas.microsoft.com/office/drawing/2015/9/8/chartex" xmlns:cx2="http://schemas.microsoft.com/office/drawing/2015/10/21/chartex" xmlns:cx3="http://schemas.microsoft.com/office/drawing/2016/5/9/chartex" xmlns:cx4="http://schemas.microsoft.com/office/drawing/2016/5/10/chartex" xmlns:cx5="http://schemas.microsoft.com/office/drawing/2016/5/11/chartex" xmlns:cx6="http://schemas.microsoft.com/office/drawing/2016/5/12/chartex" xmlns:cx7="http://schemas.microsoft.com/office/drawing/2016/5/13/chartex" xmlns:cx8="http://schemas.microsoft.com/office/drawing/2016/5/14/chartex" xmlns:mc="http://schemas.openxmlformats.org/markup-compatibility/2006" xmlns:m="http://schemas.openxmlformats.org/officeDocument/2006/math" xmlns:aink="http://schemas.microsoft.com/office/drawing/2016/ink" xmlns:am3d="http://schemas.microsoft.com/office/drawing/2017/model3d" xmlns:oel="http://schemas.microsoft.com/office/2019/extlst" xmlns:r="http://schemas.openxmlformats.org/officeDocument/2006/relationships" xmlns:wp14="http://schemas.microsoft.com/office/word/2010/wordprocessingDrawing" xmlns:wp="http://schemas.openxmlformats.org/drawingml/2006/wordprocessingDrawing" xmlns:wpg="http://schemas.microsoft.com/office/word/2010/wordprocessingGroup" xmlns:wpi="http://schemas.microsoft.com/office/word/2010/wordprocessingInk" xmlns:wps="http://schemas.microsoft.com/office/word/2010/wordprocessingShape" xmlns:o="urn:schemas-microsoft-com:office:office" xmlns:v="urn:schemas-microsoft-com:vml" xmlns:w10="urn:schemas-microsoft-com:office:word" xmlns:w="http://schemas.openxmlformats.org/wordprocessingml/2006/main" xmlns:w14="http://schemas.microsoft.com/office/word/2010/wordml" xmlns:w15="http://schemas.microsoft.com/office/word/2012/wordml" xmlns:w16cei="http://schemas.microsoft.com/office/word/2026/wordml/cei" xmlns:w16cex="http://schemas.microsoft.com/office/word/2018/wordml/cex" xmlns:w16cid="http://schemas.microsoft.com/office/word/2016/wordml/cid" xmlns:w16="http://schemas.microsoft.com/office/word/2018/wordml" xmlns:w16sdtdh="http://schemas.microsoft.com/office/word/2020/wordml/sdtdatahash" xmlns:w16sdtfl="http://schemas.microsoft.com/office/word/2024/wordml/sdtformatlock" xmlns:w16se="http://schemas.microsoft.com/office/word/2015/wordml/symex" xmlns:w16du="http://schemas.microsoft.com/office/word/2023/wordml/word16du" xmlns:wne="http://schemas.microsoft.com/office/word/2006/wordml" mc:Ignorable="w14 w15 w16se w16cid w16 w16cex w16sdtdh w16sdtfl w16du wp14">
+<w15:people xmlns:wpc="http://schemas.microsoft.com/office/word/2010/wordprocessingCanvas" xmlns:cx="http://schemas.microsoft.com/office/drawing/2014/chartex" xmlns:cx1="http://schemas.microsoft.com/office/drawing/2015/9/8/chartex" xmlns:cx2="http://schemas.microsoft.com/office/drawing/2015/10/21/chartex" xmlns:cx3="http://schemas.microsoft.com/office/drawing/2016/5/9/chartex" xmlns:cx4="http://schemas.microsoft.com/office/drawing/2016/5/10/chartex" xmlns:cx5="http://schemas.microsoft.com/office/drawing/2016/5/11/chartex" xmlns:cx6="http://schemas.microsoft.com/office/drawing/2016/5/12/chartex" xmlns:cx7="http://schemas.microsoft.com/office/drawing/2016/5/13/chartex" xmlns:cx8="http://schemas.microsoft.com/office/drawing/2016/5/14/chartex" xmlns:mc="http://schemas.openxmlformats.org/markup-compatibility/2006" xmlns:m="http://schemas.openxmlformats.org/officeDocument/2006/math" xmlns:aink="http://schemas.microsoft.com/office/drawing/2016/ink" xmlns:am3d="http://schemas.microsoft.com/office/drawing/2017/model3d" xmlns:oel="http://schemas.microsoft.com/office/2019/extlst" xmlns:r="http://schemas.openxmlformats.org/officeDocument/2006/relationships" xmlns:wp14="http://schemas.microsoft.com/office/word/2010/wordprocessingDrawing" xmlns:wp="http://schemas.openxmlformats.org/drawingml/2006/wordprocessingDrawing" xmlns:wpg="http://schemas.microsoft.com/office/word/2010/wordprocessingGroup" xmlns:wpi="http://schemas.microsoft.com/office/word/2010/wordprocessingInk" xmlns:wps="http://schemas.microsoft.com/office/word/2010/wordprocessingShape" xmlns:o="urn:schemas-microsoft-com:office:office" xmlns:v="urn:schemas-microsoft-com:vml" xmlns:w10="urn:schemas-microsoft-com:office:word" xmlns:w="http://schemas.openxmlformats.org/wordprocessingml/2006/main" xmlns:w14="http://schemas.microsoft.com/office/word/2010/wordml" xmlns:w15="http://schemas.microsoft.com/office/word/2012/wordml" xmlns:w16cex="http://schemas.microsoft.com/office/word/2018/wordml/cex" xmlns:w16cid="http://schemas.microsoft.com/office/word/2016/wordml/cid" xmlns:w16="http://schemas.microsoft.com/office/word/2018/wordml" xmlns:w16sdtdh="http://schemas.microsoft.com/office/word/2020/wordml/sdtdatahash" xmlns:w16sdtfl="http://schemas.microsoft.com/office/word/2024/wordml/sdtformatlock" xmlns:w16se="http://schemas.microsoft.com/office/word/2015/wordml/symex" xmlns:w16du="http://schemas.microsoft.com/office/word/2023/wordml/word16du" xmlns:wne="http://schemas.microsoft.com/office/word/2006/wordml" mc:Ignorable="w14 w15 w16se w16cid w16 w16cex w16sdtdh w16sdtfl w16du wp14">
   <w15:person w15:author="Kelsey McCune">
     <w15:presenceInfo w15:providerId="None" w15:userId="Kelsey McCune"/>
   </w15:person>

</xml_diff>

<commit_message>
Update summary in description
Added Human Dimensions articles (4)
Added planned analysis for survey, and timeline to Thesis Proposal
Added Survey documents
</commit_message>
<xml_diff>
--- a/Documents /MS Thesis Proposal.docx
+++ b/Documents /MS Thesis Proposal.docx
@@ -484,7 +484,31 @@
         <w:rPr>
           <w:u w:val="single"/>
         </w:rPr>
-        <w:t>Residential yards are increasingly recognized as a distinct human-wildlife interface where companion animals, backyard livestock, peri-domestic wildlife, and people share space and anthropogenic resources, creating pathways for zoonotic spillover that differ from those in either purely wild or agricultural settings (Gamble et al. 2023). This aligns with broader evidence that urbanization and the intensification of contact among humans, domestic animals, and wildlife are principal drivers of pathogen emergence at shared interfaces (Hassell et al. 2017).</w:t>
+        <w:t xml:space="preserve">Residential yards are increasingly recognized as human-wildlife interface where companion animals, backyard livestock, peri-domestic wildlife, and people share space and anthropogenic resources, creating pathways for zoonotic spillover that differ from those in either wild or agricultural settings (Gamble et al. 2023). This aligns with broader evidence that urbanization and </w:t>
+      </w:r>
+      <w:r>
+        <w:rPr>
+          <w:u w:val="single"/>
+        </w:rPr>
+        <w:t>increased</w:t>
+      </w:r>
+      <w:r>
+        <w:rPr>
+          <w:u w:val="single"/>
+        </w:rPr>
+        <w:t xml:space="preserve"> contact among humans, domestic animals, and wildlife are </w:t>
+      </w:r>
+      <w:r>
+        <w:rPr>
+          <w:u w:val="single"/>
+        </w:rPr>
+        <w:t>primary</w:t>
+      </w:r>
+      <w:r>
+        <w:rPr>
+          <w:u w:val="single"/>
+        </w:rPr>
+        <w:t xml:space="preserve"> drivers of pathogen emergence at shared interfaces (Hassell et al. 2017).</w:t>
       </w:r>
       <w:commentRangeEnd w:id="12"/>
       <w:r>
@@ -2100,7 +2124,19 @@
         <w:rPr>
           <w:u w:val="single"/>
         </w:rPr>
-        <w:t xml:space="preserve">, which proliferates more readily in warmer ambient conditions; systematic review has linked rising air temperature to increased </w:t>
+        <w:t xml:space="preserve">, which </w:t>
+      </w:r>
+      <w:r>
+        <w:rPr>
+          <w:u w:val="single"/>
+        </w:rPr>
+        <w:t>persists</w:t>
+      </w:r>
+      <w:r>
+        <w:rPr>
+          <w:u w:val="single"/>
+        </w:rPr>
+        <w:t xml:space="preserve"> more readily in warmer ambient conditions; systematic review has linked rising air temperature to increased </w:t>
       </w:r>
       <w:r>
         <w:rPr>
@@ -3506,16 +3542,18 @@
       <w:r>
         <w:t>data to evaluate the relationship between disease risk perception, biosecurity practice engagement, and actual infection rates at each site.</w:t>
       </w:r>
-    </w:p>
-    <w:p>
-      <w:pPr>
-        <w:rPr>
-          <w:ins w:id="97" w:author="Kelsey McCune" w:date="2026-07-09T09:51:00Z" w16du:dateUtc="2026-07-09T14:51:00Z"/>
+      <w:r>
+        <w:t xml:space="preserve"> </w:t>
+      </w:r>
+    </w:p>
+    <w:p>
+      <w:pPr>
+        <w:rPr>
           <w:b/>
           <w:bCs/>
         </w:rPr>
       </w:pPr>
-      <w:ins w:id="98" w:author="Kelsey McCune" w:date="2026-07-09T09:50:00Z" w16du:dateUtc="2026-07-09T14:50:00Z">
+      <w:ins w:id="97" w:author="Kelsey McCune" w:date="2026-07-09T09:50:00Z" w16du:dateUtc="2026-07-09T14:50:00Z">
         <w:r>
           <w:rPr>
             <w:b/>
@@ -3523,7 +3561,7 @@
           </w:rPr>
           <w:t xml:space="preserve">Planned Analysis of Survey </w:t>
         </w:r>
-        <w:commentRangeStart w:id="99"/>
+        <w:commentRangeStart w:id="98"/>
         <w:r>
           <w:rPr>
             <w:b/>
@@ -3532,20 +3570,67 @@
           <w:t>Data</w:t>
         </w:r>
       </w:ins>
-      <w:commentRangeEnd w:id="99"/>
+      <w:commentRangeEnd w:id="98"/>
       <w:r>
         <w:rPr>
           <w:rStyle w:val="CommentReference"/>
           <w:sz w:val="24"/>
           <w:szCs w:val="24"/>
         </w:rPr>
-        <w:commentReference w:id="99"/>
-      </w:r>
-      <w:del w:id="100" w:author="Kelsey McCune" w:date="2026-07-09T09:50:00Z" w16du:dateUtc="2026-07-09T14:50:00Z">
+        <w:commentReference w:id="98"/>
+      </w:r>
+      <w:del w:id="99" w:author="Kelsey McCune" w:date="2026-07-09T09:50:00Z" w16du:dateUtc="2026-07-09T14:50:00Z">
         <w:r>
           <w:br w:type="page"/>
         </w:r>
       </w:del>
+    </w:p>
+    <w:p>
+      <w:pPr>
+        <w:rPr>
+          <w:rFonts w:ascii="Arial" w:eastAsiaTheme="minorEastAsia" w:hAnsi="Arial" w:cs="Arial"/>
+          <w:i/>
+          <w:iCs/>
+          <w:kern w:val="0"/>
+          <w:sz w:val="22"/>
+          <w:szCs w:val="22"/>
+          <w14:ligatures w14:val="none"/>
+        </w:rPr>
+      </w:pPr>
+      <w:r>
+        <w:rPr>
+          <w:rFonts w:ascii="Arial" w:eastAsiaTheme="minorEastAsia" w:hAnsi="Arial" w:cs="Arial"/>
+          <w:i/>
+          <w:iCs/>
+          <w:kern w:val="0"/>
+          <w:sz w:val="22"/>
+          <w:szCs w:val="22"/>
+          <w14:ligatures w14:val="none"/>
+        </w:rPr>
+        <w:t xml:space="preserve">Survey data will be analyzed using both descriptive and inferential statistics. Descriptive statistics (e.g., frequencies, percentages, means, and standard deviations) will be used to summarize participant characteristics and responses across the main survey concepts, including motivations, place attachment, disease-risk perception, biosecurity practices, and pro-conservation attitudes and behaviors. Inferential statistics will then be used to examine relationships among these variables. For example, correlation analyses, chi-square tests of association, or regression models to assess whether factors such as disease-risk perception or zoonotic disease knowledge are associated with reported biosecurity practices or willingness to </w:t>
+      </w:r>
+      <w:r>
+        <w:rPr>
+          <w:rFonts w:ascii="Arial" w:eastAsiaTheme="minorEastAsia" w:hAnsi="Arial" w:cs="Arial"/>
+          <w:i/>
+          <w:iCs/>
+          <w:kern w:val="0"/>
+          <w:sz w:val="22"/>
+          <w:szCs w:val="22"/>
+          <w14:ligatures w14:val="none"/>
+        </w:rPr>
+        <w:lastRenderedPageBreak/>
+        <w:t>modify backyard behaviors. Given the novel and exploratory nature of this research and the anticipated sample size, analyses will emphasize describing patterns and generating hypotheses rather than confirmatory hypothesis testing. All analyses will be conducted using standard statistical software.</w:t>
+      </w:r>
+    </w:p>
+    <w:p>
+      <w:pPr>
+        <w:rPr>
+          <w:ins w:id="100" w:author="Kelsey McCune" w:date="2026-07-09T09:51:00Z" w16du:dateUtc="2026-07-09T14:51:00Z"/>
+          <w:b/>
+          <w:bCs/>
+        </w:rPr>
+      </w:pPr>
     </w:p>
     <w:p>
       <w:pPr>
@@ -3648,7 +3733,6 @@
       </w:pPr>
       <w:ins w:id="108" w:author="Alex Fisher" w:date="2026-07-09T14:33:00Z" w16du:dateUtc="2026-07-09T19:33:00Z">
         <w:r>
-          <w:lastRenderedPageBreak/>
           <w:t>Prelim</w:t>
         </w:r>
       </w:ins>
@@ -3771,7 +3855,58 @@
         </w:r>
       </w:ins>
     </w:p>
-    <w:p/>
+    <w:p>
+      <w:r>
+        <w:rPr>
+          <w:noProof/>
+        </w:rPr>
+        <w:lastRenderedPageBreak/>
+        <w:drawing>
+          <wp:inline distT="0" distB="0" distL="0" distR="0" wp14:anchorId="1EF6D284" wp14:editId="1FC77DEC">
+            <wp:extent cx="7649377" cy="2317426"/>
+            <wp:effectExtent l="0" t="0" r="0" b="0"/>
+            <wp:docPr id="1738045177" name="Picture 1"/>
+            <wp:cNvGraphicFramePr>
+              <a:graphicFrameLocks xmlns:a="http://schemas.openxmlformats.org/drawingml/2006/main" noChangeAspect="1"/>
+            </wp:cNvGraphicFramePr>
+            <a:graphic xmlns:a="http://schemas.openxmlformats.org/drawingml/2006/main">
+              <a:graphicData uri="http://schemas.openxmlformats.org/drawingml/2006/picture">
+                <pic:pic xmlns:pic="http://schemas.openxmlformats.org/drawingml/2006/picture">
+                  <pic:nvPicPr>
+                    <pic:cNvPr id="1738045177" name="Picture 1738045177"/>
+                    <pic:cNvPicPr/>
+                  </pic:nvPicPr>
+                  <pic:blipFill rotWithShape="1">
+                    <a:blip r:embed="rId21"/>
+                    <a:srcRect l="5294" t="12466" r="12994" b="52501"/>
+                    <a:stretch>
+                      <a:fillRect/>
+                    </a:stretch>
+                  </pic:blipFill>
+                  <pic:spPr bwMode="auto">
+                    <a:xfrm>
+                      <a:off x="0" y="0"/>
+                      <a:ext cx="7785052" cy="2358530"/>
+                    </a:xfrm>
+                    <a:prstGeom prst="rect">
+                      <a:avLst/>
+                    </a:prstGeom>
+                    <a:ln>
+                      <a:noFill/>
+                    </a:ln>
+                    <a:extLst>
+                      <a:ext uri="{53640926-AAD7-44D8-BBD7-CCE9431645EC}">
+                        <a14:shadowObscured xmlns:a14="http://schemas.microsoft.com/office/drawing/2010/main"/>
+                      </a:ext>
+                    </a:extLst>
+                  </pic:spPr>
+                </pic:pic>
+              </a:graphicData>
+            </a:graphic>
+          </wp:inline>
+        </w:drawing>
+      </w:r>
+    </w:p>
     <w:sectPr>
       <w:pgSz w:w="12240" w:h="15840"/>
       <w:pgMar w:top="1440" w:right="1440" w:bottom="1440" w:left="1440" w:header="720" w:footer="720" w:gutter="0"/>
@@ -4039,7 +4174,7 @@
       </w:r>
     </w:p>
   </w:comment>
-  <w:comment w:id="99" w:author="Alex Fisher" w:date="2026-07-09T14:23:00Z" w:initials="AF">
+  <w:comment w:id="98" w:author="Alex Fisher" w:date="2026-07-09T14:23:00Z" w:initials="AF">
     <w:p>
       <w:r>
         <w:rPr>
@@ -4961,7 +5096,7 @@
     <w:lsdException w:name="Body Text 3" w:semiHidden="1" w:unhideWhenUsed="1"/>
     <w:lsdException w:name="Body Text Indent 2" w:semiHidden="1" w:unhideWhenUsed="1"/>
     <w:lsdException w:name="Body Text Indent 3" w:semiHidden="1" w:unhideWhenUsed="1"/>
-    <w:lsdException w:name="Block Text" w:semiHidden="1" w:unhideWhenUsed="1"/>
+    <w:lsdException w:name="Block Text" w:semiHidden="1" w:uiPriority="0" w:unhideWhenUsed="1"/>
     <w:lsdException w:name="Hyperlink" w:semiHidden="1" w:unhideWhenUsed="1"/>
     <w:lsdException w:name="FollowedHyperlink" w:semiHidden="1" w:unhideWhenUsed="1"/>
     <w:lsdException w:name="Strong" w:uiPriority="22" w:qFormat="1"/>
@@ -5963,6 +6098,49 @@
       </w:tblBorders>
     </w:tblPr>
   </w:style>
+  <w:style w:type="paragraph" w:styleId="BlockText">
+    <w:name w:val="Block Text"/>
+    <w:basedOn w:val="Normal"/>
+    <w:link w:val="BlockTextChar"/>
+    <w:unhideWhenUsed/>
+    <w:rsid w:val="000937EE"/>
+    <w:pPr>
+      <w:pBdr>
+        <w:top w:val="single" w:sz="2" w:space="10" w:color="4472C4" w:themeColor="accent1"/>
+        <w:left w:val="single" w:sz="2" w:space="10" w:color="4472C4" w:themeColor="accent1"/>
+        <w:bottom w:val="single" w:sz="2" w:space="10" w:color="4472C4" w:themeColor="accent1"/>
+        <w:right w:val="single" w:sz="2" w:space="10" w:color="4472C4" w:themeColor="accent1"/>
+      </w:pBdr>
+      <w:autoSpaceDE w:val="0"/>
+      <w:autoSpaceDN w:val="0"/>
+      <w:adjustRightInd w:val="0"/>
+      <w:spacing w:after="0" w:line="240" w:lineRule="auto"/>
+      <w:ind w:left="1152" w:right="1152"/>
+    </w:pPr>
+    <w:rPr>
+      <w:rFonts w:eastAsiaTheme="minorEastAsia"/>
+      <w:i/>
+      <w:iCs/>
+      <w:color w:val="4472C4" w:themeColor="accent1"/>
+      <w:kern w:val="0"/>
+      <w:szCs w:val="22"/>
+      <w14:ligatures w14:val="none"/>
+    </w:rPr>
+  </w:style>
+  <w:style w:type="character" w:customStyle="1" w:styleId="BlockTextChar">
+    <w:name w:val="Block Text Char"/>
+    <w:link w:val="BlockText"/>
+    <w:rsid w:val="000937EE"/>
+    <w:rPr>
+      <w:rFonts w:eastAsiaTheme="minorEastAsia"/>
+      <w:i/>
+      <w:iCs/>
+      <w:color w:val="4472C4" w:themeColor="accent1"/>
+      <w:kern w:val="0"/>
+      <w:szCs w:val="22"/>
+      <w14:ligatures w14:val="none"/>
+    </w:rPr>
+  </w:style>
 </w:styles>
 </file>
 

</xml_diff>

<commit_message>
updated proposal and survey doc's
</commit_message>
<xml_diff>
--- a/Documents /MS Thesis Proposal.docx
+++ b/Documents /MS Thesis Proposal.docx
@@ -50,32 +50,14 @@
       <w:r>
         <w:t>Birds are among the most well-studied and widespread taxa in the animal kingdom, filling critical roles in ecosystems worldwide through mechanisms such as insect control, pollination, seed dispersal and more</w:t>
       </w:r>
-      <w:ins w:id="0" w:author="Kelsey McCune" w:date="2026-07-09T08:38:00Z" w16du:dateUtc="2026-07-09T13:38:00Z">
-        <w:r>
-          <w:t xml:space="preserve"> (Whelan et al., 2015)</w:t>
-        </w:r>
-      </w:ins>
+      <w:r>
+        <w:t xml:space="preserve"> (Whelan et al., 2015)</w:t>
+      </w:r>
       <w:r>
         <w:t xml:space="preserve">. </w:t>
       </w:r>
       <w:r>
-        <w:t>While many bird species have adapted</w:t>
-      </w:r>
-      <w:del w:id="1" w:author="Kelsey McCune" w:date="2026-07-09T08:39:00Z" w16du:dateUtc="2026-07-09T13:39:00Z">
-        <w:r>
-          <w:delText xml:space="preserve"> to</w:delText>
-        </w:r>
-      </w:del>
-      <w:r>
-        <w:t xml:space="preserve"> </w:t>
-      </w:r>
-      <w:del w:id="2" w:author="Kelsey McCune" w:date="2026-07-09T08:40:00Z" w16du:dateUtc="2026-07-09T13:40:00Z">
-        <w:r>
-          <w:delText xml:space="preserve">a capacity </w:delText>
-        </w:r>
-      </w:del>
-      <w:r>
-        <w:t xml:space="preserve">to survive and even depend on human-modified landscapes, the ecological impacts of these co-adaptations, and how long-term proximity to humans, domestic animals, and shared resources influences pathogen dynamics in wild bird communities remain poorly understood </w:t>
+        <w:t xml:space="preserve">While many bird species have adapted to survive and even depend on human-modified landscapes, the ecological impacts of these co-adaptations, and how long-term proximity to humans, domestic animals, and shared resources influences pathogen dynamics in wild bird communities remain poorly understood </w:t>
       </w:r>
       <w:r>
         <w:t>(Bradley and Altizer 2007</w:t>
@@ -146,7 +128,6 @@
     <w:p>
       <w:pPr>
         <w:rPr>
-          <w:ins w:id="3" w:author="Kelsey McCune" w:date="2026-07-09T08:39:00Z" w16du:dateUtc="2026-07-09T13:39:00Z"/>
           <w:color w:val="000000" w:themeColor="text1"/>
           <w:sz w:val="13"/>
           <w:szCs w:val="13"/>
@@ -206,69 +187,38 @@
           <w:szCs w:val="13"/>
         </w:rPr>
       </w:pPr>
-      <w:ins w:id="4" w:author="Kelsey McCune" w:date="2026-07-09T08:39:00Z" w16du:dateUtc="2026-07-09T13:39:00Z">
-        <w:r>
-          <w:rPr>
-            <w:rFonts w:cstheme="minorHAnsi"/>
-            <w:color w:val="222222"/>
-            <w:sz w:val="13"/>
-            <w:szCs w:val="13"/>
-            <w:shd w:val="clear" w:color="auto" w:fill="FFFFFF"/>
-            <w:rPrChange w:id="5" w:author="Kelsey McCune" w:date="2026-07-09T08:39:00Z" w16du:dateUtc="2026-07-09T13:39:00Z">
-              <w:rPr>
-                <w:rFonts w:ascii="Arial" w:hAnsi="Arial" w:cs="Arial"/>
-                <w:color w:val="222222"/>
-                <w:sz w:val="20"/>
-                <w:szCs w:val="20"/>
-                <w:shd w:val="clear" w:color="auto" w:fill="FFFFFF"/>
-              </w:rPr>
-            </w:rPrChange>
-          </w:rPr>
-          <w:t>Whelan, Christopher J., Çağan H. Şekercioğlu, and Daniel G. Wenny. "Why birds matter: from economic ornithology to ecosystem services." </w:t>
-        </w:r>
-        <w:r>
-          <w:rPr>
-            <w:rFonts w:cstheme="minorHAnsi"/>
-            <w:i/>
-            <w:iCs/>
-            <w:color w:val="222222"/>
-            <w:sz w:val="13"/>
-            <w:szCs w:val="13"/>
-            <w:shd w:val="clear" w:color="auto" w:fill="FFFFFF"/>
-            <w:rPrChange w:id="6" w:author="Kelsey McCune" w:date="2026-07-09T08:39:00Z" w16du:dateUtc="2026-07-09T13:39:00Z">
-              <w:rPr>
-                <w:rFonts w:ascii="Arial" w:hAnsi="Arial" w:cs="Arial"/>
-                <w:i/>
-                <w:iCs/>
-                <w:color w:val="222222"/>
-                <w:sz w:val="20"/>
-                <w:szCs w:val="20"/>
-                <w:shd w:val="clear" w:color="auto" w:fill="FFFFFF"/>
-              </w:rPr>
-            </w:rPrChange>
-          </w:rPr>
-          <w:t>Journal of Ornithology</w:t>
-        </w:r>
-        <w:r>
-          <w:rPr>
-            <w:rFonts w:cstheme="minorHAnsi"/>
-            <w:color w:val="222222"/>
-            <w:sz w:val="13"/>
-            <w:szCs w:val="13"/>
-            <w:shd w:val="clear" w:color="auto" w:fill="FFFFFF"/>
-            <w:rPrChange w:id="7" w:author="Kelsey McCune" w:date="2026-07-09T08:39:00Z" w16du:dateUtc="2026-07-09T13:39:00Z">
-              <w:rPr>
-                <w:rFonts w:ascii="Arial" w:hAnsi="Arial" w:cs="Arial"/>
-                <w:color w:val="222222"/>
-                <w:sz w:val="20"/>
-                <w:szCs w:val="20"/>
-                <w:shd w:val="clear" w:color="auto" w:fill="FFFFFF"/>
-              </w:rPr>
-            </w:rPrChange>
-          </w:rPr>
-          <w:t> 156.Suppl 1 (2015): 227-238.</w:t>
-        </w:r>
-      </w:ins>
+      <w:r>
+        <w:rPr>
+          <w:rFonts w:cstheme="minorHAnsi"/>
+          <w:color w:val="222222"/>
+          <w:sz w:val="13"/>
+          <w:szCs w:val="13"/>
+          <w:shd w:val="clear" w:color="auto" w:fill="FFFFFF"/>
+        </w:rPr>
+        <w:t>Whelan, Christopher J., Çağan H. Şekercioğlu, and Daniel G. Wenny. "Why birds matter: from economic ornithology to ecosystem services." </w:t>
+      </w:r>
+      <w:r>
+        <w:rPr>
+          <w:rFonts w:cstheme="minorHAnsi"/>
+          <w:i/>
+          <w:iCs/>
+          <w:color w:val="222222"/>
+          <w:sz w:val="13"/>
+          <w:szCs w:val="13"/>
+          <w:shd w:val="clear" w:color="auto" w:fill="FFFFFF"/>
+        </w:rPr>
+        <w:t>Journal of Ornithology</w:t>
+      </w:r>
+      <w:r>
+        <w:rPr>
+          <w:rFonts w:cstheme="minorHAnsi"/>
+          <w:color w:val="222222"/>
+          <w:sz w:val="13"/>
+          <w:szCs w:val="13"/>
+          <w:shd w:val="clear" w:color="auto" w:fill="FFFFFF"/>
+        </w:rPr>
+        <w:t> 156.Suppl 1 (2015): 227-238.</w:t>
+      </w:r>
     </w:p>
     <w:p>
       <w:pPr>
@@ -337,180 +287,299 @@
       </w:r>
     </w:p>
     <w:p>
+      <w:r>
+        <w:t>Th</w:t>
+      </w:r>
+      <w:r>
+        <w:t>e prevalence of these activities</w:t>
+      </w:r>
+      <w:r>
+        <w:t xml:space="preserve"> creates opportunities for</w:t>
+      </w:r>
+      <w:r>
+        <w:t xml:space="preserve"> novel</w:t>
+      </w:r>
+      <w:r>
+        <w:t xml:space="preserve"> contact between wild bird species, chicken flocks, domestic pets and humans</w:t>
+      </w:r>
+      <w:r>
+        <w:t>, potentially leading to</w:t>
+      </w:r>
+      <w:r>
+        <w:t xml:space="preserve"> bidirectional transmission </w:t>
+      </w:r>
+      <w:r>
+        <w:t xml:space="preserve">(spillover) </w:t>
+      </w:r>
+      <w:r>
+        <w:t xml:space="preserve">of select pathogens carried by animals or contracted from the environment. </w:t>
+      </w:r>
+      <w:r>
+        <w:t>T</w:t>
+      </w:r>
+      <w:r>
+        <w:t xml:space="preserve">he </w:t>
+      </w:r>
+      <w:r>
+        <w:t>prevalence</w:t>
+      </w:r>
+      <w:r>
+        <w:t xml:space="preserve"> and spread of zoonotic diseases</w:t>
+      </w:r>
+      <w:r>
+        <w:t xml:space="preserve">, or </w:t>
+      </w:r>
+      <w:r>
+        <w:t>diseases shared between wildlife and humans</w:t>
+      </w:r>
+      <w:r>
+        <w:t xml:space="preserve">, </w:t>
+      </w:r>
+      <w:r>
+        <w:t xml:space="preserve">represents one of the most significant </w:t>
+      </w:r>
+      <w:r>
+        <w:t>effects</w:t>
+      </w:r>
+      <w:r>
+        <w:t xml:space="preserve"> of </w:t>
+      </w:r>
+      <w:r>
+        <w:t>growing</w:t>
+      </w:r>
+      <w:r>
+        <w:t xml:space="preserve"> contact</w:t>
+      </w:r>
+      <w:r>
+        <w:t xml:space="preserve"> at the human-wildlife interface</w:t>
+      </w:r>
+      <w:r>
+        <w:t xml:space="preserve">, with over 70% of </w:t>
+      </w:r>
+      <w:r>
+        <w:t xml:space="preserve">current human diseases </w:t>
+      </w:r>
+      <w:r>
+        <w:t>originating</w:t>
+      </w:r>
+      <w:r>
+        <w:t xml:space="preserve"> from wildlife </w:t>
+      </w:r>
+      <w:r>
+        <w:t xml:space="preserve">(Jones et al. 2008). </w:t>
+      </w:r>
+      <w:r>
+        <w:rPr>
+          <w:highlight w:val="yellow"/>
+        </w:rPr>
+        <w:t xml:space="preserve">Here you can introduce examples of zoonotic diseases from birds/chickens that most commonly affect </w:t>
+      </w:r>
+      <w:r>
+        <w:rPr>
+          <w:highlight w:val="yellow"/>
+        </w:rPr>
+        <w:t>humans,</w:t>
+      </w:r>
+      <w:r>
+        <w:rPr>
+          <w:highlight w:val="yellow"/>
+        </w:rPr>
+        <w:t xml:space="preserve"> so the mention of Salmonella and e coli below doesn’t come out of nowhere.</w:t>
+      </w:r>
+      <w:r>
+        <w:t xml:space="preserve"> </w:t>
+      </w:r>
+      <w:r>
+        <w:t>**</w:t>
+      </w:r>
+      <w:r>
+        <w:t>Wild b</w:t>
+      </w:r>
+      <w:r>
+        <w:t xml:space="preserve">irds and poultry are reservoirs for a range of pathogens affecting avian and human health, including avian influenza viruses, Newcastle disease virus, </w:t>
+      </w:r>
+      <w:r>
+        <w:rPr>
+          <w:i/>
+          <w:iCs/>
+        </w:rPr>
+        <w:t>Mycoplasma</w:t>
+      </w:r>
+      <w:r>
+        <w:t xml:space="preserve"> spp., </w:t>
+      </w:r>
+      <w:r>
+        <w:rPr>
+          <w:i/>
+          <w:iCs/>
+        </w:rPr>
+        <w:t>Chlamydia</w:t>
+      </w:r>
+      <w:r>
+        <w:t xml:space="preserve"> spp., and </w:t>
+      </w:r>
+      <w:r>
+        <w:rPr>
+          <w:i/>
+          <w:iCs/>
+        </w:rPr>
+        <w:t>Salmonella</w:t>
+      </w:r>
+      <w:r>
+        <w:t xml:space="preserve"> spp., a </w:t>
+      </w:r>
+      <w:r>
+        <w:t>few</w:t>
+      </w:r>
+      <w:r>
+        <w:t xml:space="preserve"> of which are zoonotic</w:t>
+      </w:r>
+      <w:r>
+        <w:rPr>
+          <w:i/>
+          <w:iCs/>
+        </w:rPr>
+        <w:t>.</w:t>
+      </w:r>
+      <w:r>
+        <w:t xml:space="preserve"> (</w:t>
+      </w:r>
+      <w:r>
+        <w:rPr>
+          <w:highlight w:val="yellow"/>
+        </w:rPr>
+        <w:t>CITE</w:t>
+      </w:r>
+      <w:r>
+        <w:t xml:space="preserve">). </w:t>
+      </w:r>
+      <w:r>
+        <w:t xml:space="preserve">Among these, </w:t>
+      </w:r>
+      <w:r>
+        <w:rPr>
+          <w:i/>
+          <w:iCs/>
+        </w:rPr>
+        <w:t>Salmonella enterica</w:t>
+      </w:r>
+      <w:r>
+        <w:t xml:space="preserve"> is a frequent cause of human </w:t>
+      </w:r>
+      <w:r>
+        <w:t>and food-born illness</w:t>
+      </w:r>
+      <w:r>
+        <w:t xml:space="preserve"> </w:t>
+      </w:r>
+      <w:r>
+        <w:t>originating</w:t>
+      </w:r>
+      <w:r>
+        <w:t xml:space="preserve"> from </w:t>
+      </w:r>
+      <w:r>
+        <w:t>direct</w:t>
+      </w:r>
+      <w:r>
+        <w:t xml:space="preserve"> contact, with backyard poultry and wild birds among the most comm</w:t>
+      </w:r>
+      <w:r>
+        <w:t xml:space="preserve">on </w:t>
+      </w:r>
+      <w:r>
+        <w:t xml:space="preserve">sources </w:t>
+      </w:r>
+      <w:r>
+        <w:t>(</w:t>
+      </w:r>
+      <w:r>
+        <w:rPr>
+          <w:highlight w:val="yellow"/>
+        </w:rPr>
+        <w:t>CITE</w:t>
+      </w:r>
+      <w:r>
+        <w:t>).</w:t>
+      </w:r>
+    </w:p>
+    <w:p>
       <w:pPr>
         <w:rPr>
           <w:u w:val="single"/>
         </w:rPr>
       </w:pPr>
       <w:r>
-        <w:t>Th</w:t>
-      </w:r>
-      <w:ins w:id="8" w:author="Kelsey McCune" w:date="2026-07-09T08:43:00Z" w16du:dateUtc="2026-07-09T13:43:00Z">
-        <w:r>
-          <w:t>e prevalence of these activities</w:t>
-        </w:r>
-      </w:ins>
-      <w:del w:id="9" w:author="Kelsey McCune" w:date="2026-07-09T08:43:00Z" w16du:dateUtc="2026-07-09T13:43:00Z">
-        <w:r>
-          <w:delText>is often</w:delText>
-        </w:r>
-      </w:del>
-      <w:r>
-        <w:t xml:space="preserve"> creates opportunities for</w:t>
-      </w:r>
-      <w:r>
-        <w:t xml:space="preserve"> novel</w:t>
-      </w:r>
-      <w:r>
-        <w:t xml:space="preserve"> contact between wild bird species, chicken flocks, domestic pets and humans</w:t>
-      </w:r>
-      <w:del w:id="10" w:author="Kelsey McCune" w:date="2026-07-09T08:44:00Z" w16du:dateUtc="2026-07-09T13:44:00Z">
-        <w:r>
-          <w:delText xml:space="preserve"> as well and can allow for</w:delText>
-        </w:r>
-      </w:del>
-      <w:ins w:id="11" w:author="Kelsey McCune" w:date="2026-07-09T08:44:00Z" w16du:dateUtc="2026-07-09T13:44:00Z">
-        <w:r>
-          <w:t>, potentially leading to</w:t>
-        </w:r>
-      </w:ins>
-      <w:r>
-        <w:t xml:space="preserve"> bidirectional transmission </w:t>
-      </w:r>
-      <w:r>
-        <w:t xml:space="preserve">(spillover) </w:t>
-      </w:r>
-      <w:r>
-        <w:t xml:space="preserve">of select pathogens carried by animals or contracted from the environment. </w:t>
-      </w:r>
-      <w:r>
-        <w:t>T</w:t>
-      </w:r>
-      <w:r>
-        <w:t xml:space="preserve">he </w:t>
-      </w:r>
-      <w:r>
-        <w:t>prevalence</w:t>
-      </w:r>
-      <w:r>
-        <w:t xml:space="preserve"> and spread of zoonotic diseases</w:t>
-      </w:r>
-      <w:r>
-        <w:t xml:space="preserve">, or </w:t>
-      </w:r>
-      <w:r>
-        <w:t>diseases shared between wildlife and humans</w:t>
-      </w:r>
-      <w:r>
-        <w:t xml:space="preserve">, </w:t>
-      </w:r>
-      <w:r>
-        <w:t xml:space="preserve">represents one of the most significant </w:t>
-      </w:r>
-      <w:r>
-        <w:t>effects</w:t>
-      </w:r>
-      <w:r>
-        <w:t xml:space="preserve"> of </w:t>
-      </w:r>
-      <w:r>
-        <w:t>growing</w:t>
-      </w:r>
-      <w:r>
-        <w:t xml:space="preserve"> contact</w:t>
-      </w:r>
-      <w:r>
-        <w:t xml:space="preserve"> at the human-wildlife interface</w:t>
-      </w:r>
-      <w:r>
-        <w:t xml:space="preserve">, with over 70% of </w:t>
-      </w:r>
-      <w:r>
-        <w:t xml:space="preserve">current human diseases </w:t>
-      </w:r>
-      <w:r>
-        <w:t>originating</w:t>
-      </w:r>
-      <w:r>
-        <w:t xml:space="preserve"> from wildlife </w:t>
-      </w:r>
-      <w:r>
-        <w:t xml:space="preserve">(Jones et al. 2008). </w:t>
-      </w:r>
-      <w:r>
-        <w:rPr>
-          <w:highlight w:val="yellow"/>
-        </w:rPr>
-        <w:t xml:space="preserve">Here you can introduce examples of zoonotic diseases from birds/chickens that most commonly affect </w:t>
-      </w:r>
-      <w:r>
-        <w:rPr>
-          <w:highlight w:val="yellow"/>
-        </w:rPr>
-        <w:t>humans,</w:t>
-      </w:r>
-      <w:r>
-        <w:rPr>
-          <w:highlight w:val="yellow"/>
-        </w:rPr>
-        <w:t xml:space="preserve"> so the mention of Salmonella and e coli below doesn’t come out of nowhere.</w:t>
+        <w:rPr>
+          <w:u w:val="single"/>
+        </w:rPr>
+        <w:t>P</w:t>
+      </w:r>
+      <w:commentRangeStart w:id="0"/>
+      <w:r>
+        <w:rPr>
+          <w:u w:val="single"/>
+        </w:rPr>
+        <w:t xml:space="preserve">rior work at this interface in the Southeast has characterized viral spillover and species-level contact rates (Ayala et al. 2020), but bacterial enteric pathogens, individual-level visitation, and the isolated versus combined effects of feeders and poultry remain </w:t>
+      </w:r>
+      <w:r>
+        <w:rPr>
+          <w:u w:val="single"/>
+        </w:rPr>
+        <w:t>unquantified</w:t>
+      </w:r>
+      <w:r>
+        <w:rPr>
+          <w:u w:val="single"/>
+        </w:rPr>
+        <w:t>.</w:t>
       </w:r>
       <w:r>
         <w:t xml:space="preserve"> </w:t>
       </w:r>
-      <w:commentRangeStart w:id="12"/>
       <w:r>
         <w:rPr>
           <w:u w:val="single"/>
         </w:rPr>
-        <w:t xml:space="preserve">prior work at this interface in the Southeast has characterized viral spillover and species-level contact rates (Ayala et al. 2020), but bacterial enteric pathogens, individual-level visitation, and the isolated versus combined effects of feeders and poultry remain </w:t>
+        <w:t xml:space="preserve">Residential yards are increasingly recognized as human-wildlife interface where companion animals, backyard livestock, peri-domestic wildlife, and people share space and anthropogenic resources, creating pathways for zoonotic spillover that differ from those in either wild or agricultural settings (Gamble et al. 2023). This aligns with broader evidence that urbanization and </w:t>
       </w:r>
       <w:r>
         <w:rPr>
           <w:u w:val="single"/>
         </w:rPr>
-        <w:t>unquantified</w:t>
+        <w:t>increased</w:t>
       </w:r>
       <w:r>
         <w:rPr>
           <w:u w:val="single"/>
         </w:rPr>
-        <w:t>.</w:t>
-      </w:r>
-      <w:r>
-        <w:t xml:space="preserve"> </w:t>
+        <w:t xml:space="preserve"> contact </w:t>
       </w:r>
       <w:r>
         <w:rPr>
           <w:u w:val="single"/>
         </w:rPr>
-        <w:t xml:space="preserve">Residential yards are increasingly recognized as human-wildlife interface where companion animals, backyard livestock, peri-domestic wildlife, and people share space and anthropogenic resources, creating pathways for zoonotic spillover that differ from those in either wild or agricultural settings (Gamble et al. 2023). This aligns with broader evidence that urbanization and </w:t>
+        <w:t>with</w:t>
       </w:r>
       <w:r>
         <w:rPr>
           <w:u w:val="single"/>
         </w:rPr>
-        <w:t>increased</w:t>
+        <w:t xml:space="preserve"> humans, domestic animals, and wildlife are </w:t>
       </w:r>
       <w:r>
         <w:rPr>
           <w:u w:val="single"/>
         </w:rPr>
-        <w:t xml:space="preserve"> contact among humans, domestic animals, and wildlife are </w:t>
+        <w:t>primary</w:t>
       </w:r>
       <w:r>
         <w:rPr>
           <w:u w:val="single"/>
         </w:rPr>
-        <w:t>primary</w:t>
-      </w:r>
-      <w:r>
-        <w:rPr>
-          <w:u w:val="single"/>
-        </w:rPr>
         <w:t xml:space="preserve"> drivers of pathogen emergence at shared interfaces (Hassell et al. 2017).</w:t>
       </w:r>
-      <w:commentRangeEnd w:id="12"/>
+      <w:commentRangeEnd w:id="0"/>
       <w:r>
         <w:rPr>
           <w:rStyle w:val="CommentReference"/>
@@ -518,11 +587,12 @@
           <w:szCs w:val="24"/>
           <w:u w:val="single"/>
         </w:rPr>
-        <w:commentReference w:id="12"/>
-      </w:r>
-    </w:p>
-    <w:p>
-      <w:r>
+        <w:commentReference w:id="0"/>
+      </w:r>
+    </w:p>
+    <w:p>
+      <w:r>
+        <w:lastRenderedPageBreak/>
         <w:t>Bird feeders aggregate wild birds at irregular densities, increasing both direct contact rates between individuals and fecal-oral transmission of bacterial pathogens among individuals and species (Becker and Hall 2014; Becker et al. 2015)</w:t>
       </w:r>
       <w:r>
@@ -543,11 +613,59 @@
         </w:rPr>
         <w:t xml:space="preserve"> And content about contact frequency that you have below in the last paragraph can go here as well.</w:t>
       </w:r>
-    </w:p>
-    <w:p>
-      <w:commentRangeStart w:id="13"/>
-      <w:r>
-        <w:lastRenderedPageBreak/>
+      <w:r>
+        <w:t xml:space="preserve"> </w:t>
+      </w:r>
+      <w:r>
+        <w:t>**</w:t>
+      </w:r>
+      <w:r>
+        <w:t xml:space="preserve">In house finches, both individual feeder use and feeder density have been linked to increased </w:t>
+      </w:r>
+      <w:r>
+        <w:rPr>
+          <w:i/>
+          <w:iCs/>
+        </w:rPr>
+        <w:t>Mycoplasma gallisepticum</w:t>
+      </w:r>
+      <w:r>
+        <w:t xml:space="preserve"> </w:t>
+      </w:r>
+      <w:r>
+        <w:t>infection</w:t>
+      </w:r>
+      <w:r>
+        <w:t xml:space="preserve"> and transmission, </w:t>
+      </w:r>
+      <w:r>
+        <w:t>showing</w:t>
+      </w:r>
+      <w:r>
+        <w:t xml:space="preserve"> that</w:t>
+      </w:r>
+      <w:r>
+        <w:t xml:space="preserve"> having bird feeders</w:t>
+      </w:r>
+      <w:r>
+        <w:t xml:space="preserve"> can directly </w:t>
+      </w:r>
+      <w:r>
+        <w:t>influence</w:t>
+      </w:r>
+      <w:r>
+        <w:t xml:space="preserve"> pathogen dynamics a</w:t>
+      </w:r>
+      <w:r>
+        <w:t xml:space="preserve">mong wild bird populations </w:t>
+      </w:r>
+      <w:r>
+        <w:t>(Adelman et al. 2015).</w:t>
+      </w:r>
+    </w:p>
+    <w:p>
+      <w:commentRangeStart w:id="1"/>
+      <w:r>
         <w:t xml:space="preserve">Backyard poultry can further compound this risk, as chickens </w:t>
       </w:r>
       <w:r>
@@ -589,14 +707,14 @@
       <w:r>
         <w:t xml:space="preserve"> amplify pathogen persistence in the environment </w:t>
       </w:r>
-      <w:commentRangeEnd w:id="13"/>
+      <w:commentRangeEnd w:id="1"/>
       <w:r>
         <w:rPr>
           <w:rStyle w:val="CommentReference"/>
           <w:sz w:val="24"/>
           <w:szCs w:val="24"/>
         </w:rPr>
-        <w:commentReference w:id="13"/>
+        <w:commentReference w:id="1"/>
       </w:r>
       <w:r>
         <w:t xml:space="preserve">and </w:t>
@@ -999,16 +1117,9 @@
       <w:r>
         <w:t xml:space="preserve"> outbreaks have increased in frequency over recent decades, with backyard poultry and wild birds among the most </w:t>
       </w:r>
-      <w:del w:id="14" w:author="Kelsey McCune" w:date="2026-07-09T08:48:00Z" w16du:dateUtc="2026-07-09T13:48:00Z">
-        <w:r>
-          <w:delText xml:space="preserve">affected </w:delText>
-        </w:r>
-      </w:del>
-      <w:ins w:id="15" w:author="Kelsey McCune" w:date="2026-07-09T08:48:00Z" w16du:dateUtc="2026-07-09T13:48:00Z">
-        <w:r>
-          <w:t xml:space="preserve">frequent </w:t>
-        </w:r>
-      </w:ins>
+      <w:r>
+        <w:t xml:space="preserve">frequent </w:t>
+      </w:r>
       <w:r>
         <w:t>sources (Bajwa et al. 2025). Despite th</w:t>
       </w:r>
@@ -1016,7 +1127,11 @@
         <w:t>is knowledge</w:t>
       </w:r>
       <w:r>
-        <w:t xml:space="preserve">, studies of small-scale poultry keepers have found that disease risk is generally perceived as low, biosecurity practices vary, and precautions such as isolating new birds, using protective </w:t>
+        <w:t xml:space="preserve">, studies of </w:t>
+      </w:r>
+      <w:r>
+        <w:lastRenderedPageBreak/>
+        <w:t xml:space="preserve">small-scale poultry keepers have found that disease risk is generally perceived as low, biosecurity practices vary, and precautions such as isolating new birds, using protective </w:t>
       </w:r>
       <w:r>
         <w:t>equipment</w:t>
@@ -1063,27 +1178,13 @@
       <w:r>
         <w:t xml:space="preserve"> residential settings receive little outreach or oversight, </w:t>
       </w:r>
-      <w:del w:id="16" w:author="Kelsey McCune" w:date="2026-07-09T08:49:00Z" w16du:dateUtc="2026-07-09T13:49:00Z">
-        <w:r>
-          <w:delText xml:space="preserve">and </w:delText>
-        </w:r>
-        <w:r>
-          <w:delText>current studies may</w:delText>
-        </w:r>
-        <w:r>
-          <w:delText xml:space="preserve"> suggest that</w:delText>
-        </w:r>
-      </w:del>
-      <w:ins w:id="17" w:author="Kelsey McCune" w:date="2026-07-09T08:50:00Z" w16du:dateUtc="2026-07-09T13:50:00Z">
-        <w:r>
-          <w:t>even though</w:t>
-        </w:r>
-      </w:ins>
+      <w:r>
+        <w:t>even though</w:t>
+      </w:r>
       <w:r>
         <w:t xml:space="preserve"> targeted education and risk mitigation practices can </w:t>
       </w:r>
       <w:r>
-        <w:lastRenderedPageBreak/>
         <w:t>significantly</w:t>
       </w:r>
       <w:r>
@@ -1484,7 +1585,11 @@
         <w:t>relief</w:t>
       </w:r>
       <w:r>
-        <w:t xml:space="preserve"> and stress recovery </w:t>
+        <w:t xml:space="preserve"> and </w:t>
+      </w:r>
+      <w:r>
+        <w:lastRenderedPageBreak/>
+        <w:t xml:space="preserve">stress recovery </w:t>
       </w:r>
       <w:r>
         <w:t>(Dayer et al. 2019</w:t>
@@ -1529,11 +1634,7 @@
         <w:t>satisfaction</w:t>
       </w:r>
       <w:r>
-        <w:t xml:space="preserve"> to encourage broader conservation behaviors. Research has shown that people who feed and observe birds are more likely to engage in pro-conservation actions such as habitat </w:t>
-      </w:r>
-      <w:r>
-        <w:lastRenderedPageBreak/>
-        <w:t xml:space="preserve">stewardship, conservation donations, and advocacy for wildlife-friendly policies, suggesting that these activities may </w:t>
+        <w:t xml:space="preserve"> to encourage broader conservation behaviors. Research has shown that people who feed and observe birds are more likely to engage in pro-conservation actions such as habitat stewardship, conservation donations, and advocacy for wildlife-friendly policies, suggesting that these activities may </w:t>
       </w:r>
       <w:r>
         <w:t>provide a link</w:t>
@@ -1622,11 +1723,9 @@
       <w:r>
         <w:t xml:space="preserve"> poultry</w:t>
       </w:r>
-      <w:ins w:id="18" w:author="Kelsey McCune" w:date="2026-07-09T08:53:00Z" w16du:dateUtc="2026-07-09T13:53:00Z">
-        <w:r>
-          <w:t xml:space="preserve"> keeping</w:t>
-        </w:r>
-      </w:ins>
+      <w:r>
+        <w:t xml:space="preserve"> keeping</w:t>
+      </w:r>
       <w:r>
         <w:t xml:space="preserve">. </w:t>
       </w:r>
@@ -1843,12 +1942,127 @@
       </w:r>
     </w:p>
     <w:p>
-      <w:pPr>
-        <w:rPr>
-          <w:b/>
-          <w:bCs/>
-        </w:rPr>
-      </w:pPr>
+      <w:r>
+        <w:t xml:space="preserve">Because both of these activities are voluntary and usually being managed by a single person or single household, the </w:t>
+      </w:r>
+      <w:r>
+        <w:t>status of</w:t>
+      </w:r>
+      <w:r>
+        <w:t xml:space="preserve"> wild bird health is </w:t>
+      </w:r>
+      <w:r>
+        <w:t>regulated</w:t>
+      </w:r>
+      <w:r>
+        <w:t xml:space="preserve"> in these spaces truly depends on the decisions</w:t>
+      </w:r>
+      <w:r>
+        <w:t xml:space="preserve">, </w:t>
+      </w:r>
+      <w:r>
+        <w:t xml:space="preserve">actions </w:t>
+      </w:r>
+      <w:r>
+        <w:t xml:space="preserve">and attitudes </w:t>
+      </w:r>
+      <w:r>
+        <w:t>of the homeowners</w:t>
+      </w:r>
+      <w:r>
+        <w:t xml:space="preserve"> providing the service</w:t>
+      </w:r>
+      <w:r>
+        <w:t xml:space="preserve">. </w:t>
+      </w:r>
+      <w:r>
+        <w:t xml:space="preserve">Factors like </w:t>
+      </w:r>
+      <w:r>
+        <w:t>whether to provide</w:t>
+      </w:r>
+      <w:r>
+        <w:t xml:space="preserve"> supplemental</w:t>
+      </w:r>
+      <w:r>
+        <w:t xml:space="preserve"> food, how many feeders to maintain, how often to clean them, whether flocks are allowed to range freely, and what hygiene practices are </w:t>
+      </w:r>
+      <w:r>
+        <w:t xml:space="preserve">utilized after </w:t>
+      </w:r>
+      <w:r>
+        <w:t>contact</w:t>
+      </w:r>
+      <w:r>
+        <w:t xml:space="preserve"> with feeders and/or flocks</w:t>
+      </w:r>
+      <w:r>
+        <w:t>.</w:t>
+      </w:r>
+      <w:r>
+        <w:t xml:space="preserve"> Targeted outreach and preventative measures can significantly reduce the events of mismanagement or uninformed decision making at these small-scale interfaces, therefor reducing the risk of transmission and infection of wild birds in this case. So, these behaviors that impact disease ecology in wild birds are modifiable, but require understanding, outreach and predicting outcomes. </w:t>
+      </w:r>
+      <w:r>
+        <w:t xml:space="preserve">The Theory of Planned Behavior provides a framework for this, </w:t>
+      </w:r>
+      <w:r>
+        <w:t>stating</w:t>
+      </w:r>
+      <w:r>
+        <w:t xml:space="preserve"> that attitudes, subjective norms, and perceived behavio</w:t>
+      </w:r>
+      <w:r>
+        <w:t xml:space="preserve">rs </w:t>
+      </w:r>
+      <w:r>
+        <w:t xml:space="preserve">shape intention, which predicts behavior (Ajzen 1991; Figure </w:t>
+      </w:r>
+      <w:r>
+        <w:t>Below</w:t>
+      </w:r>
+      <w:r>
+        <w:t>).</w:t>
+      </w:r>
+      <w:r>
+        <w:t xml:space="preserve"> </w:t>
+      </w:r>
+      <w:r>
+        <w:t>Framing participant decisions this way</w:t>
+      </w:r>
+      <w:r>
+        <w:t xml:space="preserve">, so </w:t>
+      </w:r>
+      <w:r>
+        <w:t xml:space="preserve">that the goal is not to discourage participation, but to identify which behaviors are </w:t>
+      </w:r>
+      <w:r>
+        <w:lastRenderedPageBreak/>
+        <w:t>influential for disease risk and</w:t>
+      </w:r>
+      <w:r>
+        <w:t xml:space="preserve"> how</w:t>
+      </w:r>
+      <w:r>
+        <w:t xml:space="preserve"> open to change </w:t>
+      </w:r>
+      <w:r>
+        <w:t xml:space="preserve">they may be </w:t>
+      </w:r>
+      <w:r>
+        <w:rPr>
+          <w:highlight w:val="yellow"/>
+        </w:rPr>
+        <w:t>(CITE</w:t>
+      </w:r>
+      <w:r>
+        <w:t xml:space="preserve">), so that the wellbeing and conservation benefits of these activities </w:t>
+      </w:r>
+      <w:r>
+        <w:t xml:space="preserve">stay constant, </w:t>
+      </w:r>
+      <w:r>
+        <w:t>while reducing risk to wild birds, domestic animals, and people.</w:t>
+      </w:r>
     </w:p>
     <w:p>
       <w:r>
@@ -1930,33 +2144,32 @@
           <w:b/>
           <w:bCs/>
         </w:rPr>
-        <w:lastRenderedPageBreak/>
         <w:t>P5:</w:t>
       </w:r>
     </w:p>
     <w:p>
-      <w:commentRangeStart w:id="19"/>
-      <w:commentRangeStart w:id="20"/>
+      <w:commentRangeStart w:id="2"/>
+      <w:commentRangeStart w:id="3"/>
       <w:r>
         <w:t xml:space="preserve">Most existing research </w:t>
       </w:r>
-      <w:commentRangeEnd w:id="19"/>
+      <w:commentRangeEnd w:id="2"/>
       <w:r>
         <w:rPr>
           <w:rStyle w:val="CommentReference"/>
           <w:sz w:val="24"/>
           <w:szCs w:val="24"/>
         </w:rPr>
-        <w:commentReference w:id="19"/>
-      </w:r>
-      <w:commentRangeEnd w:id="20"/>
+        <w:commentReference w:id="2"/>
+      </w:r>
+      <w:commentRangeEnd w:id="3"/>
       <w:r>
         <w:rPr>
           <w:rStyle w:val="CommentReference"/>
           <w:sz w:val="24"/>
           <w:szCs w:val="24"/>
         </w:rPr>
-        <w:commentReference w:id="20"/>
+        <w:commentReference w:id="3"/>
       </w:r>
       <w:r>
         <w:t>on backyard wildlife activities and disease risk</w:t>
@@ -1994,7 +2207,7 @@
       <w:r>
         <w:t xml:space="preserve"> that visit food sources more frequently may experience greater exposure to environmental pathogens. </w:t>
       </w:r>
-      <w:commentRangeStart w:id="21"/>
+      <w:commentRangeStart w:id="4"/>
       <w:r>
         <w:t xml:space="preserve">This gap </w:t>
       </w:r>
@@ -2004,11 +2217,9 @@
       <w:r>
         <w:t>relevant in the southeastern United States, where suburban sprawl continues to expand the human-wildlife interface, seasonal variation in temperature and humidity creates year-round conditions for environmental pathogen persistence</w:t>
       </w:r>
-      <w:ins w:id="22" w:author="Kelsey McCune" w:date="2026-07-09T08:56:00Z" w16du:dateUtc="2026-07-09T13:56:00Z">
-        <w:r>
-          <w:t xml:space="preserve"> (CITE)</w:t>
-        </w:r>
-      </w:ins>
+      <w:r>
+        <w:t xml:space="preserve"> (CITE)</w:t>
+      </w:r>
       <w:r>
         <w:t xml:space="preserve">, </w:t>
       </w:r>
@@ -2030,29 +2241,15 @@
       <w:r>
         <w:t xml:space="preserve"> small-scale animal keeping</w:t>
       </w:r>
-      <w:ins w:id="23" w:author="Kelsey McCune" w:date="2026-07-09T08:57:00Z" w16du:dateUtc="2026-07-09T13:57:00Z">
-        <w:r>
-          <w:t>.</w:t>
-        </w:r>
-      </w:ins>
-      <w:del w:id="24" w:author="Kelsey McCune" w:date="2026-07-09T08:57:00Z" w16du:dateUtc="2026-07-09T13:57:00Z">
-        <w:r>
-          <w:delText>,</w:delText>
-        </w:r>
-      </w:del>
+      <w:r>
+        <w:t>.</w:t>
+      </w:r>
       <w:r>
         <w:t xml:space="preserve"> </w:t>
       </w:r>
-      <w:ins w:id="25" w:author="Kelsey McCune" w:date="2026-07-09T08:57:00Z" w16du:dateUtc="2026-07-09T13:57:00Z">
-        <w:r>
-          <w:t>Moreover,</w:t>
-        </w:r>
-      </w:ins>
-      <w:del w:id="26" w:author="Kelsey McCune" w:date="2026-07-09T08:57:00Z" w16du:dateUtc="2026-07-09T13:57:00Z">
-        <w:r>
-          <w:delText>and</w:delText>
-        </w:r>
-      </w:del>
+      <w:r>
+        <w:t>Moreover,</w:t>
+      </w:r>
       <w:r>
         <w:t xml:space="preserve"> wildlife watching participation</w:t>
       </w:r>
@@ -2062,14 +2259,14 @@
       <w:r>
         <w:t xml:space="preserve"> including bird</w:t>
       </w:r>
-      <w:commentRangeEnd w:id="21"/>
+      <w:commentRangeEnd w:id="4"/>
       <w:r>
         <w:rPr>
           <w:rStyle w:val="CommentReference"/>
           <w:sz w:val="24"/>
           <w:szCs w:val="24"/>
         </w:rPr>
-        <w:commentReference w:id="21"/>
+        <w:commentReference w:id="4"/>
       </w:r>
       <w:r>
         <w:t xml:space="preserve"> feeding</w:t>
@@ -2080,40 +2277,27 @@
       <w:r>
         <w:t>is among the highest of any region in the country</w:t>
       </w:r>
-      <w:ins w:id="27" w:author="Kelsey McCune" w:date="2026-07-09T08:57:00Z" w16du:dateUtc="2026-07-09T13:57:00Z">
-        <w:r>
-          <w:t>;</w:t>
-        </w:r>
-      </w:ins>
-      <w:del w:id="28" w:author="Kelsey McCune" w:date="2026-07-09T08:57:00Z" w16du:dateUtc="2026-07-09T13:57:00Z">
-        <w:r>
-          <w:delText>,</w:delText>
-        </w:r>
-      </w:del>
+      <w:r>
+        <w:t>;</w:t>
+      </w:r>
+      <w:r>
+        <w:t xml:space="preserve"> the East</w:t>
+      </w:r>
+      <w:r>
+        <w:t>/</w:t>
+      </w:r>
+      <w:r>
+        <w:t>South-Central</w:t>
+      </w:r>
+      <w:r>
+        <w:t xml:space="preserve"> states </w:t>
+      </w:r>
+      <w:r>
+        <w:t>have</w:t>
+      </w:r>
       <w:r>
         <w:t xml:space="preserve"> </w:t>
       </w:r>
-      <w:del w:id="29" w:author="Kelsey McCune" w:date="2026-07-09T08:56:00Z" w16du:dateUtc="2026-07-09T13:56:00Z">
-        <w:r>
-          <w:delText xml:space="preserve">with </w:delText>
-        </w:r>
-      </w:del>
-      <w:r>
-        <w:t xml:space="preserve">the East South Central states </w:t>
-      </w:r>
-      <w:del w:id="30" w:author="Kelsey McCune" w:date="2026-07-09T08:57:00Z" w16du:dateUtc="2026-07-09T13:57:00Z">
-        <w:r>
-          <w:delText xml:space="preserve">reporting </w:delText>
-        </w:r>
-      </w:del>
-      <w:ins w:id="31" w:author="Kelsey McCune" w:date="2026-07-09T08:57:00Z" w16du:dateUtc="2026-07-09T13:57:00Z">
-        <w:r>
-          <w:t>have</w:t>
-        </w:r>
-        <w:r>
-          <w:t xml:space="preserve"> </w:t>
-        </w:r>
-      </w:ins>
       <w:r>
         <w:t>the highest residential wildlife watching rates nationally</w:t>
       </w:r>
@@ -2130,7 +2314,11 @@
         <w:t xml:space="preserve"> </w:t>
       </w:r>
       <w:r>
-        <w:t>The degree to which participants in these activities perceive disease risks, engage in biosecurity practices such as feeder cleaning and personal hygiene, and are willing to modify their behaviors in response to evidence-based recommendations remains poorly characterized, particularly in the southeastern United States where both activities are prevalent.</w:t>
+        <w:t xml:space="preserve">The degree to which participants in these activities perceive disease risks, </w:t>
+      </w:r>
+      <w:r>
+        <w:lastRenderedPageBreak/>
+        <w:t>engage in biosecurity practices such as feeder cleaning and personal hygiene, and are willing to modify their behaviors in response to evidence-based recommendations remains poorly characterized, particularly in the southeastern United States where both activities are prevalent.</w:t>
       </w:r>
       <w:r>
         <w:t xml:space="preserve"> Closing these </w:t>
@@ -2147,60 +2335,72 @@
       <w:r>
         <w:t xml:space="preserve"> for developing evidence-based guidelines that allow people to enjoy the benefits of backyard activities while reducing risk to wild birds, domestic animals, and </w:t>
       </w:r>
-      <w:commentRangeStart w:id="32"/>
-      <w:commentRangeStart w:id="33"/>
-      <w:commentRangeStart w:id="34"/>
+      <w:commentRangeStart w:id="5"/>
+      <w:commentRangeStart w:id="6"/>
+      <w:commentRangeStart w:id="7"/>
       <w:r>
         <w:t>human health.</w:t>
       </w:r>
-      <w:commentRangeEnd w:id="32"/>
+      <w:commentRangeEnd w:id="5"/>
       <w:r>
         <w:rPr>
           <w:rStyle w:val="CommentReference"/>
           <w:sz w:val="24"/>
           <w:szCs w:val="24"/>
         </w:rPr>
-        <w:commentReference w:id="32"/>
-      </w:r>
-      <w:commentRangeEnd w:id="33"/>
+        <w:commentReference w:id="5"/>
+      </w:r>
+      <w:commentRangeEnd w:id="6"/>
       <w:r>
         <w:rPr>
           <w:rStyle w:val="CommentReference"/>
           <w:sz w:val="24"/>
           <w:szCs w:val="24"/>
         </w:rPr>
-        <w:commentReference w:id="33"/>
-      </w:r>
-      <w:commentRangeEnd w:id="34"/>
+        <w:commentReference w:id="6"/>
+      </w:r>
+      <w:commentRangeEnd w:id="7"/>
       <w:r>
         <w:rPr>
           <w:rStyle w:val="CommentReference"/>
           <w:sz w:val="24"/>
           <w:szCs w:val="24"/>
         </w:rPr>
-        <w:commentReference w:id="34"/>
-      </w:r>
-    </w:p>
-    <w:p>
-      <w:pPr>
-        <w:rPr>
-          <w:sz w:val="13"/>
-          <w:szCs w:val="13"/>
-        </w:rPr>
-      </w:pPr>
-      <w:commentRangeStart w:id="35"/>
+        <w:commentReference w:id="7"/>
+      </w:r>
+    </w:p>
+    <w:p>
+      <w:pPr>
+        <w:rPr>
+          <w:sz w:val="13"/>
+          <w:szCs w:val="13"/>
+        </w:rPr>
+      </w:pPr>
+      <w:commentRangeStart w:id="8"/>
       <w:r>
         <w:rPr>
           <w:u w:val="single"/>
         </w:rPr>
-        <w:t xml:space="preserve">Warming temperatures are of particular relevance to </w:t>
-      </w:r>
-      <w:r>
-        <w:rPr>
-          <w:i/>
-          <w:iCs/>
+        <w:t xml:space="preserve">Warming temperatures are of </w:t>
+      </w:r>
+      <w:r>
+        <w:rPr>
           <w:u w:val="single"/>
         </w:rPr>
+        <w:t>relevance</w:t>
+      </w:r>
+      <w:r>
+        <w:rPr>
+          <w:u w:val="single"/>
+        </w:rPr>
+        <w:t xml:space="preserve"> to </w:t>
+      </w:r>
+      <w:r>
+        <w:rPr>
+          <w:i/>
+          <w:iCs/>
+          <w:u w:val="single"/>
+        </w:rPr>
         <w:t>Salmonella</w:t>
       </w:r>
       <w:r>
@@ -2241,14 +2441,14 @@
         </w:rPr>
         <w:br/>
       </w:r>
-      <w:commentRangeEnd w:id="35"/>
+      <w:commentRangeEnd w:id="8"/>
       <w:r>
         <w:rPr>
           <w:rStyle w:val="CommentReference"/>
           <w:sz w:val="24"/>
           <w:szCs w:val="24"/>
         </w:rPr>
-        <w:commentReference w:id="35"/>
+        <w:commentReference w:id="8"/>
       </w:r>
       <w:r>
         <w:br/>
@@ -2324,7 +2524,7 @@
           <w:bCs/>
         </w:rPr>
       </w:pPr>
-      <w:commentRangeStart w:id="36"/>
+      <w:commentRangeStart w:id="9"/>
       <w:r>
         <w:rPr>
           <w:b/>
@@ -2333,7 +2533,7 @@
         <w:lastRenderedPageBreak/>
         <w:t>Overarching Goals and Hypotheses</w:t>
       </w:r>
-      <w:commentRangeEnd w:id="36"/>
+      <w:commentRangeEnd w:id="9"/>
       <w:r>
         <w:rPr>
           <w:rStyle w:val="CommentReference"/>
@@ -2342,7 +2542,7 @@
           <w:sz w:val="24"/>
           <w:szCs w:val="24"/>
         </w:rPr>
-        <w:commentReference w:id="36"/>
+        <w:commentReference w:id="9"/>
       </w:r>
       <w:r>
         <w:rPr>
@@ -2356,19 +2556,12 @@
       <w:r>
         <w:t xml:space="preserve">The overarching goal of this </w:t>
       </w:r>
-      <w:del w:id="37" w:author="Kelsey McCune" w:date="2026-07-09T08:58:00Z" w16du:dateUtc="2026-07-09T13:58:00Z">
-        <w:r>
-          <w:delText xml:space="preserve">study </w:delText>
-        </w:r>
-      </w:del>
-      <w:ins w:id="38" w:author="Kelsey McCune" w:date="2026-07-09T08:58:00Z" w16du:dateUtc="2026-07-09T13:58:00Z">
-        <w:r>
-          <w:t>research</w:t>
-        </w:r>
-        <w:r>
-          <w:t xml:space="preserve"> </w:t>
-        </w:r>
-      </w:ins>
+      <w:r>
+        <w:t>research</w:t>
+      </w:r>
+      <w:r>
+        <w:t xml:space="preserve"> </w:t>
+      </w:r>
       <w:r>
         <w:t xml:space="preserve">is to </w:t>
       </w:r>
@@ -2405,38 +2598,21 @@
       <w:r>
         <w:t xml:space="preserve"> participant behavior remain poorly understood. </w:t>
       </w:r>
-      <w:del w:id="39" w:author="Kelsey McCune" w:date="2026-07-09T09:00:00Z" w16du:dateUtc="2026-07-09T14:00:00Z">
-        <w:r>
-          <w:delText>T</w:delText>
-        </w:r>
-        <w:r>
-          <w:delText>he</w:delText>
-        </w:r>
-        <w:r>
-          <w:delText xml:space="preserve"> overarching goal of this study is to</w:delText>
-        </w:r>
-      </w:del>
-      <w:ins w:id="40" w:author="Kelsey McCune" w:date="2026-07-09T09:00:00Z" w16du:dateUtc="2026-07-09T14:00:00Z">
-        <w:r>
-          <w:t>In my master’s research I will address this gap by</w:t>
-        </w:r>
-      </w:ins>
+      <w:r>
+        <w:t>In my master’s research I will address this gap by</w:t>
+      </w:r>
       <w:r>
         <w:t xml:space="preserve"> quantify</w:t>
       </w:r>
-      <w:ins w:id="41" w:author="Kelsey McCune" w:date="2026-07-09T09:00:00Z" w16du:dateUtc="2026-07-09T14:00:00Z">
-        <w:r>
-          <w:t>ing</w:t>
-        </w:r>
-      </w:ins>
+      <w:r>
+        <w:t>ing</w:t>
+      </w:r>
       <w:r>
         <w:t xml:space="preserve"> the conditions pertaining to </w:t>
       </w:r>
-      <w:ins w:id="42" w:author="Kelsey McCune" w:date="2026-07-09T09:00:00Z" w16du:dateUtc="2026-07-09T14:00:00Z">
-        <w:r>
-          <w:t xml:space="preserve">these </w:t>
-        </w:r>
-      </w:ins>
+      <w:r>
+        <w:t xml:space="preserve">these </w:t>
+      </w:r>
       <w:r>
         <w:t>backyard activities that can increase disease risk in wild songbird communities</w:t>
       </w:r>
@@ -2449,11 +2625,9 @@
       <w:r>
         <w:t>, to</w:t>
       </w:r>
-      <w:ins w:id="43" w:author="Kelsey McCune" w:date="2026-07-09T09:00:00Z" w16du:dateUtc="2026-07-09T14:00:00Z">
-        <w:r>
-          <w:t xml:space="preserve"> ultimately</w:t>
-        </w:r>
-      </w:ins>
+      <w:r>
+        <w:t xml:space="preserve"> ultimately</w:t>
+      </w:r>
       <w:r>
         <w:t xml:space="preserve"> inform conservation and public health outcomes.</w:t>
       </w:r>
@@ -2462,57 +2636,24 @@
       <w:r>
         <w:t xml:space="preserve"> </w:t>
       </w:r>
-      <w:ins w:id="44" w:author="Kelsey McCune" w:date="2026-07-09T09:02:00Z" w16du:dateUtc="2026-07-09T14:02:00Z">
-        <w:r>
-          <w:t xml:space="preserve">To accomplish this overarching goal, my master’s </w:t>
-        </w:r>
-      </w:ins>
-      <w:ins w:id="45" w:author="Kelsey McCune" w:date="2026-07-09T09:03:00Z" w16du:dateUtc="2026-07-09T14:03:00Z">
-        <w:r>
-          <w:t>thesis</w:t>
-        </w:r>
-      </w:ins>
-      <w:ins w:id="46" w:author="Kelsey McCune" w:date="2026-07-09T09:02:00Z" w16du:dateUtc="2026-07-09T14:02:00Z">
-        <w:r>
-          <w:t xml:space="preserve"> will consist of three </w:t>
-        </w:r>
-      </w:ins>
-      <w:ins w:id="47" w:author="Kelsey McCune" w:date="2026-07-09T09:03:00Z" w16du:dateUtc="2026-07-09T14:03:00Z">
-        <w:r>
-          <w:t xml:space="preserve">chapters testing the following specific aims and hypotheses: </w:t>
-        </w:r>
-      </w:ins>
-      <w:del w:id="48" w:author="Kelsey McCune" w:date="2026-07-09T09:03:00Z" w16du:dateUtc="2026-07-09T14:03:00Z">
-        <w:r>
-          <w:delText>This study addresses three specific aims:</w:delText>
-        </w:r>
-      </w:del>
-    </w:p>
-    <w:p>
-      <w:pPr>
-        <w:rPr>
-          <w:b/>
-          <w:bCs/>
-        </w:rPr>
-      </w:pPr>
-      <w:ins w:id="49" w:author="Kelsey McCune" w:date="2026-07-09T09:03:00Z" w16du:dateUtc="2026-07-09T14:03:00Z">
-        <w:r>
-          <w:rPr>
-            <w:b/>
-            <w:bCs/>
-          </w:rPr>
-          <w:t>Chapter</w:t>
-        </w:r>
-      </w:ins>
-      <w:del w:id="50" w:author="Kelsey McCune" w:date="2026-07-09T09:03:00Z" w16du:dateUtc="2026-07-09T14:03:00Z">
-        <w:r>
-          <w:rPr>
-            <w:b/>
-            <w:bCs/>
-          </w:rPr>
-          <w:delText>Aim</w:delText>
-        </w:r>
-      </w:del>
+      <w:r>
+        <w:t xml:space="preserve">To accomplish this overarching goal, my master’s thesis will consist of three chapters testing the following specific aims and hypotheses: </w:t>
+      </w:r>
+    </w:p>
+    <w:p>
+      <w:pPr>
+        <w:rPr>
+          <w:b/>
+          <w:bCs/>
+        </w:rPr>
+      </w:pPr>
+      <w:r>
+        <w:rPr>
+          <w:b/>
+          <w:bCs/>
+        </w:rPr>
+        <w:t>Chapter</w:t>
+      </w:r>
       <w:r>
         <w:rPr>
           <w:b/>
@@ -2606,57 +2747,34 @@
       </w:r>
     </w:p>
     <w:p>
-      <w:ins w:id="51" w:author="Kelsey McCune" w:date="2026-07-09T09:03:00Z" w16du:dateUtc="2026-07-09T14:03:00Z">
-        <w:r>
-          <w:t>I</w:t>
-        </w:r>
-      </w:ins>
-      <w:del w:id="52" w:author="Kelsey McCune" w:date="2026-07-09T09:03:00Z" w16du:dateUtc="2026-07-09T14:03:00Z">
-        <w:r>
-          <w:delText>We</w:delText>
-        </w:r>
-      </w:del>
+      <w:r>
+        <w:t>I</w:t>
+      </w:r>
       <w:r>
         <w:t xml:space="preserve"> </w:t>
       </w:r>
-      <w:ins w:id="53" w:author="Kelsey McCune" w:date="2026-07-09T09:03:00Z" w16du:dateUtc="2026-07-09T14:03:00Z">
-        <w:r>
-          <w:t>aim</w:t>
-        </w:r>
-      </w:ins>
-      <w:del w:id="54" w:author="Kelsey McCune" w:date="2026-07-09T09:03:00Z" w16du:dateUtc="2026-07-09T14:03:00Z">
-        <w:r>
-          <w:delText>seek</w:delText>
-        </w:r>
-      </w:del>
+      <w:r>
+        <w:t>aim</w:t>
+      </w:r>
       <w:r>
         <w:t xml:space="preserve"> to test the relationship between the frequency that birds visit food sources and the probability of infection.</w:t>
       </w:r>
-      <w:ins w:id="55" w:author="Kelsey McCune" w:date="2026-07-09T09:03:00Z" w16du:dateUtc="2026-07-09T14:03:00Z">
-        <w:r>
-          <w:t xml:space="preserve"> </w:t>
-        </w:r>
-        <w:r>
-          <w:rPr>
-            <w:i/>
-            <w:iCs/>
-          </w:rPr>
-          <w:t>Hypothesis -</w:t>
-        </w:r>
-      </w:ins>
+      <w:r>
+        <w:t xml:space="preserve"> </w:t>
+      </w:r>
+      <w:r>
+        <w:rPr>
+          <w:i/>
+          <w:iCs/>
+        </w:rPr>
+        <w:t>Hypothesis -</w:t>
+      </w:r>
       <w:r>
         <w:t xml:space="preserve"> If bird feeders artificially aggregate individuals and increase direct contact rates, then birds that visit feeders more frequently will sustain greater exposure to environmental pathogens deposited by other individuals, resulting in higher infection prevalence relative to less frequent feeder visitors. </w:t>
       </w:r>
-      <w:ins w:id="56" w:author="Kelsey McCune" w:date="2026-07-09T09:04:00Z" w16du:dateUtc="2026-07-09T14:04:00Z">
-        <w:r>
-          <w:t>I</w:t>
-        </w:r>
-      </w:ins>
-      <w:del w:id="57" w:author="Kelsey McCune" w:date="2026-07-09T09:04:00Z" w16du:dateUtc="2026-07-09T14:04:00Z">
-        <w:r>
-          <w:delText>We</w:delText>
-        </w:r>
-      </w:del>
+      <w:r>
+        <w:t>I</w:t>
+      </w:r>
       <w:r>
         <w:t xml:space="preserve"> therefore predict that wild birds with higher feeder visitation frequencies will have a higher probability of testing positive for pathogen infection.</w:t>
       </w:r>
@@ -2668,24 +2786,13 @@
           <w:bCs/>
         </w:rPr>
       </w:pPr>
-      <w:ins w:id="58" w:author="Kelsey McCune" w:date="2026-07-09T09:04:00Z" w16du:dateUtc="2026-07-09T14:04:00Z">
-        <w:r>
-          <w:rPr>
-            <w:b/>
-            <w:bCs/>
-          </w:rPr>
-          <w:t>Chapter</w:t>
-        </w:r>
-      </w:ins>
-      <w:del w:id="59" w:author="Kelsey McCune" w:date="2026-07-09T09:04:00Z" w16du:dateUtc="2026-07-09T14:04:00Z">
-        <w:r>
-          <w:rPr>
-            <w:b/>
-            <w:bCs/>
-          </w:rPr>
-          <w:delText>Aim</w:delText>
-        </w:r>
-      </w:del>
+      <w:r>
+        <w:rPr>
+          <w:b/>
+          <w:bCs/>
+        </w:rPr>
+        <w:t>Chapter</w:t>
+      </w:r>
       <w:r>
         <w:rPr>
           <w:b/>
@@ -2723,28 +2830,19 @@
       </w:r>
     </w:p>
     <w:p>
-      <w:del w:id="60" w:author="Kelsey McCune" w:date="2026-07-09T09:04:00Z" w16du:dateUtc="2026-07-09T14:04:00Z">
-        <w:r>
-          <w:delText>We seek</w:delText>
-        </w:r>
-      </w:del>
-      <w:ins w:id="61" w:author="Kelsey McCune" w:date="2026-07-09T09:04:00Z" w16du:dateUtc="2026-07-09T14:04:00Z">
-        <w:r>
-          <w:t>I aim</w:t>
-        </w:r>
-      </w:ins>
+      <w:r>
+        <w:t>I aim</w:t>
+      </w:r>
       <w:r>
         <w:t xml:space="preserve"> to compare pathogen prevalence in wild songbirds among sites representing four treatment types: bird feeder only, backyard chickens only, both feeders and chickens, and control sites with neither. </w:t>
       </w:r>
-      <w:ins w:id="62" w:author="Kelsey McCune" w:date="2026-07-09T09:32:00Z" w16du:dateUtc="2026-07-09T14:32:00Z">
-        <w:r>
-          <w:rPr>
-            <w:i/>
-            <w:iCs/>
-          </w:rPr>
-          <w:t xml:space="preserve">Hypothesis - </w:t>
-        </w:r>
-      </w:ins>
+      <w:r>
+        <w:rPr>
+          <w:i/>
+          <w:iCs/>
+        </w:rPr>
+        <w:t xml:space="preserve">Hypothesis - </w:t>
+      </w:r>
       <w:r>
         <w:t xml:space="preserve">If the presence of backyard poultry introduces an additional environmental reservoir for </w:t>
       </w:r>
@@ -2769,16 +2867,9 @@
       <w:r>
         <w:t xml:space="preserve"> </w:t>
       </w:r>
-      <w:ins w:id="63" w:author="Kelsey McCune" w:date="2026-07-09T09:32:00Z" w16du:dateUtc="2026-07-09T14:32:00Z">
-        <w:r>
-          <w:t>I</w:t>
-        </w:r>
-      </w:ins>
-      <w:del w:id="64" w:author="Kelsey McCune" w:date="2026-07-09T09:32:00Z" w16du:dateUtc="2026-07-09T14:32:00Z">
-        <w:r>
-          <w:delText>We</w:delText>
-        </w:r>
-      </w:del>
+      <w:r>
+        <w:t>I</w:t>
+      </w:r>
       <w:r>
         <w:t xml:space="preserve"> </w:t>
       </w:r>
@@ -2790,24 +2881,13 @@
       </w:r>
     </w:p>
     <w:p>
-      <w:ins w:id="65" w:author="Kelsey McCune" w:date="2026-07-09T09:32:00Z" w16du:dateUtc="2026-07-09T14:32:00Z">
-        <w:r>
-          <w:rPr>
-            <w:b/>
-            <w:bCs/>
-          </w:rPr>
-          <w:t>Chapter</w:t>
-        </w:r>
-      </w:ins>
-      <w:del w:id="66" w:author="Kelsey McCune" w:date="2026-07-09T09:32:00Z" w16du:dateUtc="2026-07-09T14:32:00Z">
-        <w:r>
-          <w:rPr>
-            <w:b/>
-            <w:bCs/>
-          </w:rPr>
-          <w:delText>Aim</w:delText>
-        </w:r>
-      </w:del>
+      <w:r>
+        <w:rPr>
+          <w:b/>
+          <w:bCs/>
+        </w:rPr>
+        <w:t>Chapter</w:t>
+      </w:r>
       <w:r>
         <w:rPr>
           <w:b/>
@@ -2829,92 +2909,63 @@
         </w:rPr>
         <w:br/>
       </w:r>
-      <w:del w:id="67" w:author="Kelsey McCune" w:date="2026-07-09T09:33:00Z" w16du:dateUtc="2026-07-09T14:33:00Z">
-        <w:r>
-          <w:delText>We</w:delText>
-        </w:r>
-        <w:r>
-          <w:delText xml:space="preserve"> will</w:delText>
-        </w:r>
-      </w:del>
-      <w:ins w:id="68" w:author="Kelsey McCune" w:date="2026-07-09T09:33:00Z" w16du:dateUtc="2026-07-09T14:33:00Z">
-        <w:r>
-          <w:t>I aim to</w:t>
-        </w:r>
-      </w:ins>
+      <w:r>
+        <w:t>I aim to</w:t>
+      </w:r>
       <w:r>
         <w:t xml:space="preserve"> characterize disease risk perception, biosecurity practice engagement, willingness to adjust backyard behaviors, and </w:t>
       </w:r>
-      <w:commentRangeStart w:id="69"/>
+      <w:commentRangeStart w:id="10"/>
       <w:r>
         <w:t>place attachment</w:t>
       </w:r>
-      <w:commentRangeEnd w:id="69"/>
+      <w:commentRangeEnd w:id="10"/>
       <w:r>
         <w:rPr>
           <w:rStyle w:val="CommentReference"/>
           <w:sz w:val="24"/>
           <w:szCs w:val="24"/>
         </w:rPr>
-        <w:commentReference w:id="69"/>
-      </w:r>
-      <w:r>
-        <w:t xml:space="preserve"> among participants in bird feeding and </w:t>
+        <w:commentReference w:id="10"/>
+      </w:r>
+      <w:r>
+        <w:t xml:space="preserve"> </w:t>
+      </w:r>
+      <w:r>
+        <w:t xml:space="preserve">(backyard effect) </w:t>
+      </w:r>
+      <w:r>
+        <w:t xml:space="preserve">among participants in bird </w:t>
       </w:r>
       <w:r>
         <w:lastRenderedPageBreak/>
-        <w:t>backyard poultry keeping in central Alabama through participant surveys.</w:t>
-      </w:r>
-      <w:ins w:id="70" w:author="Kelsey McCune" w:date="2026-07-09T09:35:00Z" w16du:dateUtc="2026-07-09T14:35:00Z">
-        <w:r>
-          <w:t xml:space="preserve"> </w:t>
-        </w:r>
-        <w:r>
-          <w:rPr>
-            <w:i/>
-            <w:iCs/>
-          </w:rPr>
-          <w:t>Hypotheses -</w:t>
-        </w:r>
-      </w:ins>
+        <w:t>feeding and backyard poultry keeping in central Alabama through participant surveys.</w:t>
+      </w:r>
       <w:r>
         <w:t xml:space="preserve"> </w:t>
       </w:r>
       <w:r>
+        <w:rPr>
+          <w:i/>
+          <w:iCs/>
+        </w:rPr>
+        <w:t>Hypotheses -</w:t>
+      </w:r>
+      <w:r>
+        <w:t xml:space="preserve"> </w:t>
+      </w:r>
+      <w:r>
         <w:t xml:space="preserve">If greater knowledge of zoonotic disease is associated with more proactive responses, then targeted outreach and education efforts will inform practical, relevant biosecurity recommendations for backyard wildlife participants. Additionally, if engagement in backyard wildlife activities is associated with stronger pro-conservation attitudes and behaviors, then these activities may represent </w:t>
       </w:r>
       <w:r>
         <w:t xml:space="preserve">broader opportunities for </w:t>
       </w:r>
       <w:r>
-        <w:t xml:space="preserve">conservation outreach and </w:t>
-      </w:r>
-      <w:commentRangeStart w:id="71"/>
-      <w:r>
-        <w:t xml:space="preserve">evidence-based </w:t>
-      </w:r>
-      <w:del w:id="72" w:author="Alex Fisher" w:date="2026-07-09T11:33:00Z" w16du:dateUtc="2026-07-09T16:33:00Z">
-        <w:r>
-          <w:delText>promotion</w:delText>
-        </w:r>
-        <w:r>
-          <w:delText>s</w:delText>
-        </w:r>
-        <w:commentRangeEnd w:id="71"/>
-        <w:r>
-          <w:rPr>
-            <w:rStyle w:val="CommentReference"/>
-            <w:sz w:val="24"/>
-            <w:szCs w:val="24"/>
-          </w:rPr>
-          <w:commentReference w:id="71"/>
-        </w:r>
-      </w:del>
-      <w:ins w:id="73" w:author="Alex Fisher" w:date="2026-07-09T11:34:00Z" w16du:dateUtc="2026-07-09T16:34:00Z">
-        <w:r>
-          <w:t>recommendations</w:t>
-        </w:r>
-      </w:ins>
+        <w:t xml:space="preserve">conservation outreach and evidence-based </w:t>
+      </w:r>
+      <w:r>
+        <w:t>recommendations</w:t>
+      </w:r>
       <w:r>
         <w:t xml:space="preserve">. </w:t>
       </w:r>
@@ -2979,16 +3030,9 @@
       </w:r>
     </w:p>
     <w:p>
-      <w:ins w:id="74" w:author="Kelsey McCune" w:date="2026-07-09T09:39:00Z" w16du:dateUtc="2026-07-09T14:39:00Z">
-        <w:r>
-          <w:t>I</w:t>
-        </w:r>
-      </w:ins>
-      <w:del w:id="75" w:author="Kelsey McCune" w:date="2026-07-09T09:39:00Z" w16du:dateUtc="2026-07-09T14:39:00Z">
-        <w:r>
-          <w:delText>We</w:delText>
-        </w:r>
-      </w:del>
+      <w:r>
+        <w:t>I</w:t>
+      </w:r>
       <w:r>
         <w:t xml:space="preserve"> performed this study</w:t>
       </w:r>
@@ -3031,16 +3075,9 @@
       <w:r>
         <w:t xml:space="preserve"> and </w:t>
       </w:r>
-      <w:ins w:id="76" w:author="Kelsey McCune" w:date="2026-07-09T09:39:00Z" w16du:dateUtc="2026-07-09T14:39:00Z">
-        <w:r>
-          <w:t>have been</w:t>
-        </w:r>
-      </w:ins>
-      <w:del w:id="77" w:author="Kelsey McCune" w:date="2026-07-09T09:39:00Z" w16du:dateUtc="2026-07-09T14:39:00Z">
-        <w:r>
-          <w:delText>are</w:delText>
-        </w:r>
-      </w:del>
+      <w:r>
+        <w:t>have been</w:t>
+      </w:r>
       <w:r>
         <w:t xml:space="preserve"> sampled monthly </w:t>
       </w:r>
@@ -3109,11 +3146,9 @@
       <w:r>
         <w:t>by individual</w:t>
       </w:r>
-      <w:ins w:id="78" w:author="Kelsey McCune" w:date="2026-07-09T09:41:00Z" w16du:dateUtc="2026-07-09T14:41:00Z">
-        <w:r>
-          <w:t>s</w:t>
-        </w:r>
-      </w:ins>
+      <w:r>
+        <w:t>s</w:t>
+      </w:r>
       <w:r>
         <w:t xml:space="preserve"> </w:t>
       </w:r>
@@ -3146,7 +3181,7 @@
       <w:r>
         <w:t xml:space="preserve">. </w:t>
       </w:r>
-      <w:commentRangeStart w:id="79"/>
+      <w:commentRangeStart w:id="11"/>
       <w:r>
         <w:t>S</w:t>
       </w:r>
@@ -3159,14 +3194,14 @@
       <w:r>
         <w:t xml:space="preserve"> to characterize environmental pathogen reservoirs. </w:t>
       </w:r>
-      <w:commentRangeEnd w:id="79"/>
+      <w:commentRangeEnd w:id="11"/>
       <w:r>
         <w:rPr>
           <w:rStyle w:val="CommentReference"/>
           <w:sz w:val="24"/>
           <w:szCs w:val="24"/>
         </w:rPr>
-        <w:commentReference w:id="79"/>
+        <w:commentReference w:id="11"/>
       </w:r>
       <w:r>
         <w:t>All samples are transported on ice and stored at -80°C until processing.</w:t>
@@ -3185,30 +3220,18 @@
       </w:r>
     </w:p>
     <w:p>
-      <w:pPr>
-        <w:rPr>
-          <w:ins w:id="80" w:author="Kelsey McCune" w:date="2026-07-09T09:45:00Z" w16du:dateUtc="2026-07-09T14:45:00Z"/>
-        </w:rPr>
-      </w:pPr>
       <w:r>
         <w:t xml:space="preserve">Laboratory work is conducted at Auburn University in collaboration with the Thompson Bishop Sparks State Diagnostic Laboratory and the Departments of Poultry Science and Pathobiology. </w:t>
       </w:r>
     </w:p>
     <w:p>
-      <w:pPr>
-        <w:rPr>
-          <w:ins w:id="81" w:author="Kelsey McCune" w:date="2026-07-09T09:45:00Z" w16du:dateUtc="2026-07-09T14:45:00Z"/>
-        </w:rPr>
-      </w:pPr>
-      <w:ins w:id="82" w:author="Kelsey McCune" w:date="2026-07-09T09:45:00Z" w16du:dateUtc="2026-07-09T14:45:00Z">
-        <w:r>
-          <w:rPr>
-            <w:i/>
-            <w:iCs/>
-          </w:rPr>
-          <w:t xml:space="preserve">Bacterial culturing - </w:t>
-        </w:r>
-      </w:ins>
+      <w:r>
+        <w:rPr>
+          <w:i/>
+          <w:iCs/>
+        </w:rPr>
+        <w:t xml:space="preserve">Bacterial culturing - </w:t>
+      </w:r>
       <w:r>
         <w:t xml:space="preserve">I enrich fecal samples in buffered peptone water, then transfer them to Rappaport-Vassiliadis broth selective for </w:t>
       </w:r>
@@ -3247,11 +3270,9 @@
       <w:r>
         <w:t xml:space="preserve"> and unk</w:t>
       </w:r>
-      <w:ins w:id="83" w:author="Kelsey McCune" w:date="2026-07-09T09:44:00Z" w16du:dateUtc="2026-07-09T14:44:00Z">
-        <w:r>
-          <w:t>n</w:t>
-        </w:r>
-      </w:ins>
+      <w:r>
+        <w:t>n</w:t>
+      </w:r>
       <w:r>
         <w:t>own</w:t>
       </w:r>
@@ -3260,68 +3281,56 @@
       </w:r>
     </w:p>
     <w:p>
-      <w:pPr>
-        <w:rPr>
-          <w:ins w:id="84" w:author="Kelsey McCune" w:date="2026-07-09T09:47:00Z" w16du:dateUtc="2026-07-09T14:47:00Z"/>
-        </w:rPr>
-      </w:pPr>
-      <w:commentRangeStart w:id="85"/>
-      <w:ins w:id="86" w:author="Kelsey McCune" w:date="2026-07-09T09:45:00Z" w16du:dateUtc="2026-07-09T14:45:00Z">
-        <w:r>
-          <w:rPr>
-            <w:i/>
-            <w:iCs/>
-          </w:rPr>
-          <w:lastRenderedPageBreak/>
-          <w:t xml:space="preserve">Salmonella typing </w:t>
-        </w:r>
-      </w:ins>
-      <w:commentRangeEnd w:id="85"/>
-      <w:ins w:id="87" w:author="Kelsey McCune" w:date="2026-07-09T09:46:00Z" w16du:dateUtc="2026-07-09T14:46:00Z">
-        <w:r>
-          <w:rPr>
-            <w:rStyle w:val="CommentReference"/>
-            <w:i/>
-            <w:iCs/>
-            <w:sz w:val="24"/>
-            <w:szCs w:val="24"/>
-          </w:rPr>
-          <w:commentReference w:id="85"/>
-        </w:r>
-      </w:ins>
-      <w:ins w:id="88" w:author="Kelsey McCune" w:date="2026-07-09T09:45:00Z" w16du:dateUtc="2026-07-09T14:45:00Z">
-        <w:r>
-          <w:rPr>
-            <w:i/>
-            <w:iCs/>
-          </w:rPr>
-          <w:t xml:space="preserve">- </w:t>
-        </w:r>
-      </w:ins>
-      <w:r>
-        <w:t>I will serotype</w:t>
-      </w:r>
-      <w:r>
-        <w:t>/WGS</w:t>
-      </w:r>
-      <w:r>
-        <w:t xml:space="preserve"> confirmed isolates using O and H antigen testing following the </w:t>
-      </w:r>
-      <w:commentRangeStart w:id="89"/>
-      <w:r>
-        <w:t>Kauffmann-White scheme</w:t>
-      </w:r>
-      <w:commentRangeEnd w:id="89"/>
+      <w:commentRangeStart w:id="12"/>
+      <w:r>
+        <w:rPr>
+          <w:i/>
+          <w:iCs/>
+        </w:rPr>
+        <w:lastRenderedPageBreak/>
+        <w:t xml:space="preserve">Salmonella typing </w:t>
+      </w:r>
+      <w:commentRangeEnd w:id="12"/>
       <w:r>
         <w:rPr>
           <w:rStyle w:val="CommentReference"/>
+          <w:i/>
+          <w:iCs/>
           <w:sz w:val="24"/>
           <w:szCs w:val="24"/>
         </w:rPr>
-        <w:commentReference w:id="89"/>
-      </w:r>
-      <w:r>
-        <w:t xml:space="preserve">, targeting serogroups B and D that include pathogenic serotypes such as Typhimurium and Enteritidis. Confirmed isolates are archived at -80°C for potential whole-genome sequencing to </w:t>
+        <w:commentReference w:id="12"/>
+      </w:r>
+      <w:r>
+        <w:rPr>
+          <w:i/>
+          <w:iCs/>
+        </w:rPr>
+        <w:t xml:space="preserve">- </w:t>
+      </w:r>
+      <w:r>
+        <w:t>I will serotype</w:t>
+      </w:r>
+      <w:r>
+        <w:t xml:space="preserve"> and hopefully perform </w:t>
+      </w:r>
+      <w:r>
+        <w:t>WGS</w:t>
+      </w:r>
+      <w:r>
+        <w:t xml:space="preserve"> </w:t>
+      </w:r>
+      <w:r>
+        <w:t>on c</w:t>
+      </w:r>
+      <w:r>
+        <w:t>onfirmed isolates using O and H antigen testing following the Kauffmann-White scheme, targeting serogroups B and D that include pathogenic serotypes such as Typhimurium and Enteritidis. Confirmed isolates</w:t>
+      </w:r>
+      <w:r>
+        <w:t xml:space="preserve">’ DNA will be extracted for PCR then </w:t>
+      </w:r>
+      <w:r>
+        <w:t xml:space="preserve">archived at -80°C for potential whole-genome sequencing to </w:t>
       </w:r>
       <w:r>
         <w:t>observe and record</w:t>
@@ -3333,54 +3342,61 @@
         <w:t xml:space="preserve"> other/</w:t>
       </w:r>
       <w:r>
-        <w:t xml:space="preserve"> known outbreak strains.</w:t>
-      </w:r>
-    </w:p>
-    <w:p>
-      <w:pPr>
-        <w:rPr>
-          <w:ins w:id="90" w:author="Kelsey McCune" w:date="2026-07-09T09:47:00Z" w16du:dateUtc="2026-07-09T14:47:00Z"/>
-          <w:b/>
-          <w:bCs/>
-        </w:rPr>
-      </w:pPr>
-      <w:ins w:id="91" w:author="Kelsey McCune" w:date="2026-07-09T09:50:00Z" w16du:dateUtc="2026-07-09T14:50:00Z">
-        <w:r>
-          <w:rPr>
-            <w:b/>
-            <w:bCs/>
-          </w:rPr>
-          <w:t>Planned A</w:t>
-        </w:r>
-      </w:ins>
-      <w:ins w:id="92" w:author="Kelsey McCune" w:date="2026-07-09T09:47:00Z" w16du:dateUtc="2026-07-09T14:47:00Z">
-        <w:r>
-          <w:rPr>
-            <w:b/>
-            <w:bCs/>
-          </w:rPr>
-          <w:t>nalysis of Field Data</w:t>
-        </w:r>
-      </w:ins>
-    </w:p>
-    <w:p>
-      <w:pPr>
-        <w:rPr>
-          <w:i/>
-          <w:iCs/>
-        </w:rPr>
-      </w:pPr>
-      <w:ins w:id="93" w:author="Kelsey McCune" w:date="2026-07-09T09:47:00Z" w16du:dateUtc="2026-07-09T14:47:00Z">
-        <w:r>
-          <w:rPr>
-            <w:b/>
-            <w:bCs/>
-            <w:i/>
-            <w:iCs/>
-          </w:rPr>
-          <w:t>Chapter 1</w:t>
-        </w:r>
-      </w:ins>
+        <w:t xml:space="preserve"> known outbreak strains</w:t>
+      </w:r>
+      <w:r>
+        <w:t>. **</w:t>
+      </w:r>
+      <w:r>
+        <w:rPr>
+          <w:rStyle w:val="Emphasis"/>
+        </w:rPr>
+        <w:t>Salmonella enterica</w:t>
+      </w:r>
+      <w:r>
+        <w:t xml:space="preserve"> includes more than 2,500 serotypes that vary in host range and virulence. Some serotypes are broadly pathogenic across hosts, while others appear host-adapted to particular wild bird taxa, and some to human infection (CITE).</w:t>
+      </w:r>
+    </w:p>
+    <w:p>
+      <w:pPr>
+        <w:rPr>
+          <w:b/>
+          <w:bCs/>
+        </w:rPr>
+      </w:pPr>
+      <w:r>
+        <w:rPr>
+          <w:b/>
+          <w:bCs/>
+        </w:rPr>
+        <w:t>Planned A</w:t>
+      </w:r>
+      <w:r>
+        <w:rPr>
+          <w:b/>
+          <w:bCs/>
+        </w:rPr>
+        <w:t>nalysis of Field Data</w:t>
+      </w:r>
+    </w:p>
+    <w:p>
+      <w:pPr>
+        <w:rPr>
+          <w:b/>
+          <w:bCs/>
+          <w:i/>
+          <w:iCs/>
+        </w:rPr>
+      </w:pPr>
+      <w:r>
+        <w:rPr>
+          <w:b/>
+          <w:bCs/>
+          <w:i/>
+          <w:iCs/>
+        </w:rPr>
+        <w:t>Chapter 1</w:t>
+      </w:r>
       <w:r>
         <w:rPr>
           <w:b/>
@@ -3390,19 +3406,34 @@
         </w:rPr>
         <w:t xml:space="preserve">: </w:t>
       </w:r>
-      <w:r>
-        <w:rPr>
-          <w:i/>
-          <w:iCs/>
-        </w:rPr>
-        <w:t>which statistical models are we using</w:t>
-      </w:r>
-      <w:r>
-        <w:rPr>
-          <w:i/>
-          <w:iCs/>
-        </w:rPr>
-        <w:t xml:space="preserve">. “I’m going to t test the relationship between food visitation frequency (discrete; Poisson and probability of infection (Binomial; Y/N) </w:t>
+    </w:p>
+    <w:p>
+      <w:pPr>
+        <w:rPr>
+          <w:i/>
+          <w:iCs/>
+        </w:rPr>
+      </w:pPr>
+      <w:r>
+        <w:rPr>
+          <w:i/>
+          <w:iCs/>
+        </w:rPr>
+        <w:t>W</w:t>
+      </w:r>
+      <w:r>
+        <w:rPr>
+          <w:i/>
+          <w:iCs/>
+        </w:rPr>
+        <w:t>hich statistical models are we using</w:t>
+      </w:r>
+      <w:r>
+        <w:rPr>
+          <w:i/>
+          <w:iCs/>
+        </w:rPr>
+        <w:t xml:space="preserve">. “I’m going to test the relationship between food visitation frequency (discrete; Poisson and probability of infection (Binomial; Y/N) </w:t>
       </w:r>
     </w:p>
     <w:p>
@@ -3482,6 +3513,15 @@
         </w:rPr>
         <w:t xml:space="preserve"> but we hope through WGS that</w:t>
       </w:r>
+      <w:r>
+        <w:rPr>
+          <w:b/>
+          <w:bCs/>
+          <w:i/>
+          <w:iCs/>
+        </w:rPr>
+        <w:t xml:space="preserve">… </w:t>
+      </w:r>
     </w:p>
     <w:p>
       <w:pPr>
@@ -3491,210 +3531,275 @@
           <w:numId w:val="6"/>
         </w:numPr>
         <w:rPr>
-          <w:ins w:id="94" w:author="Kelsey McCune" w:date="2026-07-09T09:47:00Z" w16du:dateUtc="2026-07-09T14:47:00Z"/>
-          <w:b/>
-          <w:bCs/>
-          <w:i/>
-          <w:iCs/>
-        </w:rPr>
-      </w:pPr>
-      <w:r>
-        <w:rPr>
-          <w:b/>
-          <w:bCs/>
+          <w:i/>
+          <w:iCs/>
+        </w:rPr>
+      </w:pPr>
+      <w:r>
+        <w:rPr>
           <w:i/>
           <w:iCs/>
         </w:rPr>
         <w:t>Caveat: could turn into a disease contact network &amp; social contact network</w:t>
       </w:r>
-    </w:p>
-    <w:p>
-      <w:pPr>
-        <w:rPr>
-          <w:b/>
-          <w:bCs/>
-          <w:i/>
-          <w:iCs/>
-          <w:rPrChange w:id="95" w:author="Kelsey McCune" w:date="2026-07-09T09:47:00Z" w16du:dateUtc="2026-07-09T14:47:00Z">
-            <w:rPr/>
-          </w:rPrChange>
-        </w:rPr>
-      </w:pPr>
-      <w:ins w:id="96" w:author="Kelsey McCune" w:date="2026-07-09T09:47:00Z" w16du:dateUtc="2026-07-09T14:47:00Z">
-        <w:r>
-          <w:rPr>
-            <w:b/>
-            <w:bCs/>
-            <w:i/>
-            <w:iCs/>
-          </w:rPr>
-          <w:t>Chapter 2</w:t>
-        </w:r>
-      </w:ins>
-      <w:r>
-        <w:rPr>
-          <w:b/>
-          <w:bCs/>
-          <w:i/>
-          <w:iCs/>
-        </w:rPr>
-        <w:t xml:space="preserve">: </w:t>
-      </w:r>
-      <w:r>
-        <w:rPr>
-          <w:i/>
-          <w:iCs/>
-        </w:rPr>
-        <w:t>Similar to poster presentation</w:t>
-      </w:r>
-      <w:r>
-        <w:rPr>
-          <w:b/>
-          <w:bCs/>
-          <w:i/>
-          <w:iCs/>
-        </w:rPr>
-        <w:t xml:space="preserve">; Infection ~ Treatment + Species + Season… </w:t>
-      </w:r>
-    </w:p>
-    <w:p>
-      <w:pPr>
-        <w:rPr>
-          <w:i/>
-          <w:iCs/>
-        </w:rPr>
-      </w:pPr>
-      <w:ins w:id="97" w:author="Kelsey McCune" w:date="2026-07-09T09:51:00Z" w16du:dateUtc="2026-07-09T14:51:00Z">
-        <w:r>
-          <w:rPr>
-            <w:b/>
-            <w:bCs/>
-            <w:i/>
-            <w:iCs/>
-          </w:rPr>
-          <w:t>Chapter 3</w:t>
-        </w:r>
-      </w:ins>
-      <w:r>
-        <w:rPr>
-          <w:b/>
-          <w:bCs/>
-          <w:i/>
-          <w:iCs/>
-        </w:rPr>
-        <w:t xml:space="preserve">: </w:t>
-      </w:r>
-    </w:p>
-    <w:p>
-      <w:r>
-        <w:rPr>
-          <w:b/>
-          <w:bCs/>
-        </w:rPr>
-        <w:t>Participant Surveys</w:t>
-      </w:r>
-      <w:r>
-        <w:rPr>
-          <w:b/>
-          <w:bCs/>
-        </w:rPr>
-        <w:t xml:space="preserve"> </w:t>
-      </w:r>
-    </w:p>
-    <w:p>
-      <w:r>
-        <w:t xml:space="preserve">During the latter portion of the study timeline (2026–2027), I will administer voluntary surveys to participants at bird feeding and poultry-keeping sites to </w:t>
-      </w:r>
-      <w:r>
-        <w:t>quantify the</w:t>
-      </w:r>
-      <w:r>
-        <w:t xml:space="preserve"> </w:t>
-      </w:r>
-      <w:r>
-        <w:t>phycological and behavioral dynamics</w:t>
-      </w:r>
-      <w:r>
-        <w:t xml:space="preserve"> of </w:t>
-      </w:r>
-      <w:r>
-        <w:t>participants</w:t>
-      </w:r>
-      <w:r>
-        <w:t xml:space="preserve">. </w:t>
-      </w:r>
-      <w:r>
-        <w:t>These surveys will be administered based</w:t>
-      </w:r>
-      <w:r>
-        <w:t xml:space="preserve"> on validated instruments from peer-reviewed literature and </w:t>
-      </w:r>
-      <w:r>
-        <w:t>addresses</w:t>
-      </w:r>
-      <w:r>
-        <w:t xml:space="preserve"> five primary </w:t>
-      </w:r>
-      <w:r>
-        <w:t>topics</w:t>
-      </w:r>
-      <w:r>
-        <w:t>: disease knowledge and risk perception, feeder and coop maintenance and biosecurity practices, motivations for participating in backyard wildlife activities, pro-conservation attitudes and behaviors, and place attachment. I will also assess participant willingness to adopt evidence-based biosecurity recommendations and willingness to financially support bird conservation initiatives</w:t>
-      </w:r>
-      <w:r>
-        <w:t xml:space="preserve"> (by providing resources and asking hypothetical questions)</w:t>
-      </w:r>
-      <w:r>
-        <w:t>. Demographic information including age, gender, education, income, household composition, property size, and residential area will also be collected to characterize the participant population. All survey responses will be anonymous and voluntary. Survey data will be linked to site-level</w:t>
-      </w:r>
-      <w:r>
-        <w:t xml:space="preserve"> </w:t>
-      </w:r>
-      <w:r>
-        <w:t>data to evaluate the relationship between disease risk perception, biosecurity practice engagement, and actual infection rates at each site.</w:t>
-      </w:r>
-      <w:r>
-        <w:t xml:space="preserve"> </w:t>
-      </w:r>
-    </w:p>
-    <w:p>
-      <w:pPr>
-        <w:rPr>
-          <w:b/>
-          <w:bCs/>
-        </w:rPr>
-      </w:pPr>
-      <w:ins w:id="98" w:author="Kelsey McCune" w:date="2026-07-09T09:50:00Z" w16du:dateUtc="2026-07-09T14:50:00Z">
-        <w:r>
-          <w:rPr>
-            <w:b/>
-            <w:bCs/>
-          </w:rPr>
-          <w:t xml:space="preserve">Planned Analysis of Survey </w:t>
-        </w:r>
-        <w:commentRangeStart w:id="99"/>
-        <w:r>
-          <w:rPr>
-            <w:b/>
-            <w:bCs/>
-          </w:rPr>
-          <w:t>Data</w:t>
-        </w:r>
-      </w:ins>
-      <w:commentRangeEnd w:id="99"/>
+      <w:r>
+        <w:rPr>
+          <w:i/>
+          <w:iCs/>
+        </w:rPr>
+        <w:t xml:space="preserve"> --- this could go in “Future Directions”</w:t>
+      </w:r>
+    </w:p>
+    <w:p>
+      <w:commentRangeStart w:id="13"/>
+      <w:r>
+        <w:t xml:space="preserve">I will test whether birds that visit food sources more frequently are more likely to be infected. </w:t>
+      </w:r>
+      <w:commentRangeEnd w:id="13"/>
       <w:r>
         <w:rPr>
           <w:rStyle w:val="CommentReference"/>
           <w:sz w:val="24"/>
           <w:szCs w:val="24"/>
         </w:rPr>
-        <w:commentReference w:id="99"/>
-      </w:r>
-      <w:del w:id="100" w:author="Kelsey McCune" w:date="2026-07-09T09:50:00Z" w16du:dateUtc="2026-07-09T14:50:00Z">
-        <w:r>
-          <w:br w:type="page"/>
-        </w:r>
-      </w:del>
+        <w:commentReference w:id="13"/>
+      </w:r>
+      <w:r>
+        <w:t xml:space="preserve">Infection status (positive or negative for </w:t>
+      </w:r>
+      <w:r>
+        <w:rPr>
+          <w:i/>
+          <w:iCs/>
+        </w:rPr>
+        <w:t>S. enterica</w:t>
+      </w:r>
+      <w:r>
+        <w:t xml:space="preserve">) will be the response variable in a generalized linear mixed model with a binomial distribution. RFID detection frequency will be the main predictor, with species, season, and site treatment type included as additional predictors, and site as a random effect. Detection counts will be standardized </w:t>
+      </w:r>
+      <w:r>
+        <w:t>(logged) to better show the effect of infection status</w:t>
+      </w:r>
+      <w:r>
+        <w:t>. Analyses will be conducted in R.</w:t>
+      </w:r>
+    </w:p>
+    <w:p>
+      <w:pPr>
+        <w:rPr>
+          <w:b/>
+          <w:bCs/>
+          <w:i/>
+          <w:iCs/>
+        </w:rPr>
+      </w:pPr>
+      <w:r>
+        <w:rPr>
+          <w:b/>
+          <w:bCs/>
+          <w:i/>
+          <w:iCs/>
+        </w:rPr>
+        <w:t>Chapter 2</w:t>
+      </w:r>
+      <w:r>
+        <w:rPr>
+          <w:b/>
+          <w:bCs/>
+          <w:i/>
+          <w:iCs/>
+        </w:rPr>
+        <w:t xml:space="preserve">: </w:t>
+      </w:r>
+    </w:p>
+    <w:p>
+      <w:pPr>
+        <w:rPr>
+          <w:b/>
+          <w:bCs/>
+          <w:i/>
+          <w:iCs/>
+        </w:rPr>
+      </w:pPr>
+      <w:r>
+        <w:rPr>
+          <w:i/>
+          <w:iCs/>
+        </w:rPr>
+        <w:t>Similar to poster presentation</w:t>
+      </w:r>
+      <w:r>
+        <w:rPr>
+          <w:b/>
+          <w:bCs/>
+          <w:i/>
+          <w:iCs/>
+        </w:rPr>
+        <w:t xml:space="preserve">; Infection ~ Treatment + Species + Season… </w:t>
+      </w:r>
+    </w:p>
+    <w:p>
+      <w:r>
+        <w:t xml:space="preserve">To test for difference in effect of treatment type on infection prevalence, </w:t>
+      </w:r>
+      <w:r>
+        <w:t xml:space="preserve">I will compare </w:t>
+      </w:r>
+      <w:r>
+        <w:rPr>
+          <w:i/>
+          <w:iCs/>
+        </w:rPr>
+        <w:t>S. enterica</w:t>
+      </w:r>
+      <w:r>
+        <w:t xml:space="preserve"> prevalence in wild songbirds among the four site treatment types. Infection status (positive or negative) will be the response variable in a generalized linear mixed model with a binomial distribution, with treatment type, species, </w:t>
+      </w:r>
+      <w:r>
+        <w:t>and season</w:t>
+      </w:r>
+      <w:r>
+        <w:t xml:space="preserve"> as predictor</w:t>
+      </w:r>
+      <w:r>
+        <w:t>s. S</w:t>
+      </w:r>
+      <w:r>
+        <w:t>ite as a random effec</w:t>
+      </w:r>
+      <w:r>
+        <w:t>t?</w:t>
+      </w:r>
+      <w:r>
+        <w:t xml:space="preserve"> Analyses will be conducted in R.</w:t>
+      </w:r>
+    </w:p>
+    <w:p>
+      <w:pPr>
+        <w:rPr>
+          <w:i/>
+          <w:iCs/>
+        </w:rPr>
+      </w:pPr>
+      <w:r>
+        <w:rPr>
+          <w:b/>
+          <w:bCs/>
+          <w:i/>
+          <w:iCs/>
+        </w:rPr>
+        <w:t xml:space="preserve">Chapter 3: </w:t>
+      </w:r>
+    </w:p>
+    <w:p>
+      <w:r>
+        <w:rPr>
+          <w:b/>
+          <w:bCs/>
+        </w:rPr>
+        <w:t>Participant Surveys</w:t>
+      </w:r>
+      <w:r>
+        <w:rPr>
+          <w:b/>
+          <w:bCs/>
+        </w:rPr>
+        <w:t xml:space="preserve"> </w:t>
+      </w:r>
+    </w:p>
+    <w:p>
+      <w:r>
+        <w:t xml:space="preserve">During the latter portion of the study timeline (2026–2027), I will administer voluntary surveys to participants at bird feeding and poultry-keeping sites to </w:t>
+      </w:r>
+      <w:r>
+        <w:t>quantify the</w:t>
+      </w:r>
+      <w:r>
+        <w:t xml:space="preserve"> </w:t>
+      </w:r>
+      <w:r>
+        <w:t>phycological and behavioral dynamics</w:t>
+      </w:r>
+      <w:r>
+        <w:t xml:space="preserve"> of </w:t>
+      </w:r>
+      <w:r>
+        <w:t>participants</w:t>
+      </w:r>
+      <w:r>
+        <w:t xml:space="preserve">. </w:t>
+      </w:r>
+      <w:r>
+        <w:t>These surveys will be administered based</w:t>
+      </w:r>
+      <w:r>
+        <w:t xml:space="preserve"> on validated </w:t>
+      </w:r>
+      <w:r>
+        <w:lastRenderedPageBreak/>
+        <w:t xml:space="preserve">instruments from peer-reviewed literature and </w:t>
+      </w:r>
+      <w:r>
+        <w:t>addresses</w:t>
+      </w:r>
+      <w:r>
+        <w:t xml:space="preserve"> five primary </w:t>
+      </w:r>
+      <w:r>
+        <w:t>topics</w:t>
+      </w:r>
+      <w:r>
+        <w:t>: disease knowledge and risk perception, feeder and coop maintenance and biosecurity practices, motivations for participating in backyard wildlife activities, pro-conservation attitudes and behaviors, and place attachment. I will also assess participant willingness to adopt evidence-based biosecurity recommendations and willingness to financially support bird conservation initiatives</w:t>
+      </w:r>
+      <w:r>
+        <w:t xml:space="preserve"> (by providing resources and asking hypothetical questions)</w:t>
+      </w:r>
+      <w:r>
+        <w:t>. Demographic information including age, gender, education, income, household composition, property size, and residential area will also be collected to characterize the participant population. All survey responses will be anonymous and voluntary. Survey data will be linked to site-level</w:t>
+      </w:r>
+      <w:r>
+        <w:t xml:space="preserve"> </w:t>
+      </w:r>
+      <w:r>
+        <w:t>data to evaluate the relationship between disease risk perception, biosecurity practice engagement, and actual infection rates at each site.</w:t>
+      </w:r>
+      <w:r>
+        <w:t xml:space="preserve"> </w:t>
+      </w:r>
+    </w:p>
+    <w:p>
+      <w:pPr>
+        <w:rPr>
+          <w:b/>
+          <w:bCs/>
+        </w:rPr>
+      </w:pPr>
+      <w:r>
+        <w:rPr>
+          <w:b/>
+          <w:bCs/>
+        </w:rPr>
+        <w:t xml:space="preserve">Planned Analysis of Survey </w:t>
+      </w:r>
+      <w:commentRangeStart w:id="14"/>
+      <w:r>
+        <w:rPr>
+          <w:b/>
+          <w:bCs/>
+        </w:rPr>
+        <w:t>Data</w:t>
+      </w:r>
+      <w:commentRangeEnd w:id="14"/>
+      <w:r>
+        <w:rPr>
+          <w:rStyle w:val="CommentReference"/>
+          <w:b/>
+          <w:bCs/>
+          <w:sz w:val="24"/>
+          <w:szCs w:val="24"/>
+        </w:rPr>
+        <w:commentReference w:id="14"/>
+      </w:r>
     </w:p>
     <w:p>
       <w:pPr>
@@ -3710,105 +3815,117 @@
           <w:kern w:val="0"/>
           <w14:ligatures w14:val="none"/>
         </w:rPr>
-        <w:t xml:space="preserve">Survey data will be analyzed using both descriptive and inferential statistics. Descriptive statistics (e.g., frequencies, percentages, means, and standard deviations) will be used to summarize participant characteristics and responses across the main survey concepts, including motivations, place attachment, disease-risk perception, biosecurity practices, and pro-conservation attitudes and behaviors. Inferential statistics will then be used to examine relationships among these variables. For example, correlation analyses, chi-square tests of </w:t>
-      </w:r>
-      <w:r>
-        <w:rPr>
-          <w:rFonts w:eastAsiaTheme="minorEastAsia" w:cstheme="minorHAnsi"/>
-          <w:kern w:val="0"/>
-          <w14:ligatures w14:val="none"/>
-        </w:rPr>
+        <w:t>Survey data will be analyzed using both descriptive and inferential statistics. Descriptive statistics (e.g., frequencies, percentages, means, and standard deviations) will be used to summarize participant characteristics and responses across the main survey concepts, including motivations, place attachment, disease-risk perception, biosecurity practices, and pro-conservation attitudes and behaviors. Inferential statistics will then be used to examine relationships among these variables. For example, correlation analyses, chi-square tests of association, or regression models to assess whether factors such as disease-risk perception or zoonotic disease knowledge are associated with reported biosecurity practices or willingness to modify backyard behaviors. Given the novel and exploratory nature of this research and the anticipated sample size, analyses will emphasize describing patterns and generating hypotheses rather than confirmatory hypothesis testing. All analyses will be conducted using standard statistical software.</w:t>
+      </w:r>
+    </w:p>
+    <w:p>
+      <w:pPr>
+        <w:rPr>
+          <w:b/>
+          <w:bCs/>
+        </w:rPr>
+      </w:pPr>
+    </w:p>
+    <w:p>
+      <w:pPr>
+        <w:rPr>
+          <w:b/>
+          <w:bCs/>
+        </w:rPr>
+      </w:pPr>
+      <w:r>
+        <w:rPr>
+          <w:b/>
+          <w:bCs/>
+        </w:rPr>
+        <w:t>Preliminary Data</w:t>
+      </w:r>
+      <w:r>
+        <w:rPr>
+          <w:b/>
+          <w:bCs/>
+        </w:rPr>
+        <w:t xml:space="preserve"> </w:t>
+      </w:r>
+    </w:p>
+    <w:p>
+      <w:r>
+        <w:t xml:space="preserve">Disease Findings </w:t>
+      </w:r>
+    </w:p>
+    <w:p>
+      <w:r>
+        <w:t xml:space="preserve">I have captured over 300 wild birds across fifteen study sites since June 2024. Of the fecal samples cultured to date, approximately 20% were positive for </w:t>
+      </w:r>
+      <w:r>
+        <w:rPr>
+          <w:i/>
+          <w:iCs/>
+        </w:rPr>
+        <w:t>S. enterica</w:t>
+      </w:r>
+      <w:r>
+        <w:t xml:space="preserve">. Prevalence did not differ significantly among the four site treatment types (p &gt; 0.05), and control sites showed prevalence comparable to or higher than feeder-present sites. This </w:t>
+      </w:r>
+      <w:r>
+        <w:t>contradicts</w:t>
+      </w:r>
+      <w:r>
+        <w:t xml:space="preserve"> my prediction for Chapter 2, though it is consistent with the possibility that supplemental food </w:t>
+      </w:r>
+      <w:r>
+        <w:t>may i</w:t>
+      </w:r>
+      <w:r>
+        <w:t xml:space="preserve">mprove immune function in wild birds (Owen et al. 2021), and it may also reflect limited statistical power rather than </w:t>
+      </w:r>
+      <w:r>
+        <w:t xml:space="preserve">lack of effect, which tells me I need to collect more samples per site treatment type. </w:t>
+      </w:r>
+      <w:r>
+        <w:t xml:space="preserve"> </w:t>
+      </w:r>
+    </w:p>
+    <w:p>
+      <w:r>
         <w:lastRenderedPageBreak/>
-        <w:t>association, or regression models to assess whether factors such as disease-risk perception or zoonotic disease knowledge are associated with reported biosecurity practices or willingness to modify backyard behaviors. Given the novel and exploratory nature of this research and the anticipated sample size, analyses will emphasize describing patterns and generating hypotheses rather than confirmatory hypothesis testing. All analyses will be conducted using standard statistical software.</w:t>
-      </w:r>
-    </w:p>
-    <w:p>
-      <w:pPr>
-        <w:rPr>
-          <w:ins w:id="101" w:author="Kelsey McCune" w:date="2026-07-09T09:51:00Z" w16du:dateUtc="2026-07-09T14:51:00Z"/>
-          <w:b/>
-          <w:bCs/>
-        </w:rPr>
-      </w:pPr>
-    </w:p>
-    <w:p>
-      <w:pPr>
-        <w:rPr>
-          <w:b/>
-          <w:bCs/>
-        </w:rPr>
-      </w:pPr>
-      <w:del w:id="102" w:author="Kelsey McCune" w:date="2026-07-09T09:50:00Z" w16du:dateUtc="2026-07-09T14:50:00Z">
-        <w:r>
-          <w:rPr>
-            <w:b/>
-            <w:bCs/>
-          </w:rPr>
-          <w:delText>Analysis/</w:delText>
-        </w:r>
-      </w:del>
-      <w:r>
-        <w:rPr>
-          <w:b/>
-          <w:bCs/>
-        </w:rPr>
-        <w:t>Preliminary Data</w:t>
-      </w:r>
-      <w:ins w:id="103" w:author="Kelsey McCune" w:date="2026-07-09T09:51:00Z" w16du:dateUtc="2026-07-09T14:51:00Z">
-        <w:r>
-          <w:rPr>
-            <w:b/>
-            <w:bCs/>
-          </w:rPr>
-          <w:t xml:space="preserve"> </w:t>
-        </w:r>
-      </w:ins>
-    </w:p>
-    <w:p>
-      <w:r>
-        <w:t xml:space="preserve">Disease Findings </w:t>
-      </w:r>
-    </w:p>
-    <w:p>
-      <w:pPr>
-        <w:rPr>
-          <w:ins w:id="104" w:author="Alex Fisher" w:date="2026-07-09T14:33:00Z" w16du:dateUtc="2026-07-09T19:33:00Z"/>
-        </w:rPr>
-      </w:pPr>
-      <w:r>
         <w:t>Data/Behavior Findings</w:t>
       </w:r>
     </w:p>
     <w:p>
-      <w:pPr>
-        <w:pStyle w:val="ListParagraph"/>
-        <w:numPr>
-          <w:ilvl w:val="0"/>
-          <w:numId w:val="4"/>
-        </w:numPr>
-        <w:pPrChange w:id="105" w:author="Alex Fisher" w:date="2026-07-09T14:34:00Z" w16du:dateUtc="2026-07-09T19:34:00Z">
-          <w:pPr/>
-        </w:pPrChange>
-      </w:pPr>
-      <w:ins w:id="106" w:author="Alex Fisher" w:date="2026-07-09T14:33:00Z" w16du:dateUtc="2026-07-09T19:33:00Z">
-        <w:r>
-          <w:t>Prelim</w:t>
-        </w:r>
-      </w:ins>
-      <w:ins w:id="107" w:author="Alex Fisher" w:date="2026-07-09T14:34:00Z" w16du:dateUtc="2026-07-09T19:34:00Z">
-        <w:r>
-          <w:t xml:space="preserve">inary data shows </w:t>
-        </w:r>
-      </w:ins>
-    </w:p>
-    <w:p>
-      <w:pPr>
-        <w:rPr>
-          <w:ins w:id="108" w:author="Alex Fisher" w:date="2026-07-09T14:32:00Z" w16du:dateUtc="2026-07-09T19:32:00Z"/>
-        </w:rPr>
-      </w:pPr>
+      <w:r>
+        <w:t xml:space="preserve">In contrast, RFID detection frequency differed significantly by infection status, with </w:t>
+      </w:r>
+      <w:r>
+        <w:rPr>
+          <w:i/>
+          <w:iCs/>
+        </w:rPr>
+        <w:t>S. enterica</w:t>
+      </w:r>
+      <w:r>
+        <w:t>-positive birds recording higher numbers of visits to food sources than negative birds (p &lt; 0.01). This preliminary result is consistent with my prediction for Chapter 1 and supports continued RFID data collectio</w:t>
+      </w:r>
+      <w:r>
+        <w:t>n</w:t>
+      </w:r>
+      <w:r>
+        <w:t>.</w:t>
+      </w:r>
+    </w:p>
+    <w:p>
+      <w:commentRangeStart w:id="15"/>
       <w:r>
         <w:t xml:space="preserve">Lab Results </w:t>
+      </w:r>
+      <w:commentRangeEnd w:id="15"/>
+      <w:r>
+        <w:rPr>
+          <w:rStyle w:val="CommentReference"/>
+          <w:sz w:val="24"/>
+          <w:szCs w:val="24"/>
+        </w:rPr>
+        <w:commentReference w:id="15"/>
       </w:r>
     </w:p>
     <w:p>
@@ -3818,23 +3935,22 @@
           <w:ilvl w:val="0"/>
           <w:numId w:val="3"/>
         </w:numPr>
-        <w:rPr>
-          <w:ins w:id="109" w:author="Alex Fisher" w:date="2026-07-09T14:30:00Z" w16du:dateUtc="2026-07-09T19:30:00Z"/>
-        </w:rPr>
-        <w:pPrChange w:id="110" w:author="Alex Fisher" w:date="2026-07-09T14:32:00Z" w16du:dateUtc="2026-07-09T19:32:00Z">
-          <w:pPr/>
-        </w:pPrChange>
-      </w:pPr>
-      <w:ins w:id="111" w:author="Alex Fisher" w:date="2026-07-09T14:32:00Z" w16du:dateUtc="2026-07-09T19:32:00Z">
-        <w:r>
-          <w:t xml:space="preserve">Preliminary findings of samples have </w:t>
-        </w:r>
-      </w:ins>
-      <w:ins w:id="112" w:author="Alex Fisher" w:date="2026-07-09T14:33:00Z" w16du:dateUtc="2026-07-09T19:33:00Z">
-        <w:r>
-          <w:t xml:space="preserve">forced us to refine lab methods to better expect these results. </w:t>
-        </w:r>
-      </w:ins>
+      </w:pPr>
+      <w:r>
+        <w:t xml:space="preserve">Preliminary findings of </w:t>
+      </w:r>
+      <w:r>
+        <w:t xml:space="preserve">processed </w:t>
+      </w:r>
+      <w:r>
+        <w:t xml:space="preserve">samples have </w:t>
+      </w:r>
+      <w:r>
+        <w:t>forced us to refine lab methods to better expect these results</w:t>
+      </w:r>
+      <w:r>
+        <w:t xml:space="preserve">. </w:t>
+      </w:r>
     </w:p>
     <w:p>
       <w:pPr>
@@ -3843,19 +3959,103 @@
           <w:ilvl w:val="0"/>
           <w:numId w:val="3"/>
         </w:numPr>
-        <w:pPrChange w:id="113" w:author="Alex Fisher" w:date="2026-07-09T14:30:00Z" w16du:dateUtc="2026-07-09T19:30:00Z">
-          <w:pPr/>
-        </w:pPrChange>
-      </w:pPr>
-      <w:ins w:id="114" w:author="Alex Fisher" w:date="2026-07-09T14:30:00Z" w16du:dateUtc="2026-07-09T19:30:00Z">
-        <w:r>
-          <w:t xml:space="preserve">Currently doing gene extraction and PCR, which may allow us to perform WGS in the future to characterize the serotypes we are finding from wild birds/poultry. </w:t>
-        </w:r>
-      </w:ins>
+      </w:pPr>
+      <w:r>
+        <w:t xml:space="preserve">Currently </w:t>
+      </w:r>
+      <w:r>
+        <w:t>performing</w:t>
+      </w:r>
+      <w:r>
+        <w:t xml:space="preserve"> </w:t>
+      </w:r>
+      <w:r>
+        <w:t>DNA</w:t>
+      </w:r>
+      <w:r>
+        <w:t xml:space="preserve"> extraction and PCR, which may allow us to perform WGS in the future to characterize </w:t>
+      </w:r>
+      <w:r>
+        <w:t xml:space="preserve">serotypes and create a social network analysis to test for identical strains between wild birds, poultry, and people. </w:t>
+      </w:r>
+    </w:p>
+    <w:p>
+      <w:r>
+        <w:t>Preliminary cultur</w:t>
+      </w:r>
+      <w:r>
+        <w:t>ing</w:t>
+      </w:r>
+      <w:r>
+        <w:t xml:space="preserve"> results have </w:t>
+      </w:r>
+      <w:r>
+        <w:t>caused</w:t>
+      </w:r>
+      <w:r>
+        <w:t xml:space="preserve"> ongoing refinement of laboratory methods. I am currently performing DNA extraction and PCR on isolates recovered to date, which will support whole-genome sequencing to characterize serotypes and determine whether identical strains are shared among wild birds, backyard poultry, and environmental samples.</w:t>
+      </w:r>
     </w:p>
     <w:p>
       <w:r>
         <w:t xml:space="preserve">Survey Results </w:t>
+      </w:r>
+    </w:p>
+    <w:p>
+      <w:r>
+        <w:t>Preliminary</w:t>
+      </w:r>
+      <w:r>
+        <w:t xml:space="preserve"> results from the entry screening</w:t>
+      </w:r>
+      <w:r>
+        <w:t xml:space="preserve"> indicate</w:t>
+      </w:r>
+      <w:r>
+        <w:t>d</w:t>
+      </w:r>
+      <w:r>
+        <w:t xml:space="preserve"> that most participants reported cleaning feeders or coops and expressed concern about disease, but far fewer reported washing their hands after contact with feeders, chickens, or animal housing, and several noted a lack of clear guidance </w:t>
+      </w:r>
+      <w:r>
+        <w:t>and/</w:t>
+      </w:r>
+      <w:r>
+        <w:t xml:space="preserve">or resources. This gap between concern and reported practice suggests that knowledge alone does not explain behavior and motivated the development of a more detailed survey to be administered to participants during the latter portion of data collection (October–December 2026). Rather than recording only whether participants perform certain practices, the expanded survey will </w:t>
+      </w:r>
+      <w:r>
+        <w:t>explore</w:t>
+      </w:r>
+      <w:r>
+        <w:t xml:space="preserve"> the factors underlying those decisions, including conservation attitudes, place attachment, perceived behavioral control over biosecurity practices, willingness to modify management actions such as feeder cleaning frequency or coop placement, and willingness to invest financially in recommended changes or in bird conservation. Together these measures will allow me to evaluate which specific behaviors are most open to change and how evidence-based biosecurity recommendations might best be </w:t>
+      </w:r>
+      <w:r>
+        <w:t>created and provided to the participants in/around this study area</w:t>
+      </w:r>
+      <w:r>
+        <w:t>.</w:t>
+      </w:r>
+    </w:p>
+    <w:p>
+      <w:pPr>
+        <w:rPr>
+          <w:b/>
+          <w:bCs/>
+        </w:rPr>
+      </w:pPr>
+      <w:r>
+        <w:rPr>
+          <w:b/>
+          <w:bCs/>
+        </w:rPr>
+        <w:t xml:space="preserve">Expected </w:t>
+      </w:r>
+      <w:r>
+        <w:rPr>
+          <w:b/>
+          <w:bCs/>
+        </w:rPr>
+        <w:t xml:space="preserve">Impact Paragraph </w:t>
       </w:r>
     </w:p>
     <w:p>
@@ -3867,29 +4067,153 @@
         </w:numPr>
       </w:pPr>
       <w:r>
-        <w:t xml:space="preserve">Entry screening results inspired us to make a survey portion of the study  </w:t>
-      </w:r>
-    </w:p>
-    <w:p>
-      <w:pPr>
-        <w:rPr>
-          <w:b/>
-          <w:bCs/>
-        </w:rPr>
-      </w:pPr>
-      <w:r>
-        <w:rPr>
-          <w:b/>
-          <w:bCs/>
-        </w:rPr>
-        <w:t xml:space="preserve">Expected </w:t>
-      </w:r>
-      <w:r>
-        <w:rPr>
-          <w:b/>
-          <w:bCs/>
-        </w:rPr>
-        <w:t xml:space="preserve">Impact Paragraph </w:t>
+        <w:t xml:space="preserve">AGRSEED grant </w:t>
+      </w:r>
+      <w:r>
+        <w:t>is good starting place in “Expected Outcomes”</w:t>
+      </w:r>
+    </w:p>
+    <w:p>
+      <w:r>
+        <w:t xml:space="preserve">By sampling wild songbirds and backyard poultry across sites that isolate and combine bird feeding and poultry keeping, this research will contribute </w:t>
+      </w:r>
+      <w:r>
+        <w:t>foundational</w:t>
+      </w:r>
+      <w:r>
+        <w:t xml:space="preserve"> information on how </w:t>
+      </w:r>
+      <w:r>
+        <w:lastRenderedPageBreak/>
+        <w:t xml:space="preserve">these activities affect pathogen prevalence and contact </w:t>
+      </w:r>
+      <w:r>
+        <w:t xml:space="preserve">dynamics </w:t>
+      </w:r>
+      <w:r>
+        <w:t>among hosts, at the level of the individual bird, the species, and the</w:t>
+      </w:r>
+      <w:r>
+        <w:t xml:space="preserve"> </w:t>
+      </w:r>
+      <w:r>
+        <w:t xml:space="preserve">avian community. </w:t>
+      </w:r>
+      <w:r>
+        <w:t>Integrating</w:t>
+      </w:r>
+      <w:r>
+        <w:t xml:space="preserve"> these findings with participant survey data will </w:t>
+      </w:r>
+      <w:r>
+        <w:t>further explain</w:t>
+      </w:r>
+      <w:r>
+        <w:t xml:space="preserve"> how disease risk is perceived and which biosecurity behaviors participants are willing and able to adopt. Together, these </w:t>
+      </w:r>
+      <w:r>
+        <w:t>findings</w:t>
+      </w:r>
+      <w:r>
+        <w:t xml:space="preserve"> are </w:t>
+      </w:r>
+      <w:r>
+        <w:t>meant</w:t>
+      </w:r>
+      <w:r>
+        <w:t xml:space="preserve"> to inform </w:t>
+      </w:r>
+      <w:r>
+        <w:t>practical</w:t>
+      </w:r>
+      <w:r>
+        <w:t>, locally relevant</w:t>
+      </w:r>
+      <w:r>
+        <w:t>,</w:t>
+      </w:r>
+      <w:r>
+        <w:t xml:space="preserve"> biosecurity guidance appropriate to the </w:t>
+      </w:r>
+      <w:r>
+        <w:t>current level of risk and knowledge</w:t>
+      </w:r>
+      <w:r>
+        <w:t xml:space="preserve">. If backyard activities significantly increase the probability of detecting </w:t>
+      </w:r>
+      <w:r>
+        <w:rPr>
+          <w:i/>
+          <w:iCs/>
+        </w:rPr>
+        <w:t>S. enterica</w:t>
+      </w:r>
+      <w:r>
+        <w:t xml:space="preserve">, this work will support development of </w:t>
+      </w:r>
+      <w:r>
+        <w:t>outreach/education</w:t>
+      </w:r>
+      <w:r>
+        <w:t xml:space="preserve"> materials targeted toward homeowners who maintain feeders or </w:t>
+      </w:r>
+      <w:r>
+        <w:t>backyard</w:t>
+      </w:r>
+      <w:r>
+        <w:t xml:space="preserve"> flocks, potentially through collaboration with </w:t>
+      </w:r>
+      <w:r>
+        <w:t xml:space="preserve">state agencies like </w:t>
+      </w:r>
+      <w:r>
+        <w:t>the Alabama Cooperative Extension System</w:t>
+      </w:r>
+      <w:r>
+        <w:t>, or Alabama Public Health Dept.</w:t>
+      </w:r>
+      <w:r>
+        <w:t xml:space="preserve"> If prevalence </w:t>
+      </w:r>
+      <w:r>
+        <w:t>findings imply</w:t>
+      </w:r>
+      <w:r>
+        <w:t xml:space="preserve"> environmental contamination rather than </w:t>
+      </w:r>
+      <w:r>
+        <w:t>direct-</w:t>
+      </w:r>
+      <w:r>
+        <w:t xml:space="preserve">contact among </w:t>
+      </w:r>
+      <w:r>
+        <w:t>individuals</w:t>
+      </w:r>
+      <w:r>
+        <w:t xml:space="preserve">, guidance </w:t>
+      </w:r>
+      <w:r>
+        <w:t>on how to manage</w:t>
+      </w:r>
+      <w:r>
+        <w:t xml:space="preserve"> contaminated soil, feeder surfaces, and poultry bedding would be more effective. </w:t>
+      </w:r>
+      <w:r>
+        <w:t>Ultimately</w:t>
+      </w:r>
+      <w:r>
+        <w:t>, the goal is to identify practices that reduce risk to wild birds, domestic animals, and people while preserving the wellbeing and conservation benefits that make these activities valuable to participants.</w:t>
+      </w:r>
+    </w:p>
+    <w:p/>
+    <w:p>
+      <w:r>
+        <w:rPr>
+          <w:b/>
+          <w:bCs/>
+        </w:rPr>
+        <w:t>Timeline</w:t>
       </w:r>
     </w:p>
     <w:p>
@@ -3901,59 +4225,18 @@
         </w:numPr>
       </w:pPr>
       <w:r>
-        <w:t xml:space="preserve">AGRSEED grant </w:t>
-      </w:r>
-      <w:r>
-        <w:t>is good starting place in “Expected Outcomes”</w:t>
-      </w:r>
-    </w:p>
-    <w:p/>
-    <w:p>
-      <w:ins w:id="115" w:author="Kelsey McCune" w:date="2026-07-09T09:51:00Z" w16du:dateUtc="2026-07-09T14:51:00Z">
-        <w:r>
-          <w:rPr>
-            <w:b/>
-            <w:bCs/>
-          </w:rPr>
-          <w:t>Timeline</w:t>
-        </w:r>
-      </w:ins>
-      <w:del w:id="116" w:author="Kelsey McCune" w:date="2026-07-09T09:51:00Z" w16du:dateUtc="2026-07-09T14:51:00Z">
-        <w:r>
-          <w:br w:type="page"/>
-        </w:r>
-        <w:r>
-          <w:rPr>
-            <w:b/>
-            <w:bCs/>
-          </w:rPr>
-          <w:delText>Discussion</w:delText>
-        </w:r>
-      </w:del>
-    </w:p>
-    <w:p>
-      <w:pPr>
-        <w:pStyle w:val="ListParagraph"/>
-        <w:numPr>
-          <w:ilvl w:val="0"/>
-          <w:numId w:val="3"/>
-        </w:numPr>
-        <w:rPr>
-          <w:ins w:id="117" w:author="Alex Fisher" w:date="2026-07-23T14:01:00Z" w16du:dateUtc="2026-07-23T19:01:00Z"/>
-        </w:rPr>
-      </w:pPr>
-      <w:ins w:id="118" w:author="Alex Fisher" w:date="2026-07-09T14:34:00Z" w16du:dateUtc="2026-07-09T19:34:00Z">
-        <w:r>
-          <w:t xml:space="preserve">AGRISEED grant has a Gant chart timeline, also include classes and expected defense date </w:t>
-        </w:r>
-      </w:ins>
-    </w:p>
-    <w:p>
+        <w:t>AGRISEED grant has a Gant chart timeline, also include classes</w:t>
+      </w:r>
+      <w:r>
+        <w:t xml:space="preserve"> (list?)</w:t>
+      </w:r>
+      <w:r>
+        <w:t xml:space="preserve"> </w:t>
+      </w:r>
       <w:r>
         <w:rPr>
           <w:noProof/>
         </w:rPr>
-        <w:lastRenderedPageBreak/>
         <w:drawing>
           <wp:inline distT="0" distB="0" distL="0" distR="0" wp14:anchorId="1EF6D284" wp14:editId="1FC77DEC">
             <wp:extent cx="7649377" cy="2317426"/>
@@ -4012,7 +4295,7 @@
 
 <file path=word/comments.xml><?xml version="1.0" encoding="utf-8"?>
 <w:comments xmlns:wpc="http://schemas.microsoft.com/office/word/2010/wordprocessingCanvas" xmlns:cx="http://schemas.microsoft.com/office/drawing/2014/chartex" xmlns:cx1="http://schemas.microsoft.com/office/drawing/2015/9/8/chartex" xmlns:cx2="http://schemas.microsoft.com/office/drawing/2015/10/21/chartex" xmlns:cx3="http://schemas.microsoft.com/office/drawing/2016/5/9/chartex" xmlns:cx4="http://schemas.microsoft.com/office/drawing/2016/5/10/chartex" xmlns:cx5="http://schemas.microsoft.com/office/drawing/2016/5/11/chartex" xmlns:cx6="http://schemas.microsoft.com/office/drawing/2016/5/12/chartex" xmlns:cx7="http://schemas.microsoft.com/office/drawing/2016/5/13/chartex" xmlns:cx8="http://schemas.microsoft.com/office/drawing/2016/5/14/chartex" xmlns:mc="http://schemas.openxmlformats.org/markup-compatibility/2006" xmlns:m="http://schemas.openxmlformats.org/officeDocument/2006/math" xmlns:aink="http://schemas.microsoft.com/office/drawing/2016/ink" xmlns:am3d="http://schemas.microsoft.com/office/drawing/2017/model3d" xmlns:oel="http://schemas.microsoft.com/office/2019/extlst" xmlns:r="http://schemas.openxmlformats.org/officeDocument/2006/relationships" xmlns:wp14="http://schemas.microsoft.com/office/word/2010/wordprocessingDrawing" xmlns:wp="http://schemas.openxmlformats.org/drawingml/2006/wordprocessingDrawing" xmlns:wpg="http://schemas.microsoft.com/office/word/2010/wordprocessingGroup" xmlns:wpi="http://schemas.microsoft.com/office/word/2010/wordprocessingInk" xmlns:wps="http://schemas.microsoft.com/office/word/2010/wordprocessingShape" xmlns:o="urn:schemas-microsoft-com:office:office" xmlns:v="urn:schemas-microsoft-com:vml" xmlns:w10="urn:schemas-microsoft-com:office:word" xmlns:w="http://schemas.openxmlformats.org/wordprocessingml/2006/main" xmlns:w14="http://schemas.microsoft.com/office/word/2010/wordml" xmlns:w15="http://schemas.microsoft.com/office/word/2012/wordml" xmlns:w16cex="http://schemas.microsoft.com/office/word/2018/wordml/cex" xmlns:w16cid="http://schemas.microsoft.com/office/word/2016/wordml/cid" xmlns:w16="http://schemas.microsoft.com/office/word/2018/wordml" xmlns:w16sdtdh="http://schemas.microsoft.com/office/word/2020/wordml/sdtdatahash" xmlns:w16sdtfl="http://schemas.microsoft.com/office/word/2024/wordml/sdtformatlock" xmlns:w16se="http://schemas.microsoft.com/office/word/2015/wordml/symex" xmlns:w16du="http://schemas.microsoft.com/office/word/2023/wordml/word16du" xmlns:wne="http://schemas.microsoft.com/office/word/2006/wordml" mc:Ignorable="w14 w15 w16se w16cid w16 w16cex w16sdtdh w16sdtfl w16du wp14">
-  <w:comment w:id="12" w:author="Alex Fisher" w:date="2026-08-13T14:20:00Z" w:initials="AF">
+  <w:comment w:id="0" w:author="Alex Fisher" w:date="2026-08-13T14:20:00Z" w:initials="AF">
     <w:p>
       <w:r>
         <w:rPr>
@@ -4029,7 +4312,7 @@
       </w:r>
     </w:p>
   </w:comment>
-  <w:comment w:id="13" w:author="Kelsey McCune" w:date="2026-04-01T09:59:00Z" w:initials="KBM">
+  <w:comment w:id="1" w:author="Kelsey McCune" w:date="2026-04-01T09:59:00Z" w:initials="KBM">
     <w:p>
       <w:r>
         <w:rPr>
@@ -4046,7 +4329,7 @@
       </w:r>
     </w:p>
   </w:comment>
-  <w:comment w:id="19" w:author="Kelsey McCune" w:date="2026-03-24T09:01:00Z" w:initials="KBM">
+  <w:comment w:id="2" w:author="Kelsey McCune" w:date="2026-03-24T09:01:00Z" w:initials="KBM">
     <w:p>
       <w:r>
         <w:rPr>
@@ -4063,7 +4346,7 @@
       </w:r>
     </w:p>
   </w:comment>
-  <w:comment w:id="20" w:author="Alex Fisher" w:date="2026-03-24T11:25:00Z" w:initials="AF">
+  <w:comment w:id="3" w:author="Alex Fisher" w:date="2026-03-24T11:25:00Z" w:initials="AF">
     <w:p>
       <w:r>
         <w:rPr>
@@ -4080,7 +4363,7 @@
       </w:r>
     </w:p>
   </w:comment>
-  <w:comment w:id="21" w:author="Kelsey McCune" w:date="2026-04-01T11:08:00Z" w:initials="KBM">
+  <w:comment w:id="4" w:author="Kelsey McCune" w:date="2026-04-01T11:08:00Z" w:initials="KBM">
     <w:p>
       <w:r>
         <w:rPr>
@@ -4097,7 +4380,7 @@
       </w:r>
     </w:p>
   </w:comment>
-  <w:comment w:id="32" w:author="Kelsey McCune" w:date="2026-03-24T09:02:00Z" w:initials="KBM">
+  <w:comment w:id="5" w:author="Kelsey McCune" w:date="2026-03-24T09:02:00Z" w:initials="KBM">
     <w:p>
       <w:r>
         <w:rPr>
@@ -4114,7 +4397,7 @@
       </w:r>
     </w:p>
   </w:comment>
-  <w:comment w:id="33" w:author="Alex Fisher" w:date="2026-07-09T11:44:00Z" w:initials="AF">
+  <w:comment w:id="6" w:author="Alex Fisher" w:date="2026-07-09T11:44:00Z" w:initials="AF">
     <w:p>
       <w:r>
         <w:rPr>
@@ -4131,7 +4414,7 @@
       </w:r>
     </w:p>
   </w:comment>
-  <w:comment w:id="34" w:author="Alex Fisher" w:date="2026-07-09T11:49:00Z" w:initials="AF">
+  <w:comment w:id="7" w:author="Alex Fisher" w:date="2026-07-09T11:49:00Z" w:initials="AF">
     <w:p>
       <w:r>
         <w:rPr>
@@ -4148,7 +4431,7 @@
       </w:r>
     </w:p>
   </w:comment>
-  <w:comment w:id="35" w:author="Alex Fisher" w:date="2026-08-13T14:22:00Z" w:initials="AF">
+  <w:comment w:id="8" w:author="Alex Fisher" w:date="2026-08-13T14:22:00Z" w:initials="AF">
     <w:p>
       <w:r>
         <w:rPr>
@@ -4165,7 +4448,7 @@
       </w:r>
     </w:p>
   </w:comment>
-  <w:comment w:id="36" w:author="Alex Fisher" w:date="2026-07-02T12:21:00Z" w:initials="AF">
+  <w:comment w:id="9" w:author="Alex Fisher" w:date="2026-07-02T12:21:00Z" w:initials="AF">
     <w:p>
       <w:r>
         <w:rPr>
@@ -4182,7 +4465,7 @@
       </w:r>
     </w:p>
   </w:comment>
-  <w:comment w:id="69" w:author="Kelsey McCune" w:date="2026-07-09T09:34:00Z" w:initials="KBM">
+  <w:comment w:id="10" w:author="Kelsey McCune" w:date="2026-07-09T09:34:00Z" w:initials="KBM">
     <w:p>
       <w:r>
         <w:rPr>
@@ -4199,7 +4482,7 @@
       </w:r>
     </w:p>
   </w:comment>
-  <w:comment w:id="71" w:author="Kelsey McCune" w:date="2026-07-09T09:37:00Z" w:initials="KBM">
+  <w:comment w:id="11" w:author="Kelsey McCune" w:date="2026-07-09T09:43:00Z" w:initials="KBM">
     <w:p>
       <w:r>
         <w:rPr>
@@ -4212,11 +4495,11 @@
           <w:sz w:val="20"/>
           <w:szCs w:val="20"/>
         </w:rPr>
-        <w:t>I'm not sure what you mean by evidence-based promotions.</w:t>
+        <w:t>Let's talk about whether we need to collect more of these.</w:t>
       </w:r>
     </w:p>
   </w:comment>
-  <w:comment w:id="79" w:author="Kelsey McCune" w:date="2026-07-09T09:43:00Z" w:initials="KBM">
+  <w:comment w:id="12" w:author="Kelsey McCune" w:date="2026-07-09T09:46:00Z" w:initials="KBM">
     <w:p>
       <w:r>
         <w:rPr>
@@ -4229,11 +4512,11 @@
           <w:sz w:val="20"/>
           <w:szCs w:val="20"/>
         </w:rPr>
-        <w:t>Let's talk about whether we need to collect more of these.</w:t>
+        <w:t>And this section makes me realize we need at least one sentence in the intro about how some serotypes are more pathogenic to people/birds than others.</w:t>
       </w:r>
     </w:p>
   </w:comment>
-  <w:comment w:id="85" w:author="Kelsey McCune" w:date="2026-07-09T09:46:00Z" w:initials="KBM">
+  <w:comment w:id="13" w:author="Alex Fisher" w:date="2026-09-03T12:17:00Z" w:initials="AF">
     <w:p>
       <w:r>
         <w:rPr>
@@ -4246,11 +4529,11 @@
           <w:sz w:val="20"/>
           <w:szCs w:val="20"/>
         </w:rPr>
-        <w:t>And this section makes me realize we need at least one sentence in the intro about how some serotypes are more pathogenic to people/birds than others.</w:t>
+        <w:t>Is this correct, or will it be the inverse? In that I will test whether an infected bird is more likely to have higher visitation frequency?</w:t>
       </w:r>
     </w:p>
   </w:comment>
-  <w:comment w:id="89" w:author="Alex Fisher" w:date="2026-07-02T12:15:00Z" w:initials="AF">
+  <w:comment w:id="14" w:author="Alex Fisher" w:date="2026-07-09T14:23:00Z" w:initials="AF">
     <w:p>
       <w:r>
         <w:rPr>
@@ -4263,11 +4546,11 @@
           <w:sz w:val="20"/>
           <w:szCs w:val="20"/>
         </w:rPr>
-        <w:t>classifies salmonella into serotypes based on surface antigens (O and H)</w:t>
+        <w:t>Look for content from AGRSEED grant</w:t>
       </w:r>
     </w:p>
   </w:comment>
-  <w:comment w:id="99" w:author="Alex Fisher" w:date="2026-07-09T14:23:00Z" w:initials="AF">
+  <w:comment w:id="15" w:author="Alex Fisher" w:date="2026-09-03T12:37:00Z" w:initials="AF">
     <w:p>
       <w:r>
         <w:rPr>
@@ -4280,7 +4563,7 @@
           <w:sz w:val="20"/>
           <w:szCs w:val="20"/>
         </w:rPr>
-        <w:t>Look for content from AGRSEED grant</w:t>
+        <w:t>Do I need this section?</w:t>
       </w:r>
     </w:p>
   </w:comment>
@@ -4290,7 +4573,7 @@
 <file path=word/commentsExtended.xml><?xml version="1.0" encoding="utf-8"?>
 <w15:commentsEx xmlns:wpc="http://schemas.microsoft.com/office/word/2010/wordprocessingCanvas" xmlns:cx="http://schemas.microsoft.com/office/drawing/2014/chartex" xmlns:cx1="http://schemas.microsoft.com/office/drawing/2015/9/8/chartex" xmlns:cx2="http://schemas.microsoft.com/office/drawing/2015/10/21/chartex" xmlns:cx3="http://schemas.microsoft.com/office/drawing/2016/5/9/chartex" xmlns:cx4="http://schemas.microsoft.com/office/drawing/2016/5/10/chartex" xmlns:cx5="http://schemas.microsoft.com/office/drawing/2016/5/11/chartex" xmlns:cx6="http://schemas.microsoft.com/office/drawing/2016/5/12/chartex" xmlns:cx7="http://schemas.microsoft.com/office/drawing/2016/5/13/chartex" xmlns:cx8="http://schemas.microsoft.com/office/drawing/2016/5/14/chartex" xmlns:mc="http://schemas.openxmlformats.org/markup-compatibility/2006" xmlns:m="http://schemas.openxmlformats.org/officeDocument/2006/math" xmlns:aink="http://schemas.microsoft.com/office/drawing/2016/ink" xmlns:am3d="http://schemas.microsoft.com/office/drawing/2017/model3d" xmlns:oel="http://schemas.microsoft.com/office/2019/extlst" xmlns:r="http://schemas.openxmlformats.org/officeDocument/2006/relationships" xmlns:wp14="http://schemas.microsoft.com/office/word/2010/wordprocessingDrawing" xmlns:wp="http://schemas.openxmlformats.org/drawingml/2006/wordprocessingDrawing" xmlns:wpg="http://schemas.microsoft.com/office/word/2010/wordprocessingGroup" xmlns:wpi="http://schemas.microsoft.com/office/word/2010/wordprocessingInk" xmlns:wps="http://schemas.microsoft.com/office/word/2010/wordprocessingShape" xmlns:o="urn:schemas-microsoft-com:office:office" xmlns:v="urn:schemas-microsoft-com:vml" xmlns:w10="urn:schemas-microsoft-com:office:word" xmlns:w="http://schemas.openxmlformats.org/wordprocessingml/2006/main" xmlns:w14="http://schemas.microsoft.com/office/word/2010/wordml" xmlns:w15="http://schemas.microsoft.com/office/word/2012/wordml" xmlns:w16cex="http://schemas.microsoft.com/office/word/2018/wordml/cex" xmlns:w16cid="http://schemas.microsoft.com/office/word/2016/wordml/cid" xmlns:w16="http://schemas.microsoft.com/office/word/2018/wordml" xmlns:w16sdtdh="http://schemas.microsoft.com/office/word/2020/wordml/sdtdatahash" xmlns:w16sdtfl="http://schemas.microsoft.com/office/word/2024/wordml/sdtformatlock" xmlns:w16se="http://schemas.microsoft.com/office/word/2015/wordml/symex" xmlns:w16du="http://schemas.microsoft.com/office/word/2023/wordml/word16du" xmlns:wne="http://schemas.microsoft.com/office/word/2006/wordml" mc:Ignorable="w14 w15 w16se w16cid w16 w16cex w16sdtdh w16sdtfl w16du wp14">
   <w15:commentEx w15:paraId="182F7229" w15:done="0"/>
-  <w15:commentEx w15:paraId="75D20AD1" w15:done="0"/>
+  <w15:commentEx w15:paraId="75D20AD1" w15:done="1"/>
   <w15:commentEx w15:paraId="77C467A3" w15:done="0"/>
   <w15:commentEx w15:paraId="7915B3F3" w15:paraIdParent="77C467A3" w15:done="0"/>
   <w15:commentEx w15:paraId="0A445926" w15:done="0"/>
@@ -4300,11 +4583,11 @@
   <w15:commentEx w15:paraId="322BB5BC" w15:done="0"/>
   <w15:commentEx w15:paraId="48BC502D" w15:done="0"/>
   <w15:commentEx w15:paraId="1C69D0F5" w15:done="0"/>
-  <w15:commentEx w15:paraId="6FAF4037" w15:done="1"/>
   <w15:commentEx w15:paraId="15A9B723" w15:done="0"/>
   <w15:commentEx w15:paraId="2ACDB0C0" w15:done="0"/>
-  <w15:commentEx w15:paraId="34CFDA37" w15:done="0"/>
+  <w15:commentEx w15:paraId="6A207DE7" w15:done="0"/>
   <w15:commentEx w15:paraId="5B4FD32A" w15:done="0"/>
+  <w15:commentEx w15:paraId="75D95FB8" w15:done="0"/>
 </w15:commentsEx>
 </file>
 
@@ -4321,11 +4604,11 @@
   <w16cex:commentExtensible w16cex:durableId="35776AC6" w16cex:dateUtc="2026-08-13T19:22:00Z"/>
   <w16cex:commentExtensible w16cex:durableId="3854D19D" w16cex:dateUtc="2026-07-02T17:21:00Z"/>
   <w16cex:commentExtensible w16cex:durableId="3F01E26B" w16cex:dateUtc="2026-07-09T14:34:00Z"/>
-  <w16cex:commentExtensible w16cex:durableId="2329566B" w16cex:dateUtc="2026-07-09T14:37:00Z"/>
   <w16cex:commentExtensible w16cex:durableId="33F6B902" w16cex:dateUtc="2026-07-09T14:43:00Z"/>
   <w16cex:commentExtensible w16cex:durableId="2639753B" w16cex:dateUtc="2026-07-09T14:46:00Z"/>
-  <w16cex:commentExtensible w16cex:durableId="3119063E" w16cex:dateUtc="2026-07-02T17:15:00Z"/>
+  <w16cex:commentExtensible w16cex:durableId="30665ADB" w16cex:dateUtc="2026-09-03T17:17:00Z"/>
   <w16cex:commentExtensible w16cex:durableId="44FD9805" w16cex:dateUtc="2026-07-09T19:23:00Z"/>
+  <w16cex:commentExtensible w16cex:durableId="12ECD4F8" w16cex:dateUtc="2026-09-03T17:37:00Z"/>
 </w16cex:commentsExtensible>
 </file>
 
@@ -4342,11 +4625,11 @@
   <w16cid:commentId w16cid:paraId="322BB5BC" w16cid:durableId="35776AC6"/>
   <w16cid:commentId w16cid:paraId="48BC502D" w16cid:durableId="3854D19D"/>
   <w16cid:commentId w16cid:paraId="1C69D0F5" w16cid:durableId="3F01E26B"/>
-  <w16cid:commentId w16cid:paraId="6FAF4037" w16cid:durableId="2329566B"/>
   <w16cid:commentId w16cid:paraId="15A9B723" w16cid:durableId="33F6B902"/>
   <w16cid:commentId w16cid:paraId="2ACDB0C0" w16cid:durableId="2639753B"/>
-  <w16cid:commentId w16cid:paraId="34CFDA37" w16cid:durableId="3119063E"/>
+  <w16cid:commentId w16cid:paraId="6A207DE7" w16cid:durableId="30665ADB"/>
   <w16cid:commentId w16cid:paraId="5B4FD32A" w16cid:durableId="44FD9805"/>
+  <w16cid:commentId w16cid:paraId="75D95FB8" w16cid:durableId="12ECD4F8"/>
 </w16cid:commentsIds>
 </file>
 
@@ -5076,11 +5359,11 @@
 
 <file path=word/people.xml><?xml version="1.0" encoding="utf-8"?>
 <w15:people xmlns:wpc="http://schemas.microsoft.com/office/word/2010/wordprocessingCanvas" xmlns:cx="http://schemas.microsoft.com/office/drawing/2014/chartex" xmlns:cx1="http://schemas.microsoft.com/office/drawing/2015/9/8/chartex" xmlns:cx2="http://schemas.microsoft.com/office/drawing/2015/10/21/chartex" xmlns:cx3="http://schemas.microsoft.com/office/drawing/2016/5/9/chartex" xmlns:cx4="http://schemas.microsoft.com/office/drawing/2016/5/10/chartex" xmlns:cx5="http://schemas.microsoft.com/office/drawing/2016/5/11/chartex" xmlns:cx6="http://schemas.microsoft.com/office/drawing/2016/5/12/chartex" xmlns:cx7="http://schemas.microsoft.com/office/drawing/2016/5/13/chartex" xmlns:cx8="http://schemas.microsoft.com/office/drawing/2016/5/14/chartex" xmlns:mc="http://schemas.openxmlformats.org/markup-compatibility/2006" xmlns:m="http://schemas.openxmlformats.org/officeDocument/2006/math" xmlns:aink="http://schemas.microsoft.com/office/drawing/2016/ink" xmlns:am3d="http://schemas.microsoft.com/office/drawing/2017/model3d" xmlns:oel="http://schemas.microsoft.com/office/2019/extlst" xmlns:r="http://schemas.openxmlformats.org/officeDocument/2006/relationships" xmlns:wp14="http://schemas.microsoft.com/office/word/2010/wordprocessingDrawing" xmlns:wp="http://schemas.openxmlformats.org/drawingml/2006/wordprocessingDrawing" xmlns:wpg="http://schemas.microsoft.com/office/word/2010/wordprocessingGroup" xmlns:wpi="http://schemas.microsoft.com/office/word/2010/wordprocessingInk" xmlns:wps="http://schemas.microsoft.com/office/word/2010/wordprocessingShape" xmlns:o="urn:schemas-microsoft-com:office:office" xmlns:v="urn:schemas-microsoft-com:vml" xmlns:w10="urn:schemas-microsoft-com:office:word" xmlns:w="http://schemas.openxmlformats.org/wordprocessingml/2006/main" xmlns:w14="http://schemas.microsoft.com/office/word/2010/wordml" xmlns:w15="http://schemas.microsoft.com/office/word/2012/wordml" xmlns:w16cex="http://schemas.microsoft.com/office/word/2018/wordml/cex" xmlns:w16cid="http://schemas.microsoft.com/office/word/2016/wordml/cid" xmlns:w16="http://schemas.microsoft.com/office/word/2018/wordml" xmlns:w16sdtdh="http://schemas.microsoft.com/office/word/2020/wordml/sdtdatahash" xmlns:w16sdtfl="http://schemas.microsoft.com/office/word/2024/wordml/sdtformatlock" xmlns:w16se="http://schemas.microsoft.com/office/word/2015/wordml/symex" xmlns:w16du="http://schemas.microsoft.com/office/word/2023/wordml/word16du" xmlns:wne="http://schemas.microsoft.com/office/word/2006/wordml" mc:Ignorable="w14 w15 w16se w16cid w16 w16cex w16sdtdh w16sdtfl w16du wp14">
+  <w15:person w15:author="Alex Fisher">
+    <w15:presenceInfo w15:providerId="AD" w15:userId="S::amf0080@auburn.edu::18480bde-8768-4851-bd71-24a6dd2d4725"/>
+  </w15:person>
   <w15:person w15:author="Kelsey McCune">
     <w15:presenceInfo w15:providerId="None" w15:userId="Kelsey McCune"/>
-  </w15:person>
-  <w15:person w15:author="Alex Fisher">
-    <w15:presenceInfo w15:providerId="AD" w15:userId="S::amf0080@auburn.edu::18480bde-8768-4851-bd71-24a6dd2d4725"/>
   </w15:person>
 </w15:people>
 </file>

</xml_diff>